<commit_message>
Agrega codigo del ejercicio 1 al documento
</commit_message>
<xml_diff>
--- a/documentación/Primer avance del proyecto.docx
+++ b/documentación/Primer avance del proyecto.docx
@@ -110,15 +110,7 @@
         <w:ind w:left="3065" w:firstLine="0"/>
       </w:pPr>
       <w:r>
-        <w:t xml:space="preserve">Mariangel </w:t>
-      </w:r>
-      <w:proofErr w:type="spellStart"/>
-      <w:r>
-        <w:t>Marin</w:t>
-      </w:r>
-      <w:proofErr w:type="spellEnd"/>
-      <w:r>
-        <w:t xml:space="preserve"> Chinchilla </w:t>
+        <w:t xml:space="preserve">Mariangel Marin Chinchilla </w:t>
       </w:r>
     </w:p>
     <w:p>
@@ -501,14 +493,12 @@
                 <w:sz w:val="22"/>
               </w:rPr>
             </w:pPr>
-            <w:proofErr w:type="spellStart"/>
             <w:r>
               <w:rPr>
                 <w:sz w:val="22"/>
               </w:rPr>
               <w:t>int</w:t>
             </w:r>
-            <w:proofErr w:type="spellEnd"/>
           </w:p>
         </w:tc>
         <w:tc>
@@ -593,14 +583,12 @@
                 <w:sz w:val="22"/>
               </w:rPr>
             </w:pPr>
-            <w:proofErr w:type="spellStart"/>
             <w:r>
               <w:rPr>
                 <w:sz w:val="22"/>
               </w:rPr>
               <w:t>int</w:t>
             </w:r>
-            <w:proofErr w:type="spellEnd"/>
           </w:p>
         </w:tc>
         <w:tc>
@@ -688,14 +676,12 @@
                 <w:sz w:val="22"/>
               </w:rPr>
             </w:pPr>
-            <w:proofErr w:type="spellStart"/>
             <w:r>
               <w:rPr>
                 <w:sz w:val="22"/>
               </w:rPr>
               <w:t>int</w:t>
             </w:r>
-            <w:proofErr w:type="spellEnd"/>
           </w:p>
         </w:tc>
         <w:tc>
@@ -780,14 +766,12 @@
                 <w:sz w:val="22"/>
               </w:rPr>
             </w:pPr>
-            <w:proofErr w:type="spellStart"/>
             <w:r>
               <w:rPr>
                 <w:sz w:val="22"/>
               </w:rPr>
               <w:t>int</w:t>
             </w:r>
-            <w:proofErr w:type="spellEnd"/>
           </w:p>
         </w:tc>
         <w:tc>
@@ -875,14 +859,12 @@
                 <w:sz w:val="22"/>
               </w:rPr>
             </w:pPr>
-            <w:proofErr w:type="spellStart"/>
             <w:r>
               <w:rPr>
                 <w:sz w:val="22"/>
               </w:rPr>
               <w:t>int</w:t>
             </w:r>
-            <w:proofErr w:type="spellEnd"/>
           </w:p>
         </w:tc>
         <w:tc>
@@ -967,14 +949,12 @@
                 <w:sz w:val="22"/>
               </w:rPr>
             </w:pPr>
-            <w:proofErr w:type="spellStart"/>
             <w:r>
               <w:rPr>
                 <w:sz w:val="22"/>
               </w:rPr>
               <w:t>int</w:t>
             </w:r>
-            <w:proofErr w:type="spellEnd"/>
           </w:p>
         </w:tc>
         <w:tc>
@@ -1062,14 +1042,12 @@
                 <w:sz w:val="22"/>
               </w:rPr>
             </w:pPr>
-            <w:proofErr w:type="spellStart"/>
             <w:r>
               <w:rPr>
                 <w:sz w:val="22"/>
               </w:rPr>
               <w:t>int</w:t>
             </w:r>
-            <w:proofErr w:type="spellEnd"/>
           </w:p>
         </w:tc>
         <w:tc>
@@ -1154,14 +1132,12 @@
                 <w:sz w:val="22"/>
               </w:rPr>
             </w:pPr>
-            <w:proofErr w:type="spellStart"/>
             <w:r>
               <w:rPr>
                 <w:sz w:val="22"/>
               </w:rPr>
               <w:t>int</w:t>
             </w:r>
-            <w:proofErr w:type="spellEnd"/>
           </w:p>
         </w:tc>
         <w:tc>
@@ -1249,14 +1225,12 @@
                 <w:sz w:val="22"/>
               </w:rPr>
             </w:pPr>
-            <w:proofErr w:type="spellStart"/>
             <w:r>
               <w:rPr>
                 <w:sz w:val="22"/>
               </w:rPr>
               <w:t>int</w:t>
             </w:r>
-            <w:proofErr w:type="spellEnd"/>
           </w:p>
         </w:tc>
         <w:tc>
@@ -1319,14 +1293,12 @@
                 <w:sz w:val="22"/>
               </w:rPr>
             </w:pPr>
-            <w:proofErr w:type="spellStart"/>
             <w:r>
               <w:rPr>
                 <w:sz w:val="22"/>
               </w:rPr>
               <w:t>nombre_mision</w:t>
             </w:r>
-            <w:proofErr w:type="spellEnd"/>
           </w:p>
         </w:tc>
         <w:tc>
@@ -1343,14 +1315,12 @@
                 <w:sz w:val="22"/>
               </w:rPr>
             </w:pPr>
-            <w:proofErr w:type="spellStart"/>
             <w:r>
               <w:rPr>
                 <w:sz w:val="22"/>
               </w:rPr>
               <w:t>str</w:t>
             </w:r>
-            <w:proofErr w:type="spellEnd"/>
           </w:p>
         </w:tc>
         <w:tc>
@@ -1438,14 +1408,12 @@
                 <w:sz w:val="22"/>
               </w:rPr>
             </w:pPr>
-            <w:proofErr w:type="spellStart"/>
             <w:r>
               <w:rPr>
                 <w:sz w:val="22"/>
               </w:rPr>
               <w:t>int</w:t>
             </w:r>
-            <w:proofErr w:type="spellEnd"/>
           </w:p>
         </w:tc>
         <w:tc>
@@ -1508,14 +1476,12 @@
                 <w:sz w:val="22"/>
               </w:rPr>
             </w:pPr>
-            <w:proofErr w:type="spellStart"/>
             <w:r>
               <w:rPr>
                 <w:sz w:val="22"/>
               </w:rPr>
               <w:t>dias_viaje</w:t>
             </w:r>
-            <w:proofErr w:type="spellEnd"/>
           </w:p>
         </w:tc>
         <w:tc>
@@ -1532,14 +1498,12 @@
                 <w:sz w:val="22"/>
               </w:rPr>
             </w:pPr>
-            <w:proofErr w:type="spellStart"/>
             <w:r>
               <w:rPr>
                 <w:sz w:val="22"/>
               </w:rPr>
               <w:t>int</w:t>
             </w:r>
-            <w:proofErr w:type="spellEnd"/>
           </w:p>
         </w:tc>
         <w:tc>
@@ -1605,14 +1569,12 @@
                 <w:sz w:val="22"/>
               </w:rPr>
             </w:pPr>
-            <w:proofErr w:type="spellStart"/>
             <w:r>
               <w:rPr>
                 <w:sz w:val="22"/>
               </w:rPr>
               <w:t>combustible_ida</w:t>
             </w:r>
-            <w:proofErr w:type="spellEnd"/>
           </w:p>
         </w:tc>
         <w:tc>
@@ -1629,14 +1591,12 @@
                 <w:sz w:val="22"/>
               </w:rPr>
             </w:pPr>
-            <w:proofErr w:type="spellStart"/>
             <w:r>
               <w:rPr>
                 <w:sz w:val="22"/>
               </w:rPr>
               <w:t>int</w:t>
             </w:r>
-            <w:proofErr w:type="spellEnd"/>
           </w:p>
         </w:tc>
         <w:tc>
@@ -1699,14 +1659,12 @@
                 <w:sz w:val="22"/>
               </w:rPr>
             </w:pPr>
-            <w:proofErr w:type="spellStart"/>
             <w:r>
               <w:rPr>
                 <w:sz w:val="22"/>
               </w:rPr>
               <w:t>combustible_regreso</w:t>
             </w:r>
-            <w:proofErr w:type="spellEnd"/>
           </w:p>
         </w:tc>
         <w:tc>
@@ -1723,14 +1681,12 @@
                 <w:sz w:val="22"/>
               </w:rPr>
             </w:pPr>
-            <w:proofErr w:type="spellStart"/>
             <w:r>
               <w:rPr>
                 <w:sz w:val="22"/>
               </w:rPr>
               <w:t>int</w:t>
             </w:r>
-            <w:proofErr w:type="spellEnd"/>
           </w:p>
         </w:tc>
         <w:tc>
@@ -1796,14 +1752,12 @@
                 <w:sz w:val="22"/>
               </w:rPr>
             </w:pPr>
-            <w:proofErr w:type="spellStart"/>
             <w:r>
               <w:rPr>
                 <w:sz w:val="22"/>
               </w:rPr>
               <w:t>combustible_total</w:t>
             </w:r>
-            <w:proofErr w:type="spellEnd"/>
           </w:p>
         </w:tc>
         <w:tc>
@@ -1820,14 +1774,12 @@
                 <w:sz w:val="22"/>
               </w:rPr>
             </w:pPr>
-            <w:proofErr w:type="spellStart"/>
             <w:r>
               <w:rPr>
                 <w:sz w:val="22"/>
               </w:rPr>
               <w:t>int</w:t>
             </w:r>
-            <w:proofErr w:type="spellEnd"/>
           </w:p>
         </w:tc>
         <w:tc>
@@ -1893,14 +1845,12 @@
                 <w:sz w:val="22"/>
               </w:rPr>
             </w:pPr>
-            <w:proofErr w:type="spellStart"/>
             <w:r>
               <w:rPr>
                 <w:sz w:val="22"/>
               </w:rPr>
               <w:t>oxigeno_requerido</w:t>
             </w:r>
-            <w:proofErr w:type="spellEnd"/>
           </w:p>
         </w:tc>
         <w:tc>
@@ -1917,14 +1867,12 @@
                 <w:sz w:val="22"/>
               </w:rPr>
             </w:pPr>
-            <w:proofErr w:type="spellStart"/>
             <w:r>
               <w:rPr>
                 <w:sz w:val="22"/>
               </w:rPr>
               <w:t>int</w:t>
             </w:r>
-            <w:proofErr w:type="spellEnd"/>
           </w:p>
         </w:tc>
         <w:tc>
@@ -1990,14 +1938,12 @@
                 <w:sz w:val="22"/>
               </w:rPr>
             </w:pPr>
-            <w:proofErr w:type="spellStart"/>
             <w:r>
               <w:rPr>
                 <w:sz w:val="22"/>
               </w:rPr>
               <w:t>energia_requerida</w:t>
             </w:r>
-            <w:proofErr w:type="spellEnd"/>
           </w:p>
         </w:tc>
         <w:tc>
@@ -2014,14 +1960,12 @@
                 <w:sz w:val="22"/>
               </w:rPr>
             </w:pPr>
-            <w:proofErr w:type="spellStart"/>
             <w:r>
               <w:rPr>
                 <w:sz w:val="22"/>
               </w:rPr>
               <w:t>int</w:t>
             </w:r>
-            <w:proofErr w:type="spellEnd"/>
           </w:p>
         </w:tc>
         <w:tc>
@@ -2087,14 +2031,12 @@
                 <w:sz w:val="22"/>
               </w:rPr>
             </w:pPr>
-            <w:proofErr w:type="spellStart"/>
             <w:r>
               <w:rPr>
                 <w:sz w:val="22"/>
               </w:rPr>
               <w:t>provisiones_requeridas</w:t>
             </w:r>
-            <w:proofErr w:type="spellEnd"/>
           </w:p>
         </w:tc>
         <w:tc>
@@ -2111,14 +2053,12 @@
                 <w:sz w:val="22"/>
               </w:rPr>
             </w:pPr>
-            <w:proofErr w:type="spellStart"/>
             <w:r>
               <w:rPr>
                 <w:sz w:val="22"/>
               </w:rPr>
               <w:t>int</w:t>
             </w:r>
-            <w:proofErr w:type="spellEnd"/>
           </w:p>
         </w:tc>
         <w:tc>
@@ -2523,12 +2463,817 @@
       <w:pPr>
         <w:spacing w:line="259" w:lineRule="auto"/>
         <w:ind w:left="0" w:firstLine="0"/>
-        <w:rPr>
-          <w:sz w:val="22"/>
-        </w:rPr>
-      </w:pPr>
-      <w:r>
-        <w:rPr>
+        <w:jc w:val="center"/>
+        <w:rPr>
+          <w:b/>
+          <w:bCs/>
+          <w:sz w:val="22"/>
+        </w:rPr>
+      </w:pPr>
+      <w:r>
+        <w:rPr>
+          <w:b/>
+          <w:bCs/>
+          <w:sz w:val="22"/>
+        </w:rPr>
+        <w:lastRenderedPageBreak/>
+        <w:t>Código</w:t>
+      </w:r>
+    </w:p>
+    <w:p>
+      <w:pPr>
+        <w:spacing w:line="259" w:lineRule="auto"/>
+        <w:ind w:left="0" w:firstLine="0"/>
+        <w:rPr>
+          <w:rFonts w:ascii="Consolas" w:hAnsi="Consolas"/>
+          <w:sz w:val="22"/>
+        </w:rPr>
+      </w:pPr>
+      <w:r>
+        <w:rPr>
+          <w:rFonts w:ascii="Consolas" w:hAnsi="Consolas"/>
+          <w:sz w:val="22"/>
+        </w:rPr>
+        <w:t># ============================================================</w:t>
+      </w:r>
+    </w:p>
+    <w:p>
+      <w:pPr>
+        <w:spacing w:line="259" w:lineRule="auto"/>
+        <w:ind w:left="0" w:firstLine="0"/>
+        <w:rPr>
+          <w:rFonts w:ascii="Consolas" w:hAnsi="Consolas"/>
+          <w:sz w:val="22"/>
+        </w:rPr>
+      </w:pPr>
+      <w:r>
+        <w:rPr>
+          <w:rFonts w:ascii="Consolas" w:hAnsi="Consolas"/>
+          <w:sz w:val="22"/>
+        </w:rPr>
+        <w:t># Archivo: ejercicio1_recursos.py</w:t>
+      </w:r>
+    </w:p>
+    <w:p>
+      <w:pPr>
+        <w:spacing w:line="259" w:lineRule="auto"/>
+        <w:ind w:left="0" w:firstLine="0"/>
+        <w:rPr>
+          <w:rFonts w:ascii="Consolas" w:hAnsi="Consolas"/>
+          <w:sz w:val="22"/>
+        </w:rPr>
+      </w:pPr>
+      <w:r>
+        <w:rPr>
+          <w:rFonts w:ascii="Consolas" w:hAnsi="Consolas"/>
+          <w:sz w:val="22"/>
+        </w:rPr>
+        <w:t># Curso: SOFT-01 Principios de Programación 1 - Sección SCP0</w:t>
+      </w:r>
+    </w:p>
+    <w:p>
+      <w:pPr>
+        <w:spacing w:line="259" w:lineRule="auto"/>
+        <w:ind w:left="0" w:firstLine="0"/>
+        <w:rPr>
+          <w:rFonts w:ascii="Consolas" w:hAnsi="Consolas"/>
+          <w:sz w:val="22"/>
+        </w:rPr>
+      </w:pPr>
+      <w:r>
+        <w:rPr>
+          <w:rFonts w:ascii="Consolas" w:hAnsi="Consolas"/>
+          <w:sz w:val="22"/>
+        </w:rPr>
+        <w:t># Integrante: Mariangel Marin Chinchilla</w:t>
+      </w:r>
+    </w:p>
+    <w:p>
+      <w:pPr>
+        <w:spacing w:line="259" w:lineRule="auto"/>
+        <w:ind w:left="0" w:firstLine="0"/>
+        <w:rPr>
+          <w:rFonts w:ascii="Consolas" w:hAnsi="Consolas"/>
+          <w:sz w:val="22"/>
+        </w:rPr>
+      </w:pPr>
+      <w:r>
+        <w:rPr>
+          <w:rFonts w:ascii="Consolas" w:hAnsi="Consolas"/>
+          <w:sz w:val="22"/>
+        </w:rPr>
+        <w:t># Fecha: 10/10/2026   Versión: 1.0</w:t>
+      </w:r>
+    </w:p>
+    <w:p>
+      <w:pPr>
+        <w:spacing w:line="259" w:lineRule="auto"/>
+        <w:ind w:left="0" w:firstLine="0"/>
+        <w:rPr>
+          <w:rFonts w:ascii="Consolas" w:hAnsi="Consolas"/>
+          <w:sz w:val="22"/>
+        </w:rPr>
+      </w:pPr>
+      <w:r>
+        <w:rPr>
+          <w:rFonts w:ascii="Consolas" w:hAnsi="Consolas"/>
+          <w:sz w:val="22"/>
+        </w:rPr>
+        <w:t># Descripción: Calcula los recursos necesarios para una misión.</w:t>
+      </w:r>
+    </w:p>
+    <w:p>
+      <w:pPr>
+        <w:spacing w:line="259" w:lineRule="auto"/>
+        <w:ind w:left="0" w:firstLine="0"/>
+        <w:rPr>
+          <w:rFonts w:ascii="Consolas" w:hAnsi="Consolas"/>
+          <w:sz w:val="22"/>
+        </w:rPr>
+      </w:pPr>
+      <w:r>
+        <w:rPr>
+          <w:rFonts w:ascii="Consolas" w:hAnsi="Consolas"/>
+          <w:sz w:val="22"/>
+        </w:rPr>
+        <w:t># ============================================================</w:t>
+      </w:r>
+    </w:p>
+    <w:p>
+      <w:pPr>
+        <w:spacing w:line="259" w:lineRule="auto"/>
+        <w:ind w:left="0" w:firstLine="0"/>
+        <w:rPr>
+          <w:rFonts w:ascii="Consolas" w:hAnsi="Consolas"/>
+          <w:sz w:val="22"/>
+        </w:rPr>
+      </w:pPr>
+    </w:p>
+    <w:p>
+      <w:pPr>
+        <w:spacing w:line="259" w:lineRule="auto"/>
+        <w:ind w:left="0" w:firstLine="0"/>
+        <w:rPr>
+          <w:rFonts w:ascii="Consolas" w:hAnsi="Consolas"/>
+          <w:sz w:val="22"/>
+        </w:rPr>
+      </w:pPr>
+      <w:r>
+        <w:rPr>
+          <w:rFonts w:ascii="Consolas" w:hAnsi="Consolas"/>
+          <w:sz w:val="22"/>
+        </w:rPr>
+        <w:t># --- Declaración de constantes ---</w:t>
+      </w:r>
+    </w:p>
+    <w:p>
+      <w:pPr>
+        <w:spacing w:line="259" w:lineRule="auto"/>
+        <w:ind w:left="0" w:firstLine="0"/>
+        <w:rPr>
+          <w:rFonts w:ascii="Consolas" w:hAnsi="Consolas"/>
+          <w:sz w:val="22"/>
+        </w:rPr>
+      </w:pPr>
+      <w:r>
+        <w:rPr>
+          <w:rFonts w:ascii="Consolas" w:hAnsi="Consolas"/>
+          <w:sz w:val="22"/>
+        </w:rPr>
+        <w:t>COMBUSTIBLE_POR_DIA = 8</w:t>
+      </w:r>
+    </w:p>
+    <w:p>
+      <w:pPr>
+        <w:spacing w:line="259" w:lineRule="auto"/>
+        <w:ind w:left="0" w:firstLine="0"/>
+        <w:rPr>
+          <w:rFonts w:ascii="Consolas" w:hAnsi="Consolas"/>
+          <w:sz w:val="22"/>
+        </w:rPr>
+      </w:pPr>
+      <w:r>
+        <w:rPr>
+          <w:rFonts w:ascii="Consolas" w:hAnsi="Consolas"/>
+          <w:sz w:val="22"/>
+        </w:rPr>
+        <w:t>RESERVA_COMBUSTIBLE = 10</w:t>
+      </w:r>
+    </w:p>
+    <w:p>
+      <w:pPr>
+        <w:spacing w:line="259" w:lineRule="auto"/>
+        <w:ind w:left="0" w:firstLine="0"/>
+        <w:rPr>
+          <w:rFonts w:ascii="Consolas" w:hAnsi="Consolas"/>
+          <w:sz w:val="22"/>
+        </w:rPr>
+      </w:pPr>
+      <w:r>
+        <w:rPr>
+          <w:rFonts w:ascii="Consolas" w:hAnsi="Consolas"/>
+          <w:sz w:val="22"/>
+        </w:rPr>
+        <w:t>OXIGENO_POR_DIA = 2</w:t>
+      </w:r>
+    </w:p>
+    <w:p>
+      <w:pPr>
+        <w:spacing w:line="259" w:lineRule="auto"/>
+        <w:ind w:left="0" w:firstLine="0"/>
+        <w:rPr>
+          <w:rFonts w:ascii="Consolas" w:hAnsi="Consolas"/>
+          <w:sz w:val="22"/>
+        </w:rPr>
+      </w:pPr>
+      <w:r>
+        <w:rPr>
+          <w:rFonts w:ascii="Consolas" w:hAnsi="Consolas"/>
+          <w:sz w:val="22"/>
+        </w:rPr>
+        <w:t>RESERVA_OXIGENO = 5</w:t>
+      </w:r>
+    </w:p>
+    <w:p>
+      <w:pPr>
+        <w:spacing w:line="259" w:lineRule="auto"/>
+        <w:ind w:left="0" w:firstLine="0"/>
+        <w:rPr>
+          <w:rFonts w:ascii="Consolas" w:hAnsi="Consolas"/>
+          <w:sz w:val="22"/>
+        </w:rPr>
+      </w:pPr>
+      <w:r>
+        <w:rPr>
+          <w:rFonts w:ascii="Consolas" w:hAnsi="Consolas"/>
+          <w:sz w:val="22"/>
+        </w:rPr>
+        <w:t>ENERGIA_POR_DIA = 5</w:t>
+      </w:r>
+    </w:p>
+    <w:p>
+      <w:pPr>
+        <w:spacing w:line="259" w:lineRule="auto"/>
+        <w:ind w:left="0" w:firstLine="0"/>
+        <w:rPr>
+          <w:rFonts w:ascii="Consolas" w:hAnsi="Consolas"/>
+          <w:sz w:val="22"/>
+        </w:rPr>
+      </w:pPr>
+      <w:r>
+        <w:rPr>
+          <w:rFonts w:ascii="Consolas" w:hAnsi="Consolas"/>
+          <w:sz w:val="22"/>
+        </w:rPr>
+        <w:t>ENERGIA_EXPLORACION = 10</w:t>
+      </w:r>
+    </w:p>
+    <w:p>
+      <w:pPr>
+        <w:spacing w:line="259" w:lineRule="auto"/>
+        <w:ind w:left="0" w:firstLine="0"/>
+        <w:rPr>
+          <w:rFonts w:ascii="Consolas" w:hAnsi="Consolas"/>
+          <w:sz w:val="22"/>
+        </w:rPr>
+      </w:pPr>
+      <w:r>
+        <w:rPr>
+          <w:rFonts w:ascii="Consolas" w:hAnsi="Consolas"/>
+          <w:sz w:val="22"/>
+        </w:rPr>
+        <w:t>PROVISIONES_POR_DIA = 1</w:t>
+      </w:r>
+    </w:p>
+    <w:p>
+      <w:pPr>
+        <w:spacing w:line="259" w:lineRule="auto"/>
+        <w:ind w:left="0" w:firstLine="0"/>
+        <w:rPr>
+          <w:rFonts w:ascii="Consolas" w:hAnsi="Consolas"/>
+          <w:sz w:val="22"/>
+        </w:rPr>
+      </w:pPr>
+      <w:r>
+        <w:rPr>
+          <w:rFonts w:ascii="Consolas" w:hAnsi="Consolas"/>
+          <w:sz w:val="22"/>
+        </w:rPr>
+        <w:t>RESERVA_PROVISIONES = 3</w:t>
+      </w:r>
+    </w:p>
+    <w:p>
+      <w:pPr>
+        <w:spacing w:line="259" w:lineRule="auto"/>
+        <w:ind w:left="0" w:firstLine="0"/>
+        <w:rPr>
+          <w:rFonts w:ascii="Consolas" w:hAnsi="Consolas"/>
+          <w:sz w:val="22"/>
+        </w:rPr>
+      </w:pPr>
+      <w:r>
+        <w:rPr>
+          <w:rFonts w:ascii="Consolas" w:hAnsi="Consolas"/>
+          <w:sz w:val="22"/>
+        </w:rPr>
+        <w:t>TRAMOS_VIAJE = 2  # ida y regreso</w:t>
+      </w:r>
+    </w:p>
+    <w:p>
+      <w:pPr>
+        <w:spacing w:line="259" w:lineRule="auto"/>
+        <w:ind w:left="0" w:firstLine="0"/>
+        <w:rPr>
+          <w:rFonts w:ascii="Consolas" w:hAnsi="Consolas"/>
+          <w:sz w:val="22"/>
+        </w:rPr>
+      </w:pPr>
+    </w:p>
+    <w:p>
+      <w:pPr>
+        <w:spacing w:line="259" w:lineRule="auto"/>
+        <w:ind w:left="0" w:firstLine="0"/>
+        <w:rPr>
+          <w:rFonts w:ascii="Consolas" w:hAnsi="Consolas"/>
+          <w:sz w:val="22"/>
+        </w:rPr>
+      </w:pPr>
+      <w:r>
+        <w:rPr>
+          <w:rFonts w:ascii="Consolas" w:hAnsi="Consolas"/>
+          <w:sz w:val="22"/>
+        </w:rPr>
+        <w:t># --- Entrada de datos ---</w:t>
+      </w:r>
+    </w:p>
+    <w:p>
+      <w:pPr>
+        <w:spacing w:line="259" w:lineRule="auto"/>
+        <w:ind w:left="0" w:firstLine="0"/>
+        <w:rPr>
+          <w:rFonts w:ascii="Consolas" w:hAnsi="Consolas"/>
+          <w:sz w:val="22"/>
+        </w:rPr>
+      </w:pPr>
+      <w:r>
+        <w:rPr>
+          <w:rFonts w:ascii="Consolas" w:hAnsi="Consolas"/>
+          <w:sz w:val="22"/>
+        </w:rPr>
+        <w:t>nombre_mision = input("Nombre de la misión: ")</w:t>
+      </w:r>
+    </w:p>
+    <w:p>
+      <w:pPr>
+        <w:spacing w:line="259" w:lineRule="auto"/>
+        <w:ind w:left="0" w:firstLine="0"/>
+        <w:rPr>
+          <w:rFonts w:ascii="Consolas" w:hAnsi="Consolas"/>
+          <w:sz w:val="22"/>
+        </w:rPr>
+      </w:pPr>
+      <w:r>
+        <w:rPr>
+          <w:rFonts w:ascii="Consolas" w:hAnsi="Consolas"/>
+          <w:sz w:val="22"/>
+        </w:rPr>
+        <w:t>tripulantes = int(input("Cantidad de tripulantes: "))</w:t>
+      </w:r>
+    </w:p>
+    <w:p>
+      <w:pPr>
+        <w:spacing w:line="259" w:lineRule="auto"/>
+        <w:ind w:left="0" w:firstLine="0"/>
+        <w:rPr>
+          <w:rFonts w:ascii="Consolas" w:hAnsi="Consolas"/>
+          <w:sz w:val="22"/>
+        </w:rPr>
+      </w:pPr>
+      <w:r>
+        <w:rPr>
+          <w:rFonts w:ascii="Consolas" w:hAnsi="Consolas"/>
+          <w:sz w:val="22"/>
+        </w:rPr>
+        <w:t>dias_viaje = int(input("Días estimados hasta el destino: "))</w:t>
+      </w:r>
+    </w:p>
+    <w:p>
+      <w:pPr>
+        <w:spacing w:line="259" w:lineRule="auto"/>
+        <w:ind w:left="0" w:firstLine="0"/>
+        <w:rPr>
+          <w:rFonts w:ascii="Consolas" w:hAnsi="Consolas"/>
+          <w:sz w:val="22"/>
+        </w:rPr>
+      </w:pPr>
+    </w:p>
+    <w:p>
+      <w:pPr>
+        <w:spacing w:line="259" w:lineRule="auto"/>
+        <w:ind w:left="0" w:firstLine="0"/>
+        <w:rPr>
+          <w:rFonts w:ascii="Consolas" w:hAnsi="Consolas"/>
+          <w:sz w:val="22"/>
+        </w:rPr>
+      </w:pPr>
+      <w:r>
+        <w:rPr>
+          <w:rFonts w:ascii="Consolas" w:hAnsi="Consolas"/>
+          <w:sz w:val="22"/>
+        </w:rPr>
+        <w:t># --- Procesamiento ---</w:t>
+      </w:r>
+    </w:p>
+    <w:p>
+      <w:pPr>
+        <w:spacing w:line="259" w:lineRule="auto"/>
+        <w:ind w:left="0" w:firstLine="0"/>
+        <w:rPr>
+          <w:rFonts w:ascii="Consolas" w:hAnsi="Consolas"/>
+          <w:sz w:val="22"/>
+        </w:rPr>
+      </w:pPr>
+      <w:r>
+        <w:rPr>
+          <w:rFonts w:ascii="Consolas" w:hAnsi="Consolas"/>
+          <w:sz w:val="22"/>
+        </w:rPr>
+        <w:t>combustible_ida = dias_viaje * COMBUSTIBLE_POR_DIA</w:t>
+      </w:r>
+    </w:p>
+    <w:p>
+      <w:pPr>
+        <w:spacing w:line="259" w:lineRule="auto"/>
+        <w:ind w:left="0" w:firstLine="0"/>
+        <w:rPr>
+          <w:rFonts w:ascii="Consolas" w:hAnsi="Consolas"/>
+          <w:sz w:val="22"/>
+        </w:rPr>
+      </w:pPr>
+      <w:r>
+        <w:rPr>
+          <w:rFonts w:ascii="Consolas" w:hAnsi="Consolas"/>
+          <w:sz w:val="22"/>
+        </w:rPr>
+        <w:lastRenderedPageBreak/>
+        <w:t>combustible_regreso = dias_viaje * COMBUSTIBLE_POR_DIA</w:t>
+      </w:r>
+    </w:p>
+    <w:p>
+      <w:pPr>
+        <w:spacing w:line="259" w:lineRule="auto"/>
+        <w:ind w:left="0" w:firstLine="0"/>
+        <w:rPr>
+          <w:rFonts w:ascii="Consolas" w:hAnsi="Consolas"/>
+          <w:sz w:val="22"/>
+        </w:rPr>
+      </w:pPr>
+      <w:r>
+        <w:rPr>
+          <w:rFonts w:ascii="Consolas" w:hAnsi="Consolas"/>
+          <w:sz w:val="22"/>
+        </w:rPr>
+        <w:t>combustible_total = combustible_ida + combustible_regreso + RESERVA_COMBUSTIBLE</w:t>
+      </w:r>
+    </w:p>
+    <w:p>
+      <w:pPr>
+        <w:spacing w:line="259" w:lineRule="auto"/>
+        <w:ind w:left="0" w:firstLine="0"/>
+        <w:rPr>
+          <w:rFonts w:ascii="Consolas" w:hAnsi="Consolas"/>
+          <w:sz w:val="22"/>
+        </w:rPr>
+      </w:pPr>
+      <w:r>
+        <w:rPr>
+          <w:rFonts w:ascii="Consolas" w:hAnsi="Consolas"/>
+          <w:sz w:val="22"/>
+        </w:rPr>
+        <w:t>oxigeno_requerido = dias_viaje * TRAMOS_VIAJE * OXIGENO_POR_DIA * tripulantes + RESERVA_OXIGENO</w:t>
+      </w:r>
+    </w:p>
+    <w:p>
+      <w:pPr>
+        <w:spacing w:line="259" w:lineRule="auto"/>
+        <w:ind w:left="0" w:firstLine="0"/>
+        <w:rPr>
+          <w:rFonts w:ascii="Consolas" w:hAnsi="Consolas"/>
+          <w:sz w:val="22"/>
+        </w:rPr>
+      </w:pPr>
+      <w:r>
+        <w:rPr>
+          <w:rFonts w:ascii="Consolas" w:hAnsi="Consolas"/>
+          <w:sz w:val="22"/>
+        </w:rPr>
+        <w:t>energia_requerida = dias_viaje * ENERGIA_POR_DIA * TRAMOS_VIAJE + ENERGIA_EXPLORACION</w:t>
+      </w:r>
+    </w:p>
+    <w:p>
+      <w:pPr>
+        <w:spacing w:line="259" w:lineRule="auto"/>
+        <w:ind w:left="0" w:firstLine="0"/>
+        <w:rPr>
+          <w:rFonts w:ascii="Consolas" w:hAnsi="Consolas"/>
+          <w:sz w:val="22"/>
+        </w:rPr>
+      </w:pPr>
+      <w:r>
+        <w:rPr>
+          <w:rFonts w:ascii="Consolas" w:hAnsi="Consolas"/>
+          <w:sz w:val="22"/>
+        </w:rPr>
+        <w:t>provisiones_requeridas = dias_viaje * PROVISIONES_POR_DIA * tripulantes * TRAMOS_VIAJE + RESERVA_PROVISIONES</w:t>
+      </w:r>
+    </w:p>
+    <w:p>
+      <w:pPr>
+        <w:spacing w:line="259" w:lineRule="auto"/>
+        <w:ind w:left="0" w:firstLine="0"/>
+        <w:rPr>
+          <w:rFonts w:ascii="Consolas" w:hAnsi="Consolas"/>
+          <w:sz w:val="22"/>
+        </w:rPr>
+      </w:pPr>
+    </w:p>
+    <w:p>
+      <w:pPr>
+        <w:spacing w:line="259" w:lineRule="auto"/>
+        <w:ind w:left="0" w:firstLine="0"/>
+        <w:rPr>
+          <w:rFonts w:ascii="Consolas" w:hAnsi="Consolas"/>
+          <w:sz w:val="22"/>
+        </w:rPr>
+      </w:pPr>
+      <w:r>
+        <w:rPr>
+          <w:rFonts w:ascii="Consolas" w:hAnsi="Consolas"/>
+          <w:sz w:val="22"/>
+        </w:rPr>
+        <w:t># --- Salida de resultados ---</w:t>
+      </w:r>
+    </w:p>
+    <w:p>
+      <w:pPr>
+        <w:spacing w:line="259" w:lineRule="auto"/>
+        <w:ind w:left="0" w:firstLine="0"/>
+        <w:rPr>
+          <w:rFonts w:ascii="Consolas" w:hAnsi="Consolas"/>
+          <w:sz w:val="22"/>
+        </w:rPr>
+      </w:pPr>
+      <w:r>
+        <w:rPr>
+          <w:rFonts w:ascii="Consolas" w:hAnsi="Consolas"/>
+          <w:sz w:val="22"/>
+        </w:rPr>
+        <w:t>print("Misión:", nombre_mision)</w:t>
+      </w:r>
+    </w:p>
+    <w:p>
+      <w:pPr>
+        <w:spacing w:line="259" w:lineRule="auto"/>
+        <w:ind w:left="0" w:firstLine="0"/>
+        <w:rPr>
+          <w:rFonts w:ascii="Consolas" w:hAnsi="Consolas"/>
+          <w:sz w:val="22"/>
+        </w:rPr>
+      </w:pPr>
+      <w:r>
+        <w:rPr>
+          <w:rFonts w:ascii="Consolas" w:hAnsi="Consolas"/>
+          <w:sz w:val="22"/>
+        </w:rPr>
+        <w:t>print("Tripulantes:", tripulantes)</w:t>
+      </w:r>
+    </w:p>
+    <w:p>
+      <w:pPr>
+        <w:spacing w:line="259" w:lineRule="auto"/>
+        <w:ind w:left="0" w:firstLine="0"/>
+        <w:rPr>
+          <w:rFonts w:ascii="Consolas" w:hAnsi="Consolas"/>
+          <w:sz w:val="22"/>
+        </w:rPr>
+      </w:pPr>
+      <w:r>
+        <w:rPr>
+          <w:rFonts w:ascii="Consolas" w:hAnsi="Consolas"/>
+          <w:sz w:val="22"/>
+        </w:rPr>
+        <w:t>print("Duración estimada hasta el destino:", dias_viaje, "días")</w:t>
+      </w:r>
+    </w:p>
+    <w:p>
+      <w:pPr>
+        <w:spacing w:line="259" w:lineRule="auto"/>
+        <w:ind w:left="0" w:firstLine="0"/>
+        <w:rPr>
+          <w:rFonts w:ascii="Consolas" w:hAnsi="Consolas"/>
+          <w:sz w:val="22"/>
+        </w:rPr>
+      </w:pPr>
+      <w:r>
+        <w:rPr>
+          <w:rFonts w:ascii="Consolas" w:hAnsi="Consolas"/>
+          <w:sz w:val="22"/>
+        </w:rPr>
+        <w:t>print("Combustible para llegar:", combustible_ida, "unidades")</w:t>
+      </w:r>
+    </w:p>
+    <w:p>
+      <w:pPr>
+        <w:spacing w:line="259" w:lineRule="auto"/>
+        <w:ind w:left="0" w:firstLine="0"/>
+        <w:rPr>
+          <w:rFonts w:ascii="Consolas" w:hAnsi="Consolas"/>
+          <w:sz w:val="22"/>
+        </w:rPr>
+      </w:pPr>
+      <w:r>
+        <w:rPr>
+          <w:rFonts w:ascii="Consolas" w:hAnsi="Consolas"/>
+          <w:sz w:val="22"/>
+        </w:rPr>
+        <w:t>print("Combustible para regresar:", combustible_regreso, "unidades")</w:t>
+      </w:r>
+    </w:p>
+    <w:p>
+      <w:pPr>
+        <w:spacing w:line="259" w:lineRule="auto"/>
+        <w:ind w:left="0" w:firstLine="0"/>
+        <w:rPr>
+          <w:rFonts w:ascii="Consolas" w:hAnsi="Consolas"/>
+          <w:sz w:val="22"/>
+        </w:rPr>
+      </w:pPr>
+      <w:r>
+        <w:rPr>
+          <w:rFonts w:ascii="Consolas" w:hAnsi="Consolas"/>
+          <w:sz w:val="22"/>
+        </w:rPr>
+        <w:t>print("Combustible total requerido:", combustible_total, "unidades")</w:t>
+      </w:r>
+    </w:p>
+    <w:p>
+      <w:pPr>
+        <w:spacing w:line="259" w:lineRule="auto"/>
+        <w:ind w:left="0" w:firstLine="0"/>
+        <w:rPr>
+          <w:rFonts w:ascii="Consolas" w:hAnsi="Consolas"/>
+          <w:sz w:val="22"/>
+        </w:rPr>
+      </w:pPr>
+      <w:r>
+        <w:rPr>
+          <w:rFonts w:ascii="Consolas" w:hAnsi="Consolas"/>
+          <w:sz w:val="22"/>
+        </w:rPr>
+        <w:t>print("Reserva de combustible:", RESERVA_COMBUSTIBLE, "unidades")</w:t>
+      </w:r>
+    </w:p>
+    <w:p>
+      <w:pPr>
+        <w:spacing w:line="259" w:lineRule="auto"/>
+        <w:ind w:left="0" w:firstLine="0"/>
+        <w:rPr>
+          <w:rFonts w:ascii="Consolas" w:hAnsi="Consolas"/>
+          <w:sz w:val="22"/>
+        </w:rPr>
+      </w:pPr>
+      <w:r>
+        <w:rPr>
+          <w:rFonts w:ascii="Consolas" w:hAnsi="Consolas"/>
+          <w:sz w:val="22"/>
+        </w:rPr>
+        <w:t>print("Oxígeno requerido:", oxigeno_requerido, "unidades")</w:t>
+      </w:r>
+    </w:p>
+    <w:p>
+      <w:pPr>
+        <w:spacing w:line="259" w:lineRule="auto"/>
+        <w:ind w:left="0" w:firstLine="0"/>
+        <w:rPr>
+          <w:rFonts w:ascii="Consolas" w:hAnsi="Consolas"/>
+          <w:sz w:val="22"/>
+        </w:rPr>
+      </w:pPr>
+      <w:r>
+        <w:rPr>
+          <w:rFonts w:ascii="Consolas" w:hAnsi="Consolas"/>
+          <w:sz w:val="22"/>
+        </w:rPr>
+        <w:t>print("Energía requerida:", energia_requerida, "unidades")</w:t>
+      </w:r>
+    </w:p>
+    <w:p>
+      <w:pPr>
+        <w:spacing w:line="259" w:lineRule="auto"/>
+        <w:ind w:left="0" w:firstLine="0"/>
+        <w:rPr>
+          <w:rFonts w:ascii="Consolas" w:hAnsi="Consolas"/>
+          <w:sz w:val="22"/>
+        </w:rPr>
+      </w:pPr>
+      <w:r>
+        <w:rPr>
+          <w:rFonts w:ascii="Consolas" w:hAnsi="Consolas"/>
+          <w:sz w:val="22"/>
+        </w:rPr>
+        <w:t>print("Provisiones requeridas:", provisiones_requeridas, "unidades")</w:t>
+      </w:r>
+    </w:p>
+    <w:p>
+      <w:pPr>
+        <w:spacing w:line="259" w:lineRule="auto"/>
+        <w:ind w:left="0" w:firstLine="0"/>
+        <w:rPr>
+          <w:sz w:val="22"/>
+        </w:rPr>
+      </w:pPr>
+    </w:p>
+    <w:p>
+      <w:pPr>
+        <w:spacing w:line="259" w:lineRule="auto"/>
+        <w:ind w:left="0" w:firstLine="0"/>
+        <w:rPr>
+          <w:sz w:val="22"/>
+        </w:rPr>
+      </w:pPr>
+    </w:p>
+    <w:p>
+      <w:pPr>
+        <w:spacing w:line="259" w:lineRule="auto"/>
+        <w:ind w:left="0" w:firstLine="0"/>
+        <w:rPr>
+          <w:sz w:val="22"/>
+        </w:rPr>
+      </w:pPr>
+    </w:p>
+    <w:p>
+      <w:pPr>
+        <w:spacing w:line="259" w:lineRule="auto"/>
+        <w:ind w:left="0" w:firstLine="0"/>
+        <w:rPr>
+          <w:sz w:val="22"/>
+        </w:rPr>
+      </w:pPr>
+    </w:p>
+    <w:p>
+      <w:pPr>
+        <w:spacing w:line="259" w:lineRule="auto"/>
+        <w:ind w:left="0" w:firstLine="0"/>
+        <w:rPr>
+          <w:sz w:val="22"/>
+        </w:rPr>
+      </w:pPr>
+    </w:p>
+    <w:p>
+      <w:pPr>
+        <w:spacing w:line="259" w:lineRule="auto"/>
+        <w:ind w:left="0" w:firstLine="0"/>
+        <w:rPr>
+          <w:sz w:val="22"/>
+        </w:rPr>
+      </w:pPr>
+    </w:p>
+    <w:p>
+      <w:pPr>
+        <w:spacing w:line="259" w:lineRule="auto"/>
+        <w:ind w:left="0" w:firstLine="0"/>
+        <w:rPr>
+          <w:sz w:val="22"/>
+        </w:rPr>
+      </w:pPr>
+    </w:p>
+    <w:p>
+      <w:pPr>
+        <w:spacing w:line="259" w:lineRule="auto"/>
+        <w:ind w:left="0" w:firstLine="0"/>
+        <w:jc w:val="center"/>
+        <w:rPr>
+          <w:b/>
+          <w:bCs/>
+          <w:sz w:val="22"/>
+        </w:rPr>
+      </w:pPr>
+    </w:p>
+    <w:p>
+      <w:pPr>
+        <w:spacing w:line="259" w:lineRule="auto"/>
+        <w:ind w:left="0" w:firstLine="0"/>
+        <w:jc w:val="center"/>
+        <w:rPr>
+          <w:b/>
+          <w:bCs/>
+          <w:sz w:val="22"/>
+        </w:rPr>
+      </w:pPr>
+      <w:r>
+        <w:rPr>
+          <w:b/>
+          <w:bCs/>
           <w:sz w:val="22"/>
         </w:rPr>
         <w:lastRenderedPageBreak/>
@@ -3559,6 +4304,7 @@
         <w:rPr>
           <w:b/>
           <w:bCs/>
+          <w:noProof/>
           <w:sz w:val="22"/>
         </w:rPr>
         <w:drawing>
@@ -3715,23 +4461,7 @@
           <w:bCs/>
           <w:sz w:val="22"/>
         </w:rPr>
-        <w:t>CP-0</w:t>
-      </w:r>
-      <w:r>
-        <w:rPr>
-          <w:b/>
-          <w:bCs/>
-          <w:sz w:val="22"/>
-        </w:rPr>
-        <w:t>2</w:t>
-      </w:r>
-      <w:r>
-        <w:rPr>
-          <w:b/>
-          <w:bCs/>
-          <w:sz w:val="22"/>
-        </w:rPr>
-        <w:t>: evidencia con captura de pantalla</w:t>
+        <w:t>CP-02: evidencia con captura de pantalla</w:t>
       </w:r>
       <w:bookmarkEnd w:id="1"/>
     </w:p>
@@ -6037,6 +6767,7 @@
   <w:style w:type="character" w:default="1" w:styleId="Fuentedeprrafopredeter">
     <w:name w:val="Default Paragraph Font"/>
     <w:uiPriority w:val="1"/>
+    <w:semiHidden/>
     <w:unhideWhenUsed/>
   </w:style>
   <w:style w:type="table" w:default="1" w:styleId="Tablanormal">

</xml_diff>

<commit_message>
Agrega casos de prueba del ejercicio 3
</commit_message>
<xml_diff>
--- a/documentación/Primer avance del proyecto.docx
+++ b/documentación/Primer avance del proyecto.docx
@@ -6502,8 +6502,8 @@
           </wp:anchor>
         </w:drawing>
       </w:r>
-      <w:bookmarkStart w:id="2" w:name="_Hlk242548917"/>
-      <w:bookmarkStart w:id="3" w:name="_Hlk242554472"/>
+      <w:bookmarkStart w:id="2" w:name="_Hlk242554472"/>
+      <w:bookmarkStart w:id="3" w:name="_Hlk242548917"/>
       <w:r>
         <w:rPr>
           <w:b/>
@@ -6512,7 +6512,7 @@
         </w:rPr>
         <w:t>CP-01: evidencia con captura de pantall</w:t>
       </w:r>
-      <w:bookmarkEnd w:id="3"/>
+      <w:bookmarkEnd w:id="2"/>
       <w:r>
         <w:rPr>
           <w:b/>
@@ -6521,7 +6521,7 @@
         </w:rPr>
         <w:t>a</w:t>
       </w:r>
-      <w:bookmarkEnd w:id="2"/>
+      <w:bookmarkEnd w:id="3"/>
     </w:p>
     <w:p>
       <w:pPr>
@@ -6734,43 +6734,27 @@
           <w:bCs/>
           <w:sz w:val="22"/>
         </w:rPr>
-        <w:t xml:space="preserve">Ejercicio 2: </w:t>
-      </w:r>
-      <w:r>
+        <w:t>Ejercicio 2: Verificación de combustible</w:t>
+      </w:r>
+    </w:p>
+    <w:p>
+      <w:pPr>
+        <w:tabs>
+          <w:tab w:val="left" w:pos="4665"/>
+        </w:tabs>
         <w:rPr>
           <w:b/>
           <w:bCs/>
           <w:sz w:val="22"/>
         </w:rPr>
-        <w:t>Verificación de combustible</w:t>
-      </w:r>
-    </w:p>
-    <w:p>
-      <w:pPr>
-        <w:tabs>
-          <w:tab w:val="left" w:pos="4665"/>
-        </w:tabs>
+      </w:pPr>
+      <w:r>
         <w:rPr>
           <w:b/>
           <w:bCs/>
           <w:sz w:val="22"/>
         </w:rPr>
-      </w:pPr>
-      <w:r>
-        <w:rPr>
-          <w:b/>
-          <w:bCs/>
-          <w:sz w:val="22"/>
-        </w:rPr>
-        <w:t>T</w:t>
-      </w:r>
-      <w:r>
-        <w:rPr>
-          <w:b/>
-          <w:bCs/>
-          <w:sz w:val="22"/>
-        </w:rPr>
-        <w:t>abla de variables</w:t>
+        <w:t>Tabla de variables</w:t>
       </w:r>
     </w:p>
     <w:p>
@@ -7797,6 +7781,7 @@
           <w:sz w:val="22"/>
         </w:rPr>
       </w:pPr>
+      <w:bookmarkStart w:id="5" w:name="_Hlk242720583"/>
       <w:r>
         <w:rPr>
           <w:b/>
@@ -7807,6 +7792,7 @@
         <w:t>Código</w:t>
       </w:r>
     </w:p>
+    <w:bookmarkEnd w:id="5"/>
     <w:p>
       <w:pPr>
         <w:shd w:val="clear" w:color="auto" w:fill="121314"/>
@@ -9592,6 +9578,7 @@
           <w:sz w:val="22"/>
         </w:rPr>
       </w:pPr>
+      <w:bookmarkStart w:id="6" w:name="_Hlk242720697"/>
       <w:r>
         <w:rPr>
           <w:b/>
@@ -9629,6 +9616,7 @@
             <w:tcW w:w="989" w:type="dxa"/>
             <w:hideMark/>
           </w:tcPr>
+          <w:bookmarkEnd w:id="6"/>
           <w:p>
             <w:pPr>
               <w:spacing w:after="0" w:line="240" w:lineRule="auto"/>
@@ -11129,7 +11117,7 @@
           <w:sz w:val="22"/>
         </w:rPr>
       </w:pPr>
-      <w:bookmarkStart w:id="5" w:name="_Hlk242554590"/>
+      <w:bookmarkStart w:id="7" w:name="_Hlk242554590"/>
     </w:p>
     <w:p>
       <w:pPr>
@@ -11147,27 +11135,20 @@
           <w:bCs/>
           <w:sz w:val="22"/>
         </w:rPr>
-        <w:t>CP-01: evidencia con captura de pantall</w:t>
-      </w:r>
-      <w:r>
-        <w:rPr>
-          <w:b/>
-          <w:bCs/>
+        <w:t>CP-01: evidencia con captura de pantalla</w:t>
+      </w:r>
+    </w:p>
+    <w:bookmarkEnd w:id="7"/>
+    <w:p>
+      <w:pPr>
+        <w:ind w:left="0" w:firstLine="0"/>
+        <w:rPr>
           <w:sz w:val="22"/>
         </w:rPr>
-        <w:t>a</w:t>
-      </w:r>
-    </w:p>
-    <w:bookmarkEnd w:id="5"/>
-    <w:p>
-      <w:pPr>
-        <w:ind w:left="0" w:firstLine="0"/>
-        <w:rPr>
-          <w:sz w:val="22"/>
-        </w:rPr>
-      </w:pPr>
-      <w:r>
-        <w:rPr>
+      </w:pPr>
+      <w:r>
+        <w:rPr>
+          <w:noProof/>
           <w:sz w:val="22"/>
         </w:rPr>
         <w:drawing>
@@ -11237,45 +11218,30 @@
           <w:sz w:val="22"/>
         </w:rPr>
       </w:pPr>
-      <w:bookmarkStart w:id="6" w:name="_Hlk242554770"/>
+      <w:bookmarkStart w:id="8" w:name="_Hlk242554770"/>
       <w:r>
         <w:rPr>
           <w:b/>
           <w:bCs/>
           <w:sz w:val="22"/>
         </w:rPr>
-        <w:t>CP-0</w:t>
-      </w:r>
-      <w:r>
+        <w:t>CP-02: evidencia con captura de pantalla</w:t>
+      </w:r>
+    </w:p>
+    <w:bookmarkEnd w:id="8"/>
+    <w:p>
+      <w:pPr>
+        <w:ind w:left="0" w:firstLine="0"/>
+        <w:jc w:val="center"/>
         <w:rPr>
           <w:b/>
           <w:bCs/>
           <w:sz w:val="22"/>
         </w:rPr>
-        <w:t>2</w:t>
-      </w:r>
-      <w:r>
-        <w:rPr>
-          <w:b/>
-          <w:bCs/>
-          <w:sz w:val="22"/>
-        </w:rPr>
-        <w:t>: evidencia con captura de pantalla</w:t>
-      </w:r>
-    </w:p>
-    <w:bookmarkEnd w:id="6"/>
-    <w:p>
-      <w:pPr>
-        <w:ind w:left="0" w:firstLine="0"/>
-        <w:jc w:val="center"/>
-        <w:rPr>
-          <w:b/>
-          <w:bCs/>
-          <w:sz w:val="22"/>
-        </w:rPr>
-      </w:pPr>
-      <w:r>
-        <w:rPr>
+      </w:pPr>
+      <w:r>
+        <w:rPr>
+          <w:noProof/>
           <w:sz w:val="22"/>
         </w:rPr>
         <w:lastRenderedPageBreak/>
@@ -11341,28 +11307,13 @@
           <w:bCs/>
           <w:sz w:val="22"/>
         </w:rPr>
-        <w:t>CP-0</w:t>
+        <w:t>CP-03: evidencia con captura de pantalla</w:t>
       </w:r>
       <w:r>
         <w:rPr>
           <w:b/>
           <w:bCs/>
-          <w:sz w:val="22"/>
-        </w:rPr>
-        <w:t>3</w:t>
-      </w:r>
-      <w:r>
-        <w:rPr>
-          <w:b/>
-          <w:bCs/>
-          <w:sz w:val="22"/>
-        </w:rPr>
-        <w:t>: evidencia con captura de pantalla</w:t>
-      </w:r>
-      <w:r>
-        <w:rPr>
-          <w:b/>
-          <w:bCs/>
+          <w:noProof/>
           <w:sz w:val="22"/>
         </w:rPr>
         <w:drawing>
@@ -11444,6 +11395,7 @@
         <w:rPr>
           <w:b/>
           <w:bCs/>
+          <w:noProof/>
           <w:sz w:val="22"/>
         </w:rPr>
         <w:drawing>
@@ -11576,6 +11528,23 @@
           <w:sz w:val="22"/>
         </w:rPr>
       </w:pPr>
+    </w:p>
+    <w:p>
+      <w:pPr>
+        <w:rPr>
+          <w:sz w:val="22"/>
+        </w:rPr>
+      </w:pPr>
+    </w:p>
+    <w:p>
+      <w:pPr>
+        <w:spacing w:after="0"/>
+        <w:ind w:left="0" w:firstLine="0"/>
+        <w:jc w:val="center"/>
+        <w:rPr>
+          <w:sz w:val="22"/>
+        </w:rPr>
+      </w:pPr>
       <w:r>
         <w:rPr>
           <w:noProof/>
@@ -11583,16 +11552,16 @@
         </w:rPr>
         <w:lastRenderedPageBreak/>
         <w:drawing>
-          <wp:anchor distT="0" distB="0" distL="114300" distR="114300" simplePos="0" relativeHeight="251666432" behindDoc="0" locked="0" layoutInCell="1" allowOverlap="1" wp14:anchorId="09D9BF6F" wp14:editId="2E5FA435">
+          <wp:anchor distT="0" distB="0" distL="114300" distR="114300" simplePos="0" relativeHeight="251666432" behindDoc="0" locked="0" layoutInCell="1" allowOverlap="1" wp14:anchorId="09D9BF6F" wp14:editId="1CD44B21">
             <wp:simplePos x="0" y="0"/>
             <wp:positionH relativeFrom="margin">
-              <wp:align>center</wp:align>
+              <wp:posOffset>38100</wp:posOffset>
             </wp:positionH>
             <wp:positionV relativeFrom="paragraph">
               <wp:posOffset>0</wp:posOffset>
             </wp:positionV>
-            <wp:extent cx="6496685" cy="2353310"/>
-            <wp:effectExtent l="0" t="0" r="8890" b="8890"/>
+            <wp:extent cx="5810885" cy="1990725"/>
+            <wp:effectExtent l="0" t="0" r="0" b="9525"/>
             <wp:wrapSquare wrapText="bothSides"/>
             <wp:docPr id="10" name="Imagen 10"/>
             <wp:cNvGraphicFramePr>
@@ -11623,7 +11592,7 @@
                   <pic:spPr bwMode="auto">
                     <a:xfrm>
                       <a:off x="0" y="0"/>
-                      <a:ext cx="6496685" cy="2353310"/>
+                      <a:ext cx="5810885" cy="1990725"/>
                     </a:xfrm>
                     <a:prstGeom prst="rect">
                       <a:avLst/>
@@ -11642,6 +11611,4061 @@
           </wp:anchor>
         </w:drawing>
       </w:r>
+      <w:r>
+        <w:rPr>
+          <w:b/>
+          <w:bCs/>
+          <w:sz w:val="22"/>
+        </w:rPr>
+        <w:t xml:space="preserve">Ejercicio 3: </w:t>
+      </w:r>
+      <w:r>
+        <w:rPr>
+          <w:b/>
+          <w:bCs/>
+          <w:sz w:val="22"/>
+        </w:rPr>
+        <w:t>Verificación del soporte para la tripulación</w:t>
+      </w:r>
+    </w:p>
+    <w:p>
+      <w:pPr>
+        <w:spacing w:after="0"/>
+        <w:rPr>
+          <w:b/>
+          <w:bCs/>
+          <w:sz w:val="22"/>
+        </w:rPr>
+      </w:pPr>
+      <w:r>
+        <w:rPr>
+          <w:b/>
+          <w:bCs/>
+          <w:sz w:val="22"/>
+        </w:rPr>
+        <w:t xml:space="preserve">Tabla de variables </w:t>
+      </w:r>
+    </w:p>
+    <w:tbl>
+      <w:tblPr>
+        <w:tblStyle w:val="Tabladelista3-nfasis3"/>
+        <w:tblW w:w="10065" w:type="dxa"/>
+        <w:tblInd w:w="-572" w:type="dxa"/>
+        <w:tblLook w:val="04A0" w:firstRow="1" w:lastRow="0" w:firstColumn="1" w:lastColumn="0" w:noHBand="0" w:noVBand="1"/>
+      </w:tblPr>
+      <w:tblGrid>
+        <w:gridCol w:w="3216"/>
+        <w:gridCol w:w="1305"/>
+        <w:gridCol w:w="3524"/>
+        <w:gridCol w:w="2020"/>
+      </w:tblGrid>
+      <w:tr>
+        <w:trPr>
+          <w:cnfStyle w:val="100000000000" w:firstRow="1" w:lastRow="0" w:firstColumn="0" w:lastColumn="0" w:oddVBand="0" w:evenVBand="0" w:oddHBand="0" w:evenHBand="0" w:firstRowFirstColumn="0" w:firstRowLastColumn="0" w:lastRowFirstColumn="0" w:lastRowLastColumn="0"/>
+        </w:trPr>
+        <w:tc>
+          <w:tcPr>
+            <w:cnfStyle w:val="001000000100" w:firstRow="0" w:lastRow="0" w:firstColumn="1" w:lastColumn="0" w:oddVBand="0" w:evenVBand="0" w:oddHBand="0" w:evenHBand="0" w:firstRowFirstColumn="1" w:firstRowLastColumn="0" w:lastRowFirstColumn="0" w:lastRowLastColumn="0"/>
+            <w:tcW w:w="3216" w:type="dxa"/>
+            <w:hideMark/>
+          </w:tcPr>
+          <w:p>
+            <w:pPr>
+              <w:spacing w:after="0" w:line="240" w:lineRule="auto"/>
+              <w:ind w:left="0" w:firstLine="0"/>
+              <w:jc w:val="center"/>
+              <w:rPr>
+                <w:rFonts w:eastAsia="Times New Roman"/>
+                <w:color w:val="auto"/>
+                <w:szCs w:val="24"/>
+              </w:rPr>
+            </w:pPr>
+            <w:r>
+              <w:rPr>
+                <w:rFonts w:eastAsia="Times New Roman"/>
+                <w:color w:val="auto"/>
+                <w:szCs w:val="24"/>
+              </w:rPr>
+              <w:t>Nombre</w:t>
+            </w:r>
+          </w:p>
+        </w:tc>
+        <w:tc>
+          <w:tcPr>
+            <w:tcW w:w="0" w:type="auto"/>
+            <w:hideMark/>
+          </w:tcPr>
+          <w:p>
+            <w:pPr>
+              <w:spacing w:after="0" w:line="240" w:lineRule="auto"/>
+              <w:ind w:left="0" w:firstLine="0"/>
+              <w:jc w:val="center"/>
+              <w:cnfStyle w:val="100000000000" w:firstRow="1" w:lastRow="0" w:firstColumn="0" w:lastColumn="0" w:oddVBand="0" w:evenVBand="0" w:oddHBand="0" w:evenHBand="0" w:firstRowFirstColumn="0" w:firstRowLastColumn="0" w:lastRowFirstColumn="0" w:lastRowLastColumn="0"/>
+              <w:rPr>
+                <w:rFonts w:eastAsia="Times New Roman"/>
+                <w:color w:val="auto"/>
+                <w:szCs w:val="24"/>
+              </w:rPr>
+            </w:pPr>
+            <w:r>
+              <w:rPr>
+                <w:rFonts w:eastAsia="Times New Roman"/>
+                <w:color w:val="auto"/>
+                <w:szCs w:val="24"/>
+              </w:rPr>
+              <w:t>Tipo de dato</w:t>
+            </w:r>
+          </w:p>
+        </w:tc>
+        <w:tc>
+          <w:tcPr>
+            <w:tcW w:w="0" w:type="auto"/>
+            <w:hideMark/>
+          </w:tcPr>
+          <w:p>
+            <w:pPr>
+              <w:spacing w:after="0" w:line="240" w:lineRule="auto"/>
+              <w:ind w:left="0" w:firstLine="0"/>
+              <w:jc w:val="center"/>
+              <w:cnfStyle w:val="100000000000" w:firstRow="1" w:lastRow="0" w:firstColumn="0" w:lastColumn="0" w:oddVBand="0" w:evenVBand="0" w:oddHBand="0" w:evenHBand="0" w:firstRowFirstColumn="0" w:firstRowLastColumn="0" w:lastRowFirstColumn="0" w:lastRowLastColumn="0"/>
+              <w:rPr>
+                <w:rFonts w:eastAsia="Times New Roman"/>
+                <w:color w:val="auto"/>
+                <w:szCs w:val="24"/>
+              </w:rPr>
+            </w:pPr>
+            <w:r>
+              <w:rPr>
+                <w:rFonts w:eastAsia="Times New Roman"/>
+                <w:color w:val="auto"/>
+                <w:szCs w:val="24"/>
+              </w:rPr>
+              <w:t>Descripción</w:t>
+            </w:r>
+          </w:p>
+        </w:tc>
+        <w:tc>
+          <w:tcPr>
+            <w:tcW w:w="2020" w:type="dxa"/>
+            <w:hideMark/>
+          </w:tcPr>
+          <w:p>
+            <w:pPr>
+              <w:spacing w:after="0" w:line="240" w:lineRule="auto"/>
+              <w:ind w:left="0" w:firstLine="0"/>
+              <w:jc w:val="center"/>
+              <w:cnfStyle w:val="100000000000" w:firstRow="1" w:lastRow="0" w:firstColumn="0" w:lastColumn="0" w:oddVBand="0" w:evenVBand="0" w:oddHBand="0" w:evenHBand="0" w:firstRowFirstColumn="0" w:firstRowLastColumn="0" w:lastRowFirstColumn="0" w:lastRowLastColumn="0"/>
+              <w:rPr>
+                <w:rFonts w:eastAsia="Times New Roman"/>
+                <w:color w:val="auto"/>
+                <w:szCs w:val="24"/>
+              </w:rPr>
+            </w:pPr>
+            <w:r>
+              <w:rPr>
+                <w:rFonts w:eastAsia="Times New Roman"/>
+                <w:color w:val="auto"/>
+                <w:szCs w:val="24"/>
+              </w:rPr>
+              <w:t>Clasificación</w:t>
+            </w:r>
+          </w:p>
+        </w:tc>
+      </w:tr>
+      <w:tr>
+        <w:trPr>
+          <w:cnfStyle w:val="000000100000" w:firstRow="0" w:lastRow="0" w:firstColumn="0" w:lastColumn="0" w:oddVBand="0" w:evenVBand="0" w:oddHBand="1" w:evenHBand="0" w:firstRowFirstColumn="0" w:firstRowLastColumn="0" w:lastRowFirstColumn="0" w:lastRowLastColumn="0"/>
+        </w:trPr>
+        <w:tc>
+          <w:tcPr>
+            <w:cnfStyle w:val="001000000000" w:firstRow="0" w:lastRow="0" w:firstColumn="1" w:lastColumn="0" w:oddVBand="0" w:evenVBand="0" w:oddHBand="0" w:evenHBand="0" w:firstRowFirstColumn="0" w:firstRowLastColumn="0" w:lastRowFirstColumn="0" w:lastRowLastColumn="0"/>
+            <w:tcW w:w="3216" w:type="dxa"/>
+            <w:hideMark/>
+          </w:tcPr>
+          <w:p>
+            <w:pPr>
+              <w:spacing w:after="0" w:line="240" w:lineRule="auto"/>
+              <w:ind w:left="0" w:firstLine="0"/>
+              <w:rPr>
+                <w:rFonts w:eastAsia="Times New Roman"/>
+                <w:color w:val="auto"/>
+                <w:szCs w:val="24"/>
+              </w:rPr>
+            </w:pPr>
+            <w:proofErr w:type="spellStart"/>
+            <w:r>
+              <w:rPr>
+                <w:rFonts w:eastAsia="Times New Roman"/>
+                <w:color w:val="auto"/>
+                <w:szCs w:val="24"/>
+              </w:rPr>
+              <w:t>oxigeno_disponible</w:t>
+            </w:r>
+            <w:proofErr w:type="spellEnd"/>
+          </w:p>
+        </w:tc>
+        <w:tc>
+          <w:tcPr>
+            <w:tcW w:w="0" w:type="auto"/>
+            <w:hideMark/>
+          </w:tcPr>
+          <w:p>
+            <w:pPr>
+              <w:spacing w:after="0" w:line="240" w:lineRule="auto"/>
+              <w:ind w:left="0" w:firstLine="0"/>
+              <w:cnfStyle w:val="000000100000" w:firstRow="0" w:lastRow="0" w:firstColumn="0" w:lastColumn="0" w:oddVBand="0" w:evenVBand="0" w:oddHBand="1" w:evenHBand="0" w:firstRowFirstColumn="0" w:firstRowLastColumn="0" w:lastRowFirstColumn="0" w:lastRowLastColumn="0"/>
+              <w:rPr>
+                <w:rFonts w:eastAsia="Times New Roman"/>
+                <w:color w:val="auto"/>
+                <w:szCs w:val="24"/>
+              </w:rPr>
+            </w:pPr>
+            <w:proofErr w:type="spellStart"/>
+            <w:r>
+              <w:rPr>
+                <w:rFonts w:eastAsia="Times New Roman"/>
+                <w:color w:val="auto"/>
+                <w:szCs w:val="24"/>
+              </w:rPr>
+              <w:t>int</w:t>
+            </w:r>
+            <w:proofErr w:type="spellEnd"/>
+          </w:p>
+        </w:tc>
+        <w:tc>
+          <w:tcPr>
+            <w:tcW w:w="0" w:type="auto"/>
+            <w:hideMark/>
+          </w:tcPr>
+          <w:p>
+            <w:pPr>
+              <w:spacing w:after="0" w:line="240" w:lineRule="auto"/>
+              <w:ind w:left="0" w:firstLine="0"/>
+              <w:cnfStyle w:val="000000100000" w:firstRow="0" w:lastRow="0" w:firstColumn="0" w:lastColumn="0" w:oddVBand="0" w:evenVBand="0" w:oddHBand="1" w:evenHBand="0" w:firstRowFirstColumn="0" w:firstRowLastColumn="0" w:lastRowFirstColumn="0" w:lastRowLastColumn="0"/>
+              <w:rPr>
+                <w:rFonts w:eastAsia="Times New Roman"/>
+                <w:color w:val="auto"/>
+                <w:szCs w:val="24"/>
+              </w:rPr>
+            </w:pPr>
+            <w:r>
+              <w:rPr>
+                <w:rFonts w:eastAsia="Times New Roman"/>
+                <w:color w:val="auto"/>
+                <w:szCs w:val="24"/>
+              </w:rPr>
+              <w:t>Oxígeno con que cuenta la nave</w:t>
+            </w:r>
+          </w:p>
+        </w:tc>
+        <w:tc>
+          <w:tcPr>
+            <w:tcW w:w="2020" w:type="dxa"/>
+            <w:hideMark/>
+          </w:tcPr>
+          <w:p>
+            <w:pPr>
+              <w:spacing w:after="0" w:line="240" w:lineRule="auto"/>
+              <w:ind w:left="0" w:firstLine="0"/>
+              <w:cnfStyle w:val="000000100000" w:firstRow="0" w:lastRow="0" w:firstColumn="0" w:lastColumn="0" w:oddVBand="0" w:evenVBand="0" w:oddHBand="1" w:evenHBand="0" w:firstRowFirstColumn="0" w:firstRowLastColumn="0" w:lastRowFirstColumn="0" w:lastRowLastColumn="0"/>
+              <w:rPr>
+                <w:rFonts w:eastAsia="Times New Roman"/>
+                <w:color w:val="auto"/>
+                <w:szCs w:val="24"/>
+              </w:rPr>
+            </w:pPr>
+            <w:r>
+              <w:rPr>
+                <w:rFonts w:eastAsia="Times New Roman"/>
+                <w:color w:val="auto"/>
+                <w:szCs w:val="24"/>
+              </w:rPr>
+              <w:t>Entrada</w:t>
+            </w:r>
+          </w:p>
+        </w:tc>
+      </w:tr>
+      <w:tr>
+        <w:tc>
+          <w:tcPr>
+            <w:cnfStyle w:val="001000000000" w:firstRow="0" w:lastRow="0" w:firstColumn="1" w:lastColumn="0" w:oddVBand="0" w:evenVBand="0" w:oddHBand="0" w:evenHBand="0" w:firstRowFirstColumn="0" w:firstRowLastColumn="0" w:lastRowFirstColumn="0" w:lastRowLastColumn="0"/>
+            <w:tcW w:w="3216" w:type="dxa"/>
+            <w:hideMark/>
+          </w:tcPr>
+          <w:p>
+            <w:pPr>
+              <w:spacing w:after="0" w:line="240" w:lineRule="auto"/>
+              <w:ind w:left="0" w:firstLine="0"/>
+              <w:rPr>
+                <w:rFonts w:eastAsia="Times New Roman"/>
+                <w:color w:val="auto"/>
+                <w:szCs w:val="24"/>
+              </w:rPr>
+            </w:pPr>
+            <w:proofErr w:type="spellStart"/>
+            <w:r>
+              <w:rPr>
+                <w:rFonts w:eastAsia="Times New Roman"/>
+                <w:color w:val="auto"/>
+                <w:szCs w:val="24"/>
+              </w:rPr>
+              <w:t>oxigeno_requerido</w:t>
+            </w:r>
+            <w:proofErr w:type="spellEnd"/>
+          </w:p>
+        </w:tc>
+        <w:tc>
+          <w:tcPr>
+            <w:tcW w:w="0" w:type="auto"/>
+            <w:hideMark/>
+          </w:tcPr>
+          <w:p>
+            <w:pPr>
+              <w:spacing w:after="0" w:line="240" w:lineRule="auto"/>
+              <w:ind w:left="0" w:firstLine="0"/>
+              <w:cnfStyle w:val="000000000000" w:firstRow="0" w:lastRow="0" w:firstColumn="0" w:lastColumn="0" w:oddVBand="0" w:evenVBand="0" w:oddHBand="0" w:evenHBand="0" w:firstRowFirstColumn="0" w:firstRowLastColumn="0" w:lastRowFirstColumn="0" w:lastRowLastColumn="0"/>
+              <w:rPr>
+                <w:rFonts w:eastAsia="Times New Roman"/>
+                <w:color w:val="auto"/>
+                <w:szCs w:val="24"/>
+              </w:rPr>
+            </w:pPr>
+            <w:proofErr w:type="spellStart"/>
+            <w:r>
+              <w:rPr>
+                <w:rFonts w:eastAsia="Times New Roman"/>
+                <w:color w:val="auto"/>
+                <w:szCs w:val="24"/>
+              </w:rPr>
+              <w:t>int</w:t>
+            </w:r>
+            <w:proofErr w:type="spellEnd"/>
+          </w:p>
+        </w:tc>
+        <w:tc>
+          <w:tcPr>
+            <w:tcW w:w="0" w:type="auto"/>
+            <w:hideMark/>
+          </w:tcPr>
+          <w:p>
+            <w:pPr>
+              <w:spacing w:after="0" w:line="240" w:lineRule="auto"/>
+              <w:ind w:left="0" w:firstLine="0"/>
+              <w:cnfStyle w:val="000000000000" w:firstRow="0" w:lastRow="0" w:firstColumn="0" w:lastColumn="0" w:oddVBand="0" w:evenVBand="0" w:oddHBand="0" w:evenHBand="0" w:firstRowFirstColumn="0" w:firstRowLastColumn="0" w:lastRowFirstColumn="0" w:lastRowLastColumn="0"/>
+              <w:rPr>
+                <w:rFonts w:eastAsia="Times New Roman"/>
+                <w:color w:val="auto"/>
+                <w:szCs w:val="24"/>
+              </w:rPr>
+            </w:pPr>
+            <w:r>
+              <w:rPr>
+                <w:rFonts w:eastAsia="Times New Roman"/>
+                <w:color w:val="auto"/>
+                <w:szCs w:val="24"/>
+              </w:rPr>
+              <w:t>Oxígeno necesario para la tripulación</w:t>
+            </w:r>
+          </w:p>
+        </w:tc>
+        <w:tc>
+          <w:tcPr>
+            <w:tcW w:w="2020" w:type="dxa"/>
+            <w:hideMark/>
+          </w:tcPr>
+          <w:p>
+            <w:pPr>
+              <w:spacing w:after="0" w:line="240" w:lineRule="auto"/>
+              <w:ind w:left="0" w:firstLine="0"/>
+              <w:cnfStyle w:val="000000000000" w:firstRow="0" w:lastRow="0" w:firstColumn="0" w:lastColumn="0" w:oddVBand="0" w:evenVBand="0" w:oddHBand="0" w:evenHBand="0" w:firstRowFirstColumn="0" w:firstRowLastColumn="0" w:lastRowFirstColumn="0" w:lastRowLastColumn="0"/>
+              <w:rPr>
+                <w:rFonts w:eastAsia="Times New Roman"/>
+                <w:color w:val="auto"/>
+                <w:szCs w:val="24"/>
+              </w:rPr>
+            </w:pPr>
+            <w:r>
+              <w:rPr>
+                <w:rFonts w:eastAsia="Times New Roman"/>
+                <w:color w:val="auto"/>
+                <w:szCs w:val="24"/>
+              </w:rPr>
+              <w:t>Entrada</w:t>
+            </w:r>
+          </w:p>
+        </w:tc>
+      </w:tr>
+      <w:tr>
+        <w:trPr>
+          <w:cnfStyle w:val="000000100000" w:firstRow="0" w:lastRow="0" w:firstColumn="0" w:lastColumn="0" w:oddVBand="0" w:evenVBand="0" w:oddHBand="1" w:evenHBand="0" w:firstRowFirstColumn="0" w:firstRowLastColumn="0" w:lastRowFirstColumn="0" w:lastRowLastColumn="0"/>
+        </w:trPr>
+        <w:tc>
+          <w:tcPr>
+            <w:cnfStyle w:val="001000000000" w:firstRow="0" w:lastRow="0" w:firstColumn="1" w:lastColumn="0" w:oddVBand="0" w:evenVBand="0" w:oddHBand="0" w:evenHBand="0" w:firstRowFirstColumn="0" w:firstRowLastColumn="0" w:lastRowFirstColumn="0" w:lastRowLastColumn="0"/>
+            <w:tcW w:w="3216" w:type="dxa"/>
+            <w:hideMark/>
+          </w:tcPr>
+          <w:p>
+            <w:pPr>
+              <w:spacing w:after="0" w:line="240" w:lineRule="auto"/>
+              <w:ind w:left="0" w:firstLine="0"/>
+              <w:rPr>
+                <w:rFonts w:eastAsia="Times New Roman"/>
+                <w:color w:val="auto"/>
+                <w:szCs w:val="24"/>
+              </w:rPr>
+            </w:pPr>
+            <w:proofErr w:type="spellStart"/>
+            <w:r>
+              <w:rPr>
+                <w:rFonts w:eastAsia="Times New Roman"/>
+                <w:color w:val="auto"/>
+                <w:szCs w:val="24"/>
+              </w:rPr>
+              <w:t>provisiones_disponibles</w:t>
+            </w:r>
+            <w:proofErr w:type="spellEnd"/>
+          </w:p>
+        </w:tc>
+        <w:tc>
+          <w:tcPr>
+            <w:tcW w:w="0" w:type="auto"/>
+            <w:hideMark/>
+          </w:tcPr>
+          <w:p>
+            <w:pPr>
+              <w:spacing w:after="0" w:line="240" w:lineRule="auto"/>
+              <w:ind w:left="0" w:firstLine="0"/>
+              <w:cnfStyle w:val="000000100000" w:firstRow="0" w:lastRow="0" w:firstColumn="0" w:lastColumn="0" w:oddVBand="0" w:evenVBand="0" w:oddHBand="1" w:evenHBand="0" w:firstRowFirstColumn="0" w:firstRowLastColumn="0" w:lastRowFirstColumn="0" w:lastRowLastColumn="0"/>
+              <w:rPr>
+                <w:rFonts w:eastAsia="Times New Roman"/>
+                <w:color w:val="auto"/>
+                <w:szCs w:val="24"/>
+              </w:rPr>
+            </w:pPr>
+            <w:proofErr w:type="spellStart"/>
+            <w:r>
+              <w:rPr>
+                <w:rFonts w:eastAsia="Times New Roman"/>
+                <w:color w:val="auto"/>
+                <w:szCs w:val="24"/>
+              </w:rPr>
+              <w:t>int</w:t>
+            </w:r>
+            <w:proofErr w:type="spellEnd"/>
+          </w:p>
+        </w:tc>
+        <w:tc>
+          <w:tcPr>
+            <w:tcW w:w="0" w:type="auto"/>
+            <w:hideMark/>
+          </w:tcPr>
+          <w:p>
+            <w:pPr>
+              <w:spacing w:after="0" w:line="240" w:lineRule="auto"/>
+              <w:ind w:left="0" w:firstLine="0"/>
+              <w:cnfStyle w:val="000000100000" w:firstRow="0" w:lastRow="0" w:firstColumn="0" w:lastColumn="0" w:oddVBand="0" w:evenVBand="0" w:oddHBand="1" w:evenHBand="0" w:firstRowFirstColumn="0" w:firstRowLastColumn="0" w:lastRowFirstColumn="0" w:lastRowLastColumn="0"/>
+              <w:rPr>
+                <w:rFonts w:eastAsia="Times New Roman"/>
+                <w:color w:val="auto"/>
+                <w:szCs w:val="24"/>
+              </w:rPr>
+            </w:pPr>
+            <w:r>
+              <w:rPr>
+                <w:rFonts w:eastAsia="Times New Roman"/>
+                <w:color w:val="auto"/>
+                <w:szCs w:val="24"/>
+              </w:rPr>
+              <w:t>Provisiones con que cuenta la nave</w:t>
+            </w:r>
+          </w:p>
+        </w:tc>
+        <w:tc>
+          <w:tcPr>
+            <w:tcW w:w="2020" w:type="dxa"/>
+            <w:hideMark/>
+          </w:tcPr>
+          <w:p>
+            <w:pPr>
+              <w:spacing w:after="0" w:line="240" w:lineRule="auto"/>
+              <w:ind w:left="0" w:firstLine="0"/>
+              <w:cnfStyle w:val="000000100000" w:firstRow="0" w:lastRow="0" w:firstColumn="0" w:lastColumn="0" w:oddVBand="0" w:evenVBand="0" w:oddHBand="1" w:evenHBand="0" w:firstRowFirstColumn="0" w:firstRowLastColumn="0" w:lastRowFirstColumn="0" w:lastRowLastColumn="0"/>
+              <w:rPr>
+                <w:rFonts w:eastAsia="Times New Roman"/>
+                <w:color w:val="auto"/>
+                <w:szCs w:val="24"/>
+              </w:rPr>
+            </w:pPr>
+            <w:r>
+              <w:rPr>
+                <w:rFonts w:eastAsia="Times New Roman"/>
+                <w:color w:val="auto"/>
+                <w:szCs w:val="24"/>
+              </w:rPr>
+              <w:t>Entrada</w:t>
+            </w:r>
+          </w:p>
+        </w:tc>
+      </w:tr>
+      <w:tr>
+        <w:tc>
+          <w:tcPr>
+            <w:cnfStyle w:val="001000000000" w:firstRow="0" w:lastRow="0" w:firstColumn="1" w:lastColumn="0" w:oddVBand="0" w:evenVBand="0" w:oddHBand="0" w:evenHBand="0" w:firstRowFirstColumn="0" w:firstRowLastColumn="0" w:lastRowFirstColumn="0" w:lastRowLastColumn="0"/>
+            <w:tcW w:w="3216" w:type="dxa"/>
+            <w:hideMark/>
+          </w:tcPr>
+          <w:p>
+            <w:pPr>
+              <w:spacing w:after="0" w:line="240" w:lineRule="auto"/>
+              <w:ind w:left="0" w:firstLine="0"/>
+              <w:rPr>
+                <w:rFonts w:eastAsia="Times New Roman"/>
+                <w:color w:val="auto"/>
+                <w:szCs w:val="24"/>
+              </w:rPr>
+            </w:pPr>
+            <w:proofErr w:type="spellStart"/>
+            <w:r>
+              <w:rPr>
+                <w:rFonts w:eastAsia="Times New Roman"/>
+                <w:color w:val="auto"/>
+                <w:szCs w:val="24"/>
+              </w:rPr>
+              <w:t>provisiones_requeridas</w:t>
+            </w:r>
+            <w:proofErr w:type="spellEnd"/>
+          </w:p>
+        </w:tc>
+        <w:tc>
+          <w:tcPr>
+            <w:tcW w:w="0" w:type="auto"/>
+            <w:hideMark/>
+          </w:tcPr>
+          <w:p>
+            <w:pPr>
+              <w:spacing w:after="0" w:line="240" w:lineRule="auto"/>
+              <w:ind w:left="0" w:firstLine="0"/>
+              <w:cnfStyle w:val="000000000000" w:firstRow="0" w:lastRow="0" w:firstColumn="0" w:lastColumn="0" w:oddVBand="0" w:evenVBand="0" w:oddHBand="0" w:evenHBand="0" w:firstRowFirstColumn="0" w:firstRowLastColumn="0" w:lastRowFirstColumn="0" w:lastRowLastColumn="0"/>
+              <w:rPr>
+                <w:rFonts w:eastAsia="Times New Roman"/>
+                <w:color w:val="auto"/>
+                <w:szCs w:val="24"/>
+              </w:rPr>
+            </w:pPr>
+            <w:proofErr w:type="spellStart"/>
+            <w:r>
+              <w:rPr>
+                <w:rFonts w:eastAsia="Times New Roman"/>
+                <w:color w:val="auto"/>
+                <w:szCs w:val="24"/>
+              </w:rPr>
+              <w:t>int</w:t>
+            </w:r>
+            <w:proofErr w:type="spellEnd"/>
+          </w:p>
+        </w:tc>
+        <w:tc>
+          <w:tcPr>
+            <w:tcW w:w="0" w:type="auto"/>
+            <w:hideMark/>
+          </w:tcPr>
+          <w:p>
+            <w:pPr>
+              <w:spacing w:after="0" w:line="240" w:lineRule="auto"/>
+              <w:ind w:left="0" w:firstLine="0"/>
+              <w:cnfStyle w:val="000000000000" w:firstRow="0" w:lastRow="0" w:firstColumn="0" w:lastColumn="0" w:oddVBand="0" w:evenVBand="0" w:oddHBand="0" w:evenHBand="0" w:firstRowFirstColumn="0" w:firstRowLastColumn="0" w:lastRowFirstColumn="0" w:lastRowLastColumn="0"/>
+              <w:rPr>
+                <w:rFonts w:eastAsia="Times New Roman"/>
+                <w:color w:val="auto"/>
+                <w:szCs w:val="24"/>
+              </w:rPr>
+            </w:pPr>
+            <w:r>
+              <w:rPr>
+                <w:rFonts w:eastAsia="Times New Roman"/>
+                <w:color w:val="auto"/>
+                <w:szCs w:val="24"/>
+              </w:rPr>
+              <w:t>Provisiones necesarias para la tripulación</w:t>
+            </w:r>
+          </w:p>
+        </w:tc>
+        <w:tc>
+          <w:tcPr>
+            <w:tcW w:w="2020" w:type="dxa"/>
+            <w:hideMark/>
+          </w:tcPr>
+          <w:p>
+            <w:pPr>
+              <w:spacing w:after="0" w:line="240" w:lineRule="auto"/>
+              <w:ind w:left="0" w:firstLine="0"/>
+              <w:cnfStyle w:val="000000000000" w:firstRow="0" w:lastRow="0" w:firstColumn="0" w:lastColumn="0" w:oddVBand="0" w:evenVBand="0" w:oddHBand="0" w:evenHBand="0" w:firstRowFirstColumn="0" w:firstRowLastColumn="0" w:lastRowFirstColumn="0" w:lastRowLastColumn="0"/>
+              <w:rPr>
+                <w:rFonts w:eastAsia="Times New Roman"/>
+                <w:color w:val="auto"/>
+                <w:szCs w:val="24"/>
+              </w:rPr>
+            </w:pPr>
+            <w:r>
+              <w:rPr>
+                <w:rFonts w:eastAsia="Times New Roman"/>
+                <w:color w:val="auto"/>
+                <w:szCs w:val="24"/>
+              </w:rPr>
+              <w:t>Entrada</w:t>
+            </w:r>
+          </w:p>
+        </w:tc>
+      </w:tr>
+    </w:tbl>
+    <w:p>
+      <w:pPr>
+        <w:rPr>
+          <w:b/>
+          <w:bCs/>
+          <w:sz w:val="22"/>
+        </w:rPr>
+      </w:pPr>
+      <w:r>
+        <w:rPr>
+          <w:noProof/>
+          <w:sz w:val="22"/>
+        </w:rPr>
+        <w:drawing>
+          <wp:anchor distT="0" distB="0" distL="114300" distR="114300" simplePos="0" relativeHeight="251667456" behindDoc="0" locked="0" layoutInCell="1" allowOverlap="1" wp14:anchorId="6799606A" wp14:editId="24A4C7E8">
+            <wp:simplePos x="0" y="0"/>
+            <wp:positionH relativeFrom="margin">
+              <wp:posOffset>-190500</wp:posOffset>
+            </wp:positionH>
+            <wp:positionV relativeFrom="paragraph">
+              <wp:posOffset>385445</wp:posOffset>
+            </wp:positionV>
+            <wp:extent cx="6105525" cy="4171950"/>
+            <wp:effectExtent l="0" t="0" r="0" b="0"/>
+            <wp:wrapSquare wrapText="bothSides"/>
+            <wp:docPr id="16" name="Imagen 16"/>
+            <wp:cNvGraphicFramePr>
+              <a:graphicFrameLocks xmlns:a="http://schemas.openxmlformats.org/drawingml/2006/main" noChangeAspect="1"/>
+            </wp:cNvGraphicFramePr>
+            <a:graphic xmlns:a="http://schemas.openxmlformats.org/drawingml/2006/main">
+              <a:graphicData uri="http://schemas.openxmlformats.org/drawingml/2006/picture">
+                <pic:pic xmlns:pic="http://schemas.openxmlformats.org/drawingml/2006/picture">
+                  <pic:nvPicPr>
+                    <pic:cNvPr id="0" name="Picture 7"/>
+                    <pic:cNvPicPr>
+                      <a:picLocks noChangeAspect="1" noChangeArrowheads="1"/>
+                    </pic:cNvPicPr>
+                  </pic:nvPicPr>
+                  <pic:blipFill>
+                    <a:blip r:embed="rId18" cstate="print">
+                      <a:extLst>
+                        <a:ext uri="{28A0092B-C50C-407E-A947-70E740481C1C}">
+                          <a14:useLocalDpi xmlns:a14="http://schemas.microsoft.com/office/drawing/2010/main" val="0"/>
+                        </a:ext>
+                      </a:extLst>
+                    </a:blip>
+                    <a:srcRect/>
+                    <a:stretch>
+                      <a:fillRect/>
+                    </a:stretch>
+                  </pic:blipFill>
+                  <pic:spPr bwMode="auto">
+                    <a:xfrm>
+                      <a:off x="0" y="0"/>
+                      <a:ext cx="6105525" cy="4171950"/>
+                    </a:xfrm>
+                    <a:prstGeom prst="rect">
+                      <a:avLst/>
+                    </a:prstGeom>
+                    <a:noFill/>
+                    <a:ln>
+                      <a:noFill/>
+                    </a:ln>
+                  </pic:spPr>
+                </pic:pic>
+              </a:graphicData>
+            </a:graphic>
+            <wp14:sizeRelH relativeFrom="margin">
+              <wp14:pctWidth>0</wp14:pctWidth>
+            </wp14:sizeRelH>
+            <wp14:sizeRelV relativeFrom="margin">
+              <wp14:pctHeight>0</wp14:pctHeight>
+            </wp14:sizeRelV>
+          </wp:anchor>
+        </w:drawing>
+      </w:r>
+      <w:r>
+        <w:rPr>
+          <w:b/>
+          <w:bCs/>
+          <w:sz w:val="22"/>
+        </w:rPr>
+        <w:t xml:space="preserve">Diagrama de flujo </w:t>
+      </w:r>
+    </w:p>
+    <w:p>
+      <w:pPr>
+        <w:rPr>
+          <w:sz w:val="22"/>
+        </w:rPr>
+      </w:pPr>
+      <w:r>
+        <w:rPr>
+          <w:sz w:val="22"/>
+        </w:rPr>
+        <w:lastRenderedPageBreak/>
+        <w:t>Código</w:t>
+      </w:r>
+    </w:p>
+    <w:p>
+      <w:pPr>
+        <w:shd w:val="clear" w:color="auto" w:fill="121314"/>
+        <w:spacing w:after="0" w:line="285" w:lineRule="atLeast"/>
+        <w:ind w:left="0" w:firstLine="0"/>
+        <w:rPr>
+          <w:rFonts w:ascii="Consolas" w:eastAsia="Times New Roman" w:hAnsi="Consolas" w:cs="Times New Roman"/>
+          <w:color w:val="BBBEBF"/>
+          <w:sz w:val="21"/>
+          <w:szCs w:val="21"/>
+        </w:rPr>
+      </w:pPr>
+      <w:r>
+        <w:rPr>
+          <w:rFonts w:ascii="Consolas" w:eastAsia="Times New Roman" w:hAnsi="Consolas" w:cs="Times New Roman"/>
+          <w:color w:val="8B949E"/>
+          <w:sz w:val="21"/>
+          <w:szCs w:val="21"/>
+        </w:rPr>
+        <w:t># ============================================================</w:t>
+      </w:r>
+    </w:p>
+    <w:p>
+      <w:pPr>
+        <w:shd w:val="clear" w:color="auto" w:fill="121314"/>
+        <w:spacing w:after="0" w:line="285" w:lineRule="atLeast"/>
+        <w:ind w:left="0" w:firstLine="0"/>
+        <w:rPr>
+          <w:rFonts w:ascii="Consolas" w:eastAsia="Times New Roman" w:hAnsi="Consolas" w:cs="Times New Roman"/>
+          <w:color w:val="BBBEBF"/>
+          <w:sz w:val="21"/>
+          <w:szCs w:val="21"/>
+        </w:rPr>
+      </w:pPr>
+      <w:r>
+        <w:rPr>
+          <w:rFonts w:ascii="Consolas" w:eastAsia="Times New Roman" w:hAnsi="Consolas" w:cs="Times New Roman"/>
+          <w:color w:val="8B949E"/>
+          <w:sz w:val="21"/>
+          <w:szCs w:val="21"/>
+        </w:rPr>
+        <w:t># Archivo: ejercicio3_soporte_tripulacion.py</w:t>
+      </w:r>
+    </w:p>
+    <w:p>
+      <w:pPr>
+        <w:shd w:val="clear" w:color="auto" w:fill="121314"/>
+        <w:spacing w:after="0" w:line="285" w:lineRule="atLeast"/>
+        <w:ind w:left="0" w:firstLine="0"/>
+        <w:rPr>
+          <w:rFonts w:ascii="Consolas" w:eastAsia="Times New Roman" w:hAnsi="Consolas" w:cs="Times New Roman"/>
+          <w:color w:val="BBBEBF"/>
+          <w:sz w:val="21"/>
+          <w:szCs w:val="21"/>
+        </w:rPr>
+      </w:pPr>
+      <w:r>
+        <w:rPr>
+          <w:rFonts w:ascii="Consolas" w:eastAsia="Times New Roman" w:hAnsi="Consolas" w:cs="Times New Roman"/>
+          <w:color w:val="8B949E"/>
+          <w:sz w:val="21"/>
+          <w:szCs w:val="21"/>
+        </w:rPr>
+        <w:t># Curso: SOFT-01 Principios de Programación 1 - Sección SCP0</w:t>
+      </w:r>
+    </w:p>
+    <w:p>
+      <w:pPr>
+        <w:shd w:val="clear" w:color="auto" w:fill="121314"/>
+        <w:spacing w:after="0" w:line="285" w:lineRule="atLeast"/>
+        <w:ind w:left="0" w:firstLine="0"/>
+        <w:rPr>
+          <w:rFonts w:ascii="Consolas" w:eastAsia="Times New Roman" w:hAnsi="Consolas" w:cs="Times New Roman"/>
+          <w:color w:val="BBBEBF"/>
+          <w:sz w:val="21"/>
+          <w:szCs w:val="21"/>
+        </w:rPr>
+      </w:pPr>
+      <w:r>
+        <w:rPr>
+          <w:rFonts w:ascii="Consolas" w:eastAsia="Times New Roman" w:hAnsi="Consolas" w:cs="Times New Roman"/>
+          <w:color w:val="8B949E"/>
+          <w:sz w:val="21"/>
+          <w:szCs w:val="21"/>
+        </w:rPr>
+        <w:t xml:space="preserve"># Integrantes: Mariangel </w:t>
+      </w:r>
+      <w:proofErr w:type="spellStart"/>
+      <w:r>
+        <w:rPr>
+          <w:rFonts w:ascii="Consolas" w:eastAsia="Times New Roman" w:hAnsi="Consolas" w:cs="Times New Roman"/>
+          <w:color w:val="8B949E"/>
+          <w:sz w:val="21"/>
+          <w:szCs w:val="21"/>
+        </w:rPr>
+        <w:t>Marin</w:t>
+      </w:r>
+      <w:proofErr w:type="spellEnd"/>
+      <w:r>
+        <w:rPr>
+          <w:rFonts w:ascii="Consolas" w:eastAsia="Times New Roman" w:hAnsi="Consolas" w:cs="Times New Roman"/>
+          <w:color w:val="8B949E"/>
+          <w:sz w:val="21"/>
+          <w:szCs w:val="21"/>
+        </w:rPr>
+        <w:t xml:space="preserve"> Chinchilla</w:t>
+      </w:r>
+    </w:p>
+    <w:p>
+      <w:pPr>
+        <w:shd w:val="clear" w:color="auto" w:fill="121314"/>
+        <w:spacing w:after="0" w:line="285" w:lineRule="atLeast"/>
+        <w:ind w:left="0" w:firstLine="0"/>
+        <w:rPr>
+          <w:rFonts w:ascii="Consolas" w:eastAsia="Times New Roman" w:hAnsi="Consolas" w:cs="Times New Roman"/>
+          <w:color w:val="BBBEBF"/>
+          <w:sz w:val="21"/>
+          <w:szCs w:val="21"/>
+        </w:rPr>
+      </w:pPr>
+      <w:r>
+        <w:rPr>
+          <w:rFonts w:ascii="Consolas" w:eastAsia="Times New Roman" w:hAnsi="Consolas" w:cs="Times New Roman"/>
+          <w:color w:val="8B949E"/>
+          <w:sz w:val="21"/>
+          <w:szCs w:val="21"/>
+        </w:rPr>
+        <w:t># Fecha: 12/10/2026   Versión: 1.0</w:t>
+      </w:r>
+    </w:p>
+    <w:p>
+      <w:pPr>
+        <w:shd w:val="clear" w:color="auto" w:fill="121314"/>
+        <w:spacing w:after="0" w:line="285" w:lineRule="atLeast"/>
+        <w:ind w:left="0" w:firstLine="0"/>
+        <w:rPr>
+          <w:rFonts w:ascii="Consolas" w:eastAsia="Times New Roman" w:hAnsi="Consolas" w:cs="Times New Roman"/>
+          <w:color w:val="BBBEBF"/>
+          <w:sz w:val="21"/>
+          <w:szCs w:val="21"/>
+        </w:rPr>
+      </w:pPr>
+      <w:r>
+        <w:rPr>
+          <w:rFonts w:ascii="Consolas" w:eastAsia="Times New Roman" w:hAnsi="Consolas" w:cs="Times New Roman"/>
+          <w:color w:val="8B949E"/>
+          <w:sz w:val="21"/>
+          <w:szCs w:val="21"/>
+        </w:rPr>
+        <w:t># Descripción: Verifica si la nave tiene oxígeno y provisiones</w:t>
+      </w:r>
+    </w:p>
+    <w:p>
+      <w:pPr>
+        <w:shd w:val="clear" w:color="auto" w:fill="121314"/>
+        <w:spacing w:after="0" w:line="285" w:lineRule="atLeast"/>
+        <w:ind w:left="0" w:firstLine="0"/>
+        <w:rPr>
+          <w:rFonts w:ascii="Consolas" w:eastAsia="Times New Roman" w:hAnsi="Consolas" w:cs="Times New Roman"/>
+          <w:color w:val="BBBEBF"/>
+          <w:sz w:val="21"/>
+          <w:szCs w:val="21"/>
+        </w:rPr>
+      </w:pPr>
+      <w:r>
+        <w:rPr>
+          <w:rFonts w:ascii="Consolas" w:eastAsia="Times New Roman" w:hAnsi="Consolas" w:cs="Times New Roman"/>
+          <w:color w:val="8B949E"/>
+          <w:sz w:val="21"/>
+          <w:szCs w:val="21"/>
+        </w:rPr>
+        <w:t>#              suficientes para mantener a la tripulación.</w:t>
+      </w:r>
+    </w:p>
+    <w:p>
+      <w:pPr>
+        <w:shd w:val="clear" w:color="auto" w:fill="121314"/>
+        <w:spacing w:after="0" w:line="285" w:lineRule="atLeast"/>
+        <w:ind w:left="0" w:firstLine="0"/>
+        <w:rPr>
+          <w:rFonts w:ascii="Consolas" w:eastAsia="Times New Roman" w:hAnsi="Consolas" w:cs="Times New Roman"/>
+          <w:color w:val="BBBEBF"/>
+          <w:sz w:val="21"/>
+          <w:szCs w:val="21"/>
+        </w:rPr>
+      </w:pPr>
+      <w:r>
+        <w:rPr>
+          <w:rFonts w:ascii="Consolas" w:eastAsia="Times New Roman" w:hAnsi="Consolas" w:cs="Times New Roman"/>
+          <w:color w:val="8B949E"/>
+          <w:sz w:val="21"/>
+          <w:szCs w:val="21"/>
+        </w:rPr>
+        <w:t># ============================================================</w:t>
+      </w:r>
+    </w:p>
+    <w:p>
+      <w:pPr>
+        <w:shd w:val="clear" w:color="auto" w:fill="121314"/>
+        <w:spacing w:after="0" w:line="285" w:lineRule="atLeast"/>
+        <w:ind w:left="0" w:firstLine="0"/>
+        <w:rPr>
+          <w:rFonts w:ascii="Consolas" w:eastAsia="Times New Roman" w:hAnsi="Consolas" w:cs="Times New Roman"/>
+          <w:color w:val="BBBEBF"/>
+          <w:sz w:val="21"/>
+          <w:szCs w:val="21"/>
+        </w:rPr>
+      </w:pPr>
+    </w:p>
+    <w:p>
+      <w:pPr>
+        <w:shd w:val="clear" w:color="auto" w:fill="121314"/>
+        <w:spacing w:after="0" w:line="285" w:lineRule="atLeast"/>
+        <w:ind w:left="0" w:firstLine="0"/>
+        <w:rPr>
+          <w:rFonts w:ascii="Consolas" w:eastAsia="Times New Roman" w:hAnsi="Consolas" w:cs="Times New Roman"/>
+          <w:color w:val="BBBEBF"/>
+          <w:sz w:val="21"/>
+          <w:szCs w:val="21"/>
+        </w:rPr>
+      </w:pPr>
+      <w:r>
+        <w:rPr>
+          <w:rFonts w:ascii="Consolas" w:eastAsia="Times New Roman" w:hAnsi="Consolas" w:cs="Times New Roman"/>
+          <w:color w:val="8B949E"/>
+          <w:sz w:val="21"/>
+          <w:szCs w:val="21"/>
+        </w:rPr>
+        <w:t># --- Entrada de datos ---</w:t>
+      </w:r>
+    </w:p>
+    <w:p>
+      <w:pPr>
+        <w:shd w:val="clear" w:color="auto" w:fill="121314"/>
+        <w:spacing w:after="0" w:line="285" w:lineRule="atLeast"/>
+        <w:ind w:left="0" w:firstLine="0"/>
+        <w:rPr>
+          <w:rFonts w:ascii="Consolas" w:eastAsia="Times New Roman" w:hAnsi="Consolas" w:cs="Times New Roman"/>
+          <w:color w:val="BBBEBF"/>
+          <w:sz w:val="21"/>
+          <w:szCs w:val="21"/>
+        </w:rPr>
+      </w:pPr>
+      <w:proofErr w:type="spellStart"/>
+      <w:r>
+        <w:rPr>
+          <w:rFonts w:ascii="Consolas" w:eastAsia="Times New Roman" w:hAnsi="Consolas" w:cs="Times New Roman"/>
+          <w:color w:val="BBBEBF"/>
+          <w:sz w:val="21"/>
+          <w:szCs w:val="21"/>
+        </w:rPr>
+        <w:t>oxigeno_disponible</w:t>
+      </w:r>
+      <w:proofErr w:type="spellEnd"/>
+      <w:r>
+        <w:rPr>
+          <w:rFonts w:ascii="Consolas" w:eastAsia="Times New Roman" w:hAnsi="Consolas" w:cs="Times New Roman"/>
+          <w:color w:val="BBBEBF"/>
+          <w:sz w:val="21"/>
+          <w:szCs w:val="21"/>
+        </w:rPr>
+        <w:t xml:space="preserve"> </w:t>
+      </w:r>
+      <w:r>
+        <w:rPr>
+          <w:rFonts w:ascii="Consolas" w:eastAsia="Times New Roman" w:hAnsi="Consolas" w:cs="Times New Roman"/>
+          <w:color w:val="D4D4D4"/>
+          <w:sz w:val="21"/>
+          <w:szCs w:val="21"/>
+        </w:rPr>
+        <w:t>=</w:t>
+      </w:r>
+      <w:r>
+        <w:rPr>
+          <w:rFonts w:ascii="Consolas" w:eastAsia="Times New Roman" w:hAnsi="Consolas" w:cs="Times New Roman"/>
+          <w:color w:val="BBBEBF"/>
+          <w:sz w:val="21"/>
+          <w:szCs w:val="21"/>
+        </w:rPr>
+        <w:t xml:space="preserve"> </w:t>
+      </w:r>
+      <w:proofErr w:type="spellStart"/>
+      <w:r>
+        <w:rPr>
+          <w:rFonts w:ascii="Consolas" w:eastAsia="Times New Roman" w:hAnsi="Consolas" w:cs="Times New Roman"/>
+          <w:color w:val="4EC9B0"/>
+          <w:sz w:val="21"/>
+          <w:szCs w:val="21"/>
+        </w:rPr>
+        <w:t>int</w:t>
+      </w:r>
+      <w:proofErr w:type="spellEnd"/>
+      <w:r>
+        <w:rPr>
+          <w:rFonts w:ascii="Consolas" w:eastAsia="Times New Roman" w:hAnsi="Consolas" w:cs="Times New Roman"/>
+          <w:color w:val="BBBEBF"/>
+          <w:sz w:val="21"/>
+          <w:szCs w:val="21"/>
+        </w:rPr>
+        <w:t>(</w:t>
+      </w:r>
+      <w:r>
+        <w:rPr>
+          <w:rFonts w:ascii="Consolas" w:eastAsia="Times New Roman" w:hAnsi="Consolas" w:cs="Times New Roman"/>
+          <w:color w:val="DCDCAA"/>
+          <w:sz w:val="21"/>
+          <w:szCs w:val="21"/>
+        </w:rPr>
+        <w:t>input</w:t>
+      </w:r>
+      <w:r>
+        <w:rPr>
+          <w:rFonts w:ascii="Consolas" w:eastAsia="Times New Roman" w:hAnsi="Consolas" w:cs="Times New Roman"/>
+          <w:color w:val="BBBEBF"/>
+          <w:sz w:val="21"/>
+          <w:szCs w:val="21"/>
+        </w:rPr>
+        <w:t>(</w:t>
+      </w:r>
+      <w:r>
+        <w:rPr>
+          <w:rFonts w:ascii="Consolas" w:eastAsia="Times New Roman" w:hAnsi="Consolas" w:cs="Times New Roman"/>
+          <w:color w:val="A5D6FF"/>
+          <w:sz w:val="21"/>
+          <w:szCs w:val="21"/>
+        </w:rPr>
+        <w:t>"Oxígeno disponible: "</w:t>
+      </w:r>
+      <w:r>
+        <w:rPr>
+          <w:rFonts w:ascii="Consolas" w:eastAsia="Times New Roman" w:hAnsi="Consolas" w:cs="Times New Roman"/>
+          <w:color w:val="BBBEBF"/>
+          <w:sz w:val="21"/>
+          <w:szCs w:val="21"/>
+        </w:rPr>
+        <w:t>))</w:t>
+      </w:r>
+    </w:p>
+    <w:p>
+      <w:pPr>
+        <w:shd w:val="clear" w:color="auto" w:fill="121314"/>
+        <w:spacing w:after="0" w:line="285" w:lineRule="atLeast"/>
+        <w:ind w:left="0" w:firstLine="0"/>
+        <w:rPr>
+          <w:rFonts w:ascii="Consolas" w:eastAsia="Times New Roman" w:hAnsi="Consolas" w:cs="Times New Roman"/>
+          <w:color w:val="BBBEBF"/>
+          <w:sz w:val="21"/>
+          <w:szCs w:val="21"/>
+        </w:rPr>
+      </w:pPr>
+      <w:proofErr w:type="spellStart"/>
+      <w:r>
+        <w:rPr>
+          <w:rFonts w:ascii="Consolas" w:eastAsia="Times New Roman" w:hAnsi="Consolas" w:cs="Times New Roman"/>
+          <w:color w:val="BBBEBF"/>
+          <w:sz w:val="21"/>
+          <w:szCs w:val="21"/>
+        </w:rPr>
+        <w:t>oxigeno_requerido</w:t>
+      </w:r>
+      <w:proofErr w:type="spellEnd"/>
+      <w:r>
+        <w:rPr>
+          <w:rFonts w:ascii="Consolas" w:eastAsia="Times New Roman" w:hAnsi="Consolas" w:cs="Times New Roman"/>
+          <w:color w:val="BBBEBF"/>
+          <w:sz w:val="21"/>
+          <w:szCs w:val="21"/>
+        </w:rPr>
+        <w:t xml:space="preserve"> </w:t>
+      </w:r>
+      <w:r>
+        <w:rPr>
+          <w:rFonts w:ascii="Consolas" w:eastAsia="Times New Roman" w:hAnsi="Consolas" w:cs="Times New Roman"/>
+          <w:color w:val="D4D4D4"/>
+          <w:sz w:val="21"/>
+          <w:szCs w:val="21"/>
+        </w:rPr>
+        <w:t>=</w:t>
+      </w:r>
+      <w:r>
+        <w:rPr>
+          <w:rFonts w:ascii="Consolas" w:eastAsia="Times New Roman" w:hAnsi="Consolas" w:cs="Times New Roman"/>
+          <w:color w:val="BBBEBF"/>
+          <w:sz w:val="21"/>
+          <w:szCs w:val="21"/>
+        </w:rPr>
+        <w:t xml:space="preserve"> </w:t>
+      </w:r>
+      <w:proofErr w:type="spellStart"/>
+      <w:r>
+        <w:rPr>
+          <w:rFonts w:ascii="Consolas" w:eastAsia="Times New Roman" w:hAnsi="Consolas" w:cs="Times New Roman"/>
+          <w:color w:val="4EC9B0"/>
+          <w:sz w:val="21"/>
+          <w:szCs w:val="21"/>
+        </w:rPr>
+        <w:t>int</w:t>
+      </w:r>
+      <w:proofErr w:type="spellEnd"/>
+      <w:r>
+        <w:rPr>
+          <w:rFonts w:ascii="Consolas" w:eastAsia="Times New Roman" w:hAnsi="Consolas" w:cs="Times New Roman"/>
+          <w:color w:val="BBBEBF"/>
+          <w:sz w:val="21"/>
+          <w:szCs w:val="21"/>
+        </w:rPr>
+        <w:t>(</w:t>
+      </w:r>
+      <w:r>
+        <w:rPr>
+          <w:rFonts w:ascii="Consolas" w:eastAsia="Times New Roman" w:hAnsi="Consolas" w:cs="Times New Roman"/>
+          <w:color w:val="DCDCAA"/>
+          <w:sz w:val="21"/>
+          <w:szCs w:val="21"/>
+        </w:rPr>
+        <w:t>input</w:t>
+      </w:r>
+      <w:r>
+        <w:rPr>
+          <w:rFonts w:ascii="Consolas" w:eastAsia="Times New Roman" w:hAnsi="Consolas" w:cs="Times New Roman"/>
+          <w:color w:val="BBBEBF"/>
+          <w:sz w:val="21"/>
+          <w:szCs w:val="21"/>
+        </w:rPr>
+        <w:t>(</w:t>
+      </w:r>
+      <w:r>
+        <w:rPr>
+          <w:rFonts w:ascii="Consolas" w:eastAsia="Times New Roman" w:hAnsi="Consolas" w:cs="Times New Roman"/>
+          <w:color w:val="A5D6FF"/>
+          <w:sz w:val="21"/>
+          <w:szCs w:val="21"/>
+        </w:rPr>
+        <w:t>"Oxígeno requerido: "</w:t>
+      </w:r>
+      <w:r>
+        <w:rPr>
+          <w:rFonts w:ascii="Consolas" w:eastAsia="Times New Roman" w:hAnsi="Consolas" w:cs="Times New Roman"/>
+          <w:color w:val="BBBEBF"/>
+          <w:sz w:val="21"/>
+          <w:szCs w:val="21"/>
+        </w:rPr>
+        <w:t>))</w:t>
+      </w:r>
+    </w:p>
+    <w:p>
+      <w:pPr>
+        <w:shd w:val="clear" w:color="auto" w:fill="121314"/>
+        <w:spacing w:after="0" w:line="285" w:lineRule="atLeast"/>
+        <w:ind w:left="0" w:firstLine="0"/>
+        <w:rPr>
+          <w:rFonts w:ascii="Consolas" w:eastAsia="Times New Roman" w:hAnsi="Consolas" w:cs="Times New Roman"/>
+          <w:color w:val="BBBEBF"/>
+          <w:sz w:val="21"/>
+          <w:szCs w:val="21"/>
+        </w:rPr>
+      </w:pPr>
+      <w:proofErr w:type="spellStart"/>
+      <w:r>
+        <w:rPr>
+          <w:rFonts w:ascii="Consolas" w:eastAsia="Times New Roman" w:hAnsi="Consolas" w:cs="Times New Roman"/>
+          <w:color w:val="BBBEBF"/>
+          <w:sz w:val="21"/>
+          <w:szCs w:val="21"/>
+        </w:rPr>
+        <w:t>provisiones_disponibles</w:t>
+      </w:r>
+      <w:proofErr w:type="spellEnd"/>
+      <w:r>
+        <w:rPr>
+          <w:rFonts w:ascii="Consolas" w:eastAsia="Times New Roman" w:hAnsi="Consolas" w:cs="Times New Roman"/>
+          <w:color w:val="BBBEBF"/>
+          <w:sz w:val="21"/>
+          <w:szCs w:val="21"/>
+        </w:rPr>
+        <w:t xml:space="preserve"> </w:t>
+      </w:r>
+      <w:r>
+        <w:rPr>
+          <w:rFonts w:ascii="Consolas" w:eastAsia="Times New Roman" w:hAnsi="Consolas" w:cs="Times New Roman"/>
+          <w:color w:val="D4D4D4"/>
+          <w:sz w:val="21"/>
+          <w:szCs w:val="21"/>
+        </w:rPr>
+        <w:t>=</w:t>
+      </w:r>
+      <w:r>
+        <w:rPr>
+          <w:rFonts w:ascii="Consolas" w:eastAsia="Times New Roman" w:hAnsi="Consolas" w:cs="Times New Roman"/>
+          <w:color w:val="BBBEBF"/>
+          <w:sz w:val="21"/>
+          <w:szCs w:val="21"/>
+        </w:rPr>
+        <w:t xml:space="preserve"> </w:t>
+      </w:r>
+      <w:proofErr w:type="spellStart"/>
+      <w:r>
+        <w:rPr>
+          <w:rFonts w:ascii="Consolas" w:eastAsia="Times New Roman" w:hAnsi="Consolas" w:cs="Times New Roman"/>
+          <w:color w:val="4EC9B0"/>
+          <w:sz w:val="21"/>
+          <w:szCs w:val="21"/>
+        </w:rPr>
+        <w:t>int</w:t>
+      </w:r>
+      <w:proofErr w:type="spellEnd"/>
+      <w:r>
+        <w:rPr>
+          <w:rFonts w:ascii="Consolas" w:eastAsia="Times New Roman" w:hAnsi="Consolas" w:cs="Times New Roman"/>
+          <w:color w:val="BBBEBF"/>
+          <w:sz w:val="21"/>
+          <w:szCs w:val="21"/>
+        </w:rPr>
+        <w:t>(</w:t>
+      </w:r>
+      <w:r>
+        <w:rPr>
+          <w:rFonts w:ascii="Consolas" w:eastAsia="Times New Roman" w:hAnsi="Consolas" w:cs="Times New Roman"/>
+          <w:color w:val="DCDCAA"/>
+          <w:sz w:val="21"/>
+          <w:szCs w:val="21"/>
+        </w:rPr>
+        <w:t>input</w:t>
+      </w:r>
+      <w:r>
+        <w:rPr>
+          <w:rFonts w:ascii="Consolas" w:eastAsia="Times New Roman" w:hAnsi="Consolas" w:cs="Times New Roman"/>
+          <w:color w:val="BBBEBF"/>
+          <w:sz w:val="21"/>
+          <w:szCs w:val="21"/>
+        </w:rPr>
+        <w:t>(</w:t>
+      </w:r>
+      <w:r>
+        <w:rPr>
+          <w:rFonts w:ascii="Consolas" w:eastAsia="Times New Roman" w:hAnsi="Consolas" w:cs="Times New Roman"/>
+          <w:color w:val="A5D6FF"/>
+          <w:sz w:val="21"/>
+          <w:szCs w:val="21"/>
+        </w:rPr>
+        <w:t>"Provisiones disponibles: "</w:t>
+      </w:r>
+      <w:r>
+        <w:rPr>
+          <w:rFonts w:ascii="Consolas" w:eastAsia="Times New Roman" w:hAnsi="Consolas" w:cs="Times New Roman"/>
+          <w:color w:val="BBBEBF"/>
+          <w:sz w:val="21"/>
+          <w:szCs w:val="21"/>
+        </w:rPr>
+        <w:t>))</w:t>
+      </w:r>
+    </w:p>
+    <w:p>
+      <w:pPr>
+        <w:shd w:val="clear" w:color="auto" w:fill="121314"/>
+        <w:spacing w:after="0" w:line="285" w:lineRule="atLeast"/>
+        <w:ind w:left="0" w:firstLine="0"/>
+        <w:rPr>
+          <w:rFonts w:ascii="Consolas" w:eastAsia="Times New Roman" w:hAnsi="Consolas" w:cs="Times New Roman"/>
+          <w:color w:val="BBBEBF"/>
+          <w:sz w:val="21"/>
+          <w:szCs w:val="21"/>
+        </w:rPr>
+      </w:pPr>
+      <w:proofErr w:type="spellStart"/>
+      <w:r>
+        <w:rPr>
+          <w:rFonts w:ascii="Consolas" w:eastAsia="Times New Roman" w:hAnsi="Consolas" w:cs="Times New Roman"/>
+          <w:color w:val="BBBEBF"/>
+          <w:sz w:val="21"/>
+          <w:szCs w:val="21"/>
+        </w:rPr>
+        <w:t>provisiones_requeridas</w:t>
+      </w:r>
+      <w:proofErr w:type="spellEnd"/>
+      <w:r>
+        <w:rPr>
+          <w:rFonts w:ascii="Consolas" w:eastAsia="Times New Roman" w:hAnsi="Consolas" w:cs="Times New Roman"/>
+          <w:color w:val="BBBEBF"/>
+          <w:sz w:val="21"/>
+          <w:szCs w:val="21"/>
+        </w:rPr>
+        <w:t xml:space="preserve"> </w:t>
+      </w:r>
+      <w:r>
+        <w:rPr>
+          <w:rFonts w:ascii="Consolas" w:eastAsia="Times New Roman" w:hAnsi="Consolas" w:cs="Times New Roman"/>
+          <w:color w:val="D4D4D4"/>
+          <w:sz w:val="21"/>
+          <w:szCs w:val="21"/>
+        </w:rPr>
+        <w:t>=</w:t>
+      </w:r>
+      <w:r>
+        <w:rPr>
+          <w:rFonts w:ascii="Consolas" w:eastAsia="Times New Roman" w:hAnsi="Consolas" w:cs="Times New Roman"/>
+          <w:color w:val="BBBEBF"/>
+          <w:sz w:val="21"/>
+          <w:szCs w:val="21"/>
+        </w:rPr>
+        <w:t xml:space="preserve"> </w:t>
+      </w:r>
+      <w:proofErr w:type="spellStart"/>
+      <w:r>
+        <w:rPr>
+          <w:rFonts w:ascii="Consolas" w:eastAsia="Times New Roman" w:hAnsi="Consolas" w:cs="Times New Roman"/>
+          <w:color w:val="4EC9B0"/>
+          <w:sz w:val="21"/>
+          <w:szCs w:val="21"/>
+        </w:rPr>
+        <w:t>int</w:t>
+      </w:r>
+      <w:proofErr w:type="spellEnd"/>
+      <w:r>
+        <w:rPr>
+          <w:rFonts w:ascii="Consolas" w:eastAsia="Times New Roman" w:hAnsi="Consolas" w:cs="Times New Roman"/>
+          <w:color w:val="BBBEBF"/>
+          <w:sz w:val="21"/>
+          <w:szCs w:val="21"/>
+        </w:rPr>
+        <w:t>(</w:t>
+      </w:r>
+      <w:r>
+        <w:rPr>
+          <w:rFonts w:ascii="Consolas" w:eastAsia="Times New Roman" w:hAnsi="Consolas" w:cs="Times New Roman"/>
+          <w:color w:val="DCDCAA"/>
+          <w:sz w:val="21"/>
+          <w:szCs w:val="21"/>
+        </w:rPr>
+        <w:t>input</w:t>
+      </w:r>
+      <w:r>
+        <w:rPr>
+          <w:rFonts w:ascii="Consolas" w:eastAsia="Times New Roman" w:hAnsi="Consolas" w:cs="Times New Roman"/>
+          <w:color w:val="BBBEBF"/>
+          <w:sz w:val="21"/>
+          <w:szCs w:val="21"/>
+        </w:rPr>
+        <w:t>(</w:t>
+      </w:r>
+      <w:r>
+        <w:rPr>
+          <w:rFonts w:ascii="Consolas" w:eastAsia="Times New Roman" w:hAnsi="Consolas" w:cs="Times New Roman"/>
+          <w:color w:val="A5D6FF"/>
+          <w:sz w:val="21"/>
+          <w:szCs w:val="21"/>
+        </w:rPr>
+        <w:t>"Provisiones requeridas: "</w:t>
+      </w:r>
+      <w:r>
+        <w:rPr>
+          <w:rFonts w:ascii="Consolas" w:eastAsia="Times New Roman" w:hAnsi="Consolas" w:cs="Times New Roman"/>
+          <w:color w:val="BBBEBF"/>
+          <w:sz w:val="21"/>
+          <w:szCs w:val="21"/>
+        </w:rPr>
+        <w:t>))</w:t>
+      </w:r>
+    </w:p>
+    <w:p>
+      <w:pPr>
+        <w:shd w:val="clear" w:color="auto" w:fill="121314"/>
+        <w:spacing w:after="0" w:line="285" w:lineRule="atLeast"/>
+        <w:ind w:left="0" w:firstLine="0"/>
+        <w:rPr>
+          <w:rFonts w:ascii="Consolas" w:eastAsia="Times New Roman" w:hAnsi="Consolas" w:cs="Times New Roman"/>
+          <w:color w:val="BBBEBF"/>
+          <w:sz w:val="21"/>
+          <w:szCs w:val="21"/>
+        </w:rPr>
+      </w:pPr>
+    </w:p>
+    <w:p>
+      <w:pPr>
+        <w:shd w:val="clear" w:color="auto" w:fill="121314"/>
+        <w:spacing w:after="0" w:line="285" w:lineRule="atLeast"/>
+        <w:ind w:left="0" w:firstLine="0"/>
+        <w:rPr>
+          <w:rFonts w:ascii="Consolas" w:eastAsia="Times New Roman" w:hAnsi="Consolas" w:cs="Times New Roman"/>
+          <w:color w:val="BBBEBF"/>
+          <w:sz w:val="21"/>
+          <w:szCs w:val="21"/>
+        </w:rPr>
+      </w:pPr>
+      <w:r>
+        <w:rPr>
+          <w:rFonts w:ascii="Consolas" w:eastAsia="Times New Roman" w:hAnsi="Consolas" w:cs="Times New Roman"/>
+          <w:color w:val="8B949E"/>
+          <w:sz w:val="21"/>
+          <w:szCs w:val="21"/>
+        </w:rPr>
+        <w:t># --- Decisión: ambos recursos deben alcanzar (condición doble con and) ---</w:t>
+      </w:r>
+    </w:p>
+    <w:p>
+      <w:pPr>
+        <w:shd w:val="clear" w:color="auto" w:fill="121314"/>
+        <w:spacing w:after="0" w:line="285" w:lineRule="atLeast"/>
+        <w:ind w:left="0" w:firstLine="0"/>
+        <w:rPr>
+          <w:rFonts w:ascii="Consolas" w:eastAsia="Times New Roman" w:hAnsi="Consolas" w:cs="Times New Roman"/>
+          <w:color w:val="BBBEBF"/>
+          <w:sz w:val="21"/>
+          <w:szCs w:val="21"/>
+        </w:rPr>
+      </w:pPr>
+      <w:proofErr w:type="spellStart"/>
+      <w:r>
+        <w:rPr>
+          <w:rFonts w:ascii="Consolas" w:eastAsia="Times New Roman" w:hAnsi="Consolas" w:cs="Times New Roman"/>
+          <w:color w:val="C586C0"/>
+          <w:sz w:val="21"/>
+          <w:szCs w:val="21"/>
+        </w:rPr>
+        <w:t>if</w:t>
+      </w:r>
+      <w:proofErr w:type="spellEnd"/>
+      <w:r>
+        <w:rPr>
+          <w:rFonts w:ascii="Consolas" w:eastAsia="Times New Roman" w:hAnsi="Consolas" w:cs="Times New Roman"/>
+          <w:color w:val="BBBEBF"/>
+          <w:sz w:val="21"/>
+          <w:szCs w:val="21"/>
+        </w:rPr>
+        <w:t xml:space="preserve"> </w:t>
+      </w:r>
+      <w:proofErr w:type="spellStart"/>
+      <w:r>
+        <w:rPr>
+          <w:rFonts w:ascii="Consolas" w:eastAsia="Times New Roman" w:hAnsi="Consolas" w:cs="Times New Roman"/>
+          <w:color w:val="BBBEBF"/>
+          <w:sz w:val="21"/>
+          <w:szCs w:val="21"/>
+        </w:rPr>
+        <w:t>oxigeno_disponible</w:t>
+      </w:r>
+      <w:proofErr w:type="spellEnd"/>
+      <w:r>
+        <w:rPr>
+          <w:rFonts w:ascii="Consolas" w:eastAsia="Times New Roman" w:hAnsi="Consolas" w:cs="Times New Roman"/>
+          <w:color w:val="BBBEBF"/>
+          <w:sz w:val="21"/>
+          <w:szCs w:val="21"/>
+        </w:rPr>
+        <w:t xml:space="preserve"> </w:t>
+      </w:r>
+      <w:r>
+        <w:rPr>
+          <w:rFonts w:ascii="Consolas" w:eastAsia="Times New Roman" w:hAnsi="Consolas" w:cs="Times New Roman"/>
+          <w:color w:val="D4D4D4"/>
+          <w:sz w:val="21"/>
+          <w:szCs w:val="21"/>
+        </w:rPr>
+        <w:t>&gt;=</w:t>
+      </w:r>
+      <w:r>
+        <w:rPr>
+          <w:rFonts w:ascii="Consolas" w:eastAsia="Times New Roman" w:hAnsi="Consolas" w:cs="Times New Roman"/>
+          <w:color w:val="BBBEBF"/>
+          <w:sz w:val="21"/>
+          <w:szCs w:val="21"/>
+        </w:rPr>
+        <w:t xml:space="preserve"> </w:t>
+      </w:r>
+      <w:proofErr w:type="spellStart"/>
+      <w:r>
+        <w:rPr>
+          <w:rFonts w:ascii="Consolas" w:eastAsia="Times New Roman" w:hAnsi="Consolas" w:cs="Times New Roman"/>
+          <w:color w:val="BBBEBF"/>
+          <w:sz w:val="21"/>
+          <w:szCs w:val="21"/>
+        </w:rPr>
+        <w:t>oxigeno_requerido</w:t>
+      </w:r>
+      <w:proofErr w:type="spellEnd"/>
+      <w:r>
+        <w:rPr>
+          <w:rFonts w:ascii="Consolas" w:eastAsia="Times New Roman" w:hAnsi="Consolas" w:cs="Times New Roman"/>
+          <w:color w:val="BBBEBF"/>
+          <w:sz w:val="21"/>
+          <w:szCs w:val="21"/>
+        </w:rPr>
+        <w:t xml:space="preserve"> </w:t>
+      </w:r>
+      <w:r>
+        <w:rPr>
+          <w:rFonts w:ascii="Consolas" w:eastAsia="Times New Roman" w:hAnsi="Consolas" w:cs="Times New Roman"/>
+          <w:color w:val="569CD6"/>
+          <w:sz w:val="21"/>
+          <w:szCs w:val="21"/>
+        </w:rPr>
+        <w:t>and</w:t>
+      </w:r>
+      <w:r>
+        <w:rPr>
+          <w:rFonts w:ascii="Consolas" w:eastAsia="Times New Roman" w:hAnsi="Consolas" w:cs="Times New Roman"/>
+          <w:color w:val="BBBEBF"/>
+          <w:sz w:val="21"/>
+          <w:szCs w:val="21"/>
+        </w:rPr>
+        <w:t xml:space="preserve"> </w:t>
+      </w:r>
+      <w:proofErr w:type="spellStart"/>
+      <w:r>
+        <w:rPr>
+          <w:rFonts w:ascii="Consolas" w:eastAsia="Times New Roman" w:hAnsi="Consolas" w:cs="Times New Roman"/>
+          <w:color w:val="BBBEBF"/>
+          <w:sz w:val="21"/>
+          <w:szCs w:val="21"/>
+        </w:rPr>
+        <w:t>provisiones_disponibles</w:t>
+      </w:r>
+      <w:proofErr w:type="spellEnd"/>
+      <w:r>
+        <w:rPr>
+          <w:rFonts w:ascii="Consolas" w:eastAsia="Times New Roman" w:hAnsi="Consolas" w:cs="Times New Roman"/>
+          <w:color w:val="BBBEBF"/>
+          <w:sz w:val="21"/>
+          <w:szCs w:val="21"/>
+        </w:rPr>
+        <w:t xml:space="preserve"> </w:t>
+      </w:r>
+      <w:r>
+        <w:rPr>
+          <w:rFonts w:ascii="Consolas" w:eastAsia="Times New Roman" w:hAnsi="Consolas" w:cs="Times New Roman"/>
+          <w:color w:val="D4D4D4"/>
+          <w:sz w:val="21"/>
+          <w:szCs w:val="21"/>
+        </w:rPr>
+        <w:t>&gt;=</w:t>
+      </w:r>
+      <w:r>
+        <w:rPr>
+          <w:rFonts w:ascii="Consolas" w:eastAsia="Times New Roman" w:hAnsi="Consolas" w:cs="Times New Roman"/>
+          <w:color w:val="BBBEBF"/>
+          <w:sz w:val="21"/>
+          <w:szCs w:val="21"/>
+        </w:rPr>
+        <w:t xml:space="preserve"> </w:t>
+      </w:r>
+      <w:proofErr w:type="spellStart"/>
+      <w:r>
+        <w:rPr>
+          <w:rFonts w:ascii="Consolas" w:eastAsia="Times New Roman" w:hAnsi="Consolas" w:cs="Times New Roman"/>
+          <w:color w:val="BBBEBF"/>
+          <w:sz w:val="21"/>
+          <w:szCs w:val="21"/>
+        </w:rPr>
+        <w:t>provisiones_requeridas</w:t>
+      </w:r>
+      <w:proofErr w:type="spellEnd"/>
+      <w:r>
+        <w:rPr>
+          <w:rFonts w:ascii="Consolas" w:eastAsia="Times New Roman" w:hAnsi="Consolas" w:cs="Times New Roman"/>
+          <w:color w:val="BBBEBF"/>
+          <w:sz w:val="21"/>
+          <w:szCs w:val="21"/>
+        </w:rPr>
+        <w:t>:</w:t>
+      </w:r>
+    </w:p>
+    <w:p>
+      <w:pPr>
+        <w:shd w:val="clear" w:color="auto" w:fill="121314"/>
+        <w:spacing w:after="0" w:line="285" w:lineRule="atLeast"/>
+        <w:ind w:left="0" w:firstLine="0"/>
+        <w:rPr>
+          <w:rFonts w:ascii="Consolas" w:eastAsia="Times New Roman" w:hAnsi="Consolas" w:cs="Times New Roman"/>
+          <w:color w:val="BBBEBF"/>
+          <w:sz w:val="21"/>
+          <w:szCs w:val="21"/>
+        </w:rPr>
+      </w:pPr>
+      <w:r>
+        <w:rPr>
+          <w:rFonts w:ascii="Consolas" w:eastAsia="Times New Roman" w:hAnsi="Consolas" w:cs="Times New Roman"/>
+          <w:color w:val="BBBEBF"/>
+          <w:sz w:val="21"/>
+          <w:szCs w:val="21"/>
+        </w:rPr>
+        <w:t xml:space="preserve">    </w:t>
+      </w:r>
+      <w:proofErr w:type="spellStart"/>
+      <w:r>
+        <w:rPr>
+          <w:rFonts w:ascii="Consolas" w:eastAsia="Times New Roman" w:hAnsi="Consolas" w:cs="Times New Roman"/>
+          <w:color w:val="DCDCAA"/>
+          <w:sz w:val="21"/>
+          <w:szCs w:val="21"/>
+        </w:rPr>
+        <w:t>print</w:t>
+      </w:r>
+      <w:proofErr w:type="spellEnd"/>
+      <w:r>
+        <w:rPr>
+          <w:rFonts w:ascii="Consolas" w:eastAsia="Times New Roman" w:hAnsi="Consolas" w:cs="Times New Roman"/>
+          <w:color w:val="BBBEBF"/>
+          <w:sz w:val="21"/>
+          <w:szCs w:val="21"/>
+        </w:rPr>
+        <w:t>(</w:t>
+      </w:r>
+      <w:r>
+        <w:rPr>
+          <w:rFonts w:ascii="Consolas" w:eastAsia="Times New Roman" w:hAnsi="Consolas" w:cs="Times New Roman"/>
+          <w:color w:val="A5D6FF"/>
+          <w:sz w:val="21"/>
+          <w:szCs w:val="21"/>
+        </w:rPr>
+        <w:t>"La nave posee recursos suficientes para la tripulación."</w:t>
+      </w:r>
+      <w:r>
+        <w:rPr>
+          <w:rFonts w:ascii="Consolas" w:eastAsia="Times New Roman" w:hAnsi="Consolas" w:cs="Times New Roman"/>
+          <w:color w:val="BBBEBF"/>
+          <w:sz w:val="21"/>
+          <w:szCs w:val="21"/>
+        </w:rPr>
+        <w:t>)</w:t>
+      </w:r>
+    </w:p>
+    <w:p>
+      <w:pPr>
+        <w:shd w:val="clear" w:color="auto" w:fill="121314"/>
+        <w:spacing w:after="0" w:line="285" w:lineRule="atLeast"/>
+        <w:ind w:left="0" w:firstLine="0"/>
+        <w:rPr>
+          <w:rFonts w:ascii="Consolas" w:eastAsia="Times New Roman" w:hAnsi="Consolas" w:cs="Times New Roman"/>
+          <w:color w:val="BBBEBF"/>
+          <w:sz w:val="21"/>
+          <w:szCs w:val="21"/>
+        </w:rPr>
+      </w:pPr>
+      <w:proofErr w:type="spellStart"/>
+      <w:r>
+        <w:rPr>
+          <w:rFonts w:ascii="Consolas" w:eastAsia="Times New Roman" w:hAnsi="Consolas" w:cs="Times New Roman"/>
+          <w:color w:val="C586C0"/>
+          <w:sz w:val="21"/>
+          <w:szCs w:val="21"/>
+        </w:rPr>
+        <w:t>else</w:t>
+      </w:r>
+      <w:proofErr w:type="spellEnd"/>
+      <w:r>
+        <w:rPr>
+          <w:rFonts w:ascii="Consolas" w:eastAsia="Times New Roman" w:hAnsi="Consolas" w:cs="Times New Roman"/>
+          <w:color w:val="BBBEBF"/>
+          <w:sz w:val="21"/>
+          <w:szCs w:val="21"/>
+        </w:rPr>
+        <w:t>:</w:t>
+      </w:r>
+    </w:p>
+    <w:p>
+      <w:pPr>
+        <w:shd w:val="clear" w:color="auto" w:fill="121314"/>
+        <w:spacing w:after="0" w:line="285" w:lineRule="atLeast"/>
+        <w:ind w:left="0" w:firstLine="0"/>
+        <w:rPr>
+          <w:rFonts w:ascii="Consolas" w:eastAsia="Times New Roman" w:hAnsi="Consolas" w:cs="Times New Roman"/>
+          <w:color w:val="BBBEBF"/>
+          <w:sz w:val="21"/>
+          <w:szCs w:val="21"/>
+        </w:rPr>
+      </w:pPr>
+      <w:r>
+        <w:rPr>
+          <w:rFonts w:ascii="Consolas" w:eastAsia="Times New Roman" w:hAnsi="Consolas" w:cs="Times New Roman"/>
+          <w:color w:val="BBBEBF"/>
+          <w:sz w:val="21"/>
+          <w:szCs w:val="21"/>
+        </w:rPr>
+        <w:t xml:space="preserve">    </w:t>
+      </w:r>
+      <w:proofErr w:type="spellStart"/>
+      <w:r>
+        <w:rPr>
+          <w:rFonts w:ascii="Consolas" w:eastAsia="Times New Roman" w:hAnsi="Consolas" w:cs="Times New Roman"/>
+          <w:color w:val="DCDCAA"/>
+          <w:sz w:val="21"/>
+          <w:szCs w:val="21"/>
+        </w:rPr>
+        <w:t>print</w:t>
+      </w:r>
+      <w:proofErr w:type="spellEnd"/>
+      <w:r>
+        <w:rPr>
+          <w:rFonts w:ascii="Consolas" w:eastAsia="Times New Roman" w:hAnsi="Consolas" w:cs="Times New Roman"/>
+          <w:color w:val="BBBEBF"/>
+          <w:sz w:val="21"/>
+          <w:szCs w:val="21"/>
+        </w:rPr>
+        <w:t>(</w:t>
+      </w:r>
+      <w:r>
+        <w:rPr>
+          <w:rFonts w:ascii="Consolas" w:eastAsia="Times New Roman" w:hAnsi="Consolas" w:cs="Times New Roman"/>
+          <w:color w:val="A5D6FF"/>
+          <w:sz w:val="21"/>
+          <w:szCs w:val="21"/>
+        </w:rPr>
+        <w:t>"La nave no posee recursos suficientes para la tripulación."</w:t>
+      </w:r>
+      <w:r>
+        <w:rPr>
+          <w:rFonts w:ascii="Consolas" w:eastAsia="Times New Roman" w:hAnsi="Consolas" w:cs="Times New Roman"/>
+          <w:color w:val="BBBEBF"/>
+          <w:sz w:val="21"/>
+          <w:szCs w:val="21"/>
+        </w:rPr>
+        <w:t>)</w:t>
+      </w:r>
+    </w:p>
+    <w:p>
+      <w:pPr>
+        <w:rPr>
+          <w:sz w:val="22"/>
+        </w:rPr>
+      </w:pPr>
+    </w:p>
+    <w:p>
+      <w:pPr>
+        <w:spacing w:after="0" w:line="240" w:lineRule="auto"/>
+        <w:ind w:left="0" w:firstLine="0"/>
+        <w:jc w:val="center"/>
+        <w:rPr>
+          <w:rFonts w:eastAsia="Times New Roman"/>
+          <w:b/>
+          <w:bCs/>
+          <w:color w:val="auto"/>
+          <w:szCs w:val="24"/>
+        </w:rPr>
+      </w:pPr>
+      <w:r>
+        <w:rPr>
+          <w:rFonts w:eastAsia="Times New Roman"/>
+          <w:b/>
+          <w:bCs/>
+          <w:color w:val="auto"/>
+          <w:szCs w:val="24"/>
+        </w:rPr>
+        <w:t>Casos de prueba</w:t>
+      </w:r>
+    </w:p>
+    <w:p>
+      <w:pPr>
+        <w:spacing w:after="0" w:line="240" w:lineRule="auto"/>
+        <w:ind w:left="0" w:firstLine="0"/>
+        <w:jc w:val="center"/>
+        <w:rPr>
+          <w:rFonts w:eastAsia="Times New Roman"/>
+          <w:b/>
+          <w:bCs/>
+          <w:color w:val="auto"/>
+          <w:szCs w:val="24"/>
+        </w:rPr>
+      </w:pPr>
+    </w:p>
+    <w:tbl>
+      <w:tblPr>
+        <w:tblStyle w:val="Tabladelista3-nfasis3"/>
+        <w:tblW w:w="11057" w:type="dxa"/>
+        <w:tblInd w:w="-1139" w:type="dxa"/>
+        <w:tblLook w:val="04A0" w:firstRow="1" w:lastRow="0" w:firstColumn="1" w:lastColumn="0" w:noHBand="0" w:noVBand="1"/>
+      </w:tblPr>
+      <w:tblGrid>
+        <w:gridCol w:w="955"/>
+        <w:gridCol w:w="1172"/>
+        <w:gridCol w:w="1816"/>
+        <w:gridCol w:w="3145"/>
+        <w:gridCol w:w="1559"/>
+        <w:gridCol w:w="1393"/>
+        <w:gridCol w:w="1017"/>
+      </w:tblGrid>
+      <w:tr>
+        <w:trPr>
+          <w:cnfStyle w:val="100000000000" w:firstRow="1" w:lastRow="0" w:firstColumn="0" w:lastColumn="0" w:oddVBand="0" w:evenVBand="0" w:oddHBand="0" w:evenHBand="0" w:firstRowFirstColumn="0" w:firstRowLastColumn="0" w:lastRowFirstColumn="0" w:lastRowLastColumn="0"/>
+        </w:trPr>
+        <w:tc>
+          <w:tcPr>
+            <w:cnfStyle w:val="001000000100" w:firstRow="0" w:lastRow="0" w:firstColumn="1" w:lastColumn="0" w:oddVBand="0" w:evenVBand="0" w:oddHBand="0" w:evenHBand="0" w:firstRowFirstColumn="1" w:firstRowLastColumn="0" w:lastRowFirstColumn="0" w:lastRowLastColumn="0"/>
+            <w:tcW w:w="955" w:type="dxa"/>
+            <w:hideMark/>
+          </w:tcPr>
+          <w:p>
+            <w:pPr>
+              <w:spacing w:after="0" w:line="240" w:lineRule="auto"/>
+              <w:ind w:left="0" w:firstLine="0"/>
+              <w:jc w:val="center"/>
+              <w:rPr>
+                <w:rFonts w:eastAsia="Times New Roman"/>
+                <w:color w:val="auto"/>
+                <w:sz w:val="22"/>
+              </w:rPr>
+            </w:pPr>
+            <w:r>
+              <w:rPr>
+                <w:rFonts w:eastAsia="Times New Roman"/>
+                <w:color w:val="auto"/>
+                <w:sz w:val="22"/>
+              </w:rPr>
+              <w:t>ID</w:t>
+            </w:r>
+          </w:p>
+        </w:tc>
+        <w:tc>
+          <w:tcPr>
+            <w:tcW w:w="1172" w:type="dxa"/>
+            <w:hideMark/>
+          </w:tcPr>
+          <w:p>
+            <w:pPr>
+              <w:spacing w:after="0" w:line="240" w:lineRule="auto"/>
+              <w:ind w:left="0" w:firstLine="0"/>
+              <w:jc w:val="center"/>
+              <w:cnfStyle w:val="100000000000" w:firstRow="1" w:lastRow="0" w:firstColumn="0" w:lastColumn="0" w:oddVBand="0" w:evenVBand="0" w:oddHBand="0" w:evenHBand="0" w:firstRowFirstColumn="0" w:firstRowLastColumn="0" w:lastRowFirstColumn="0" w:lastRowLastColumn="0"/>
+              <w:rPr>
+                <w:rFonts w:eastAsia="Times New Roman"/>
+                <w:color w:val="auto"/>
+                <w:sz w:val="22"/>
+              </w:rPr>
+            </w:pPr>
+            <w:r>
+              <w:rPr>
+                <w:rFonts w:eastAsia="Times New Roman"/>
+                <w:color w:val="auto"/>
+                <w:sz w:val="22"/>
+              </w:rPr>
+              <w:t>Ejercicio</w:t>
+            </w:r>
+          </w:p>
+        </w:tc>
+        <w:tc>
+          <w:tcPr>
+            <w:tcW w:w="1816" w:type="dxa"/>
+            <w:hideMark/>
+          </w:tcPr>
+          <w:p>
+            <w:pPr>
+              <w:spacing w:after="0" w:line="240" w:lineRule="auto"/>
+              <w:ind w:left="0" w:firstLine="0"/>
+              <w:jc w:val="center"/>
+              <w:cnfStyle w:val="100000000000" w:firstRow="1" w:lastRow="0" w:firstColumn="0" w:lastColumn="0" w:oddVBand="0" w:evenVBand="0" w:oddHBand="0" w:evenHBand="0" w:firstRowFirstColumn="0" w:firstRowLastColumn="0" w:lastRowFirstColumn="0" w:lastRowLastColumn="0"/>
+              <w:rPr>
+                <w:rFonts w:eastAsia="Times New Roman"/>
+                <w:color w:val="auto"/>
+                <w:sz w:val="22"/>
+              </w:rPr>
+            </w:pPr>
+            <w:r>
+              <w:rPr>
+                <w:rFonts w:eastAsia="Times New Roman"/>
+                <w:color w:val="auto"/>
+                <w:sz w:val="22"/>
+              </w:rPr>
+              <w:t>Escenario</w:t>
+            </w:r>
+          </w:p>
+        </w:tc>
+        <w:tc>
+          <w:tcPr>
+            <w:tcW w:w="3145" w:type="dxa"/>
+            <w:hideMark/>
+          </w:tcPr>
+          <w:p>
+            <w:pPr>
+              <w:spacing w:after="0" w:line="240" w:lineRule="auto"/>
+              <w:ind w:left="0" w:firstLine="0"/>
+              <w:jc w:val="center"/>
+              <w:cnfStyle w:val="100000000000" w:firstRow="1" w:lastRow="0" w:firstColumn="0" w:lastColumn="0" w:oddVBand="0" w:evenVBand="0" w:oddHBand="0" w:evenHBand="0" w:firstRowFirstColumn="0" w:firstRowLastColumn="0" w:lastRowFirstColumn="0" w:lastRowLastColumn="0"/>
+              <w:rPr>
+                <w:rFonts w:eastAsia="Times New Roman"/>
+                <w:color w:val="auto"/>
+                <w:sz w:val="22"/>
+              </w:rPr>
+            </w:pPr>
+            <w:r>
+              <w:rPr>
+                <w:rFonts w:eastAsia="Times New Roman"/>
+                <w:color w:val="auto"/>
+                <w:sz w:val="22"/>
+              </w:rPr>
+              <w:t>Datos de entrada</w:t>
+            </w:r>
+          </w:p>
+        </w:tc>
+        <w:tc>
+          <w:tcPr>
+            <w:tcW w:w="1559" w:type="dxa"/>
+            <w:hideMark/>
+          </w:tcPr>
+          <w:p>
+            <w:pPr>
+              <w:spacing w:after="0" w:line="240" w:lineRule="auto"/>
+              <w:ind w:left="0" w:firstLine="0"/>
+              <w:jc w:val="center"/>
+              <w:cnfStyle w:val="100000000000" w:firstRow="1" w:lastRow="0" w:firstColumn="0" w:lastColumn="0" w:oddVBand="0" w:evenVBand="0" w:oddHBand="0" w:evenHBand="0" w:firstRowFirstColumn="0" w:firstRowLastColumn="0" w:lastRowFirstColumn="0" w:lastRowLastColumn="0"/>
+              <w:rPr>
+                <w:rFonts w:eastAsia="Times New Roman"/>
+                <w:color w:val="auto"/>
+                <w:sz w:val="22"/>
+              </w:rPr>
+            </w:pPr>
+            <w:r>
+              <w:rPr>
+                <w:rFonts w:eastAsia="Times New Roman"/>
+                <w:color w:val="auto"/>
+                <w:sz w:val="22"/>
+              </w:rPr>
+              <w:t>Resultado esperado</w:t>
+            </w:r>
+          </w:p>
+        </w:tc>
+        <w:tc>
+          <w:tcPr>
+            <w:tcW w:w="1393" w:type="dxa"/>
+            <w:hideMark/>
+          </w:tcPr>
+          <w:p>
+            <w:pPr>
+              <w:spacing w:after="0" w:line="240" w:lineRule="auto"/>
+              <w:ind w:left="0" w:firstLine="0"/>
+              <w:jc w:val="center"/>
+              <w:cnfStyle w:val="100000000000" w:firstRow="1" w:lastRow="0" w:firstColumn="0" w:lastColumn="0" w:oddVBand="0" w:evenVBand="0" w:oddHBand="0" w:evenHBand="0" w:firstRowFirstColumn="0" w:firstRowLastColumn="0" w:lastRowFirstColumn="0" w:lastRowLastColumn="0"/>
+              <w:rPr>
+                <w:rFonts w:eastAsia="Times New Roman"/>
+                <w:color w:val="auto"/>
+                <w:sz w:val="22"/>
+              </w:rPr>
+            </w:pPr>
+            <w:r>
+              <w:rPr>
+                <w:rFonts w:eastAsia="Times New Roman"/>
+                <w:color w:val="auto"/>
+                <w:sz w:val="22"/>
+              </w:rPr>
+              <w:t>Resultado obtenido</w:t>
+            </w:r>
+          </w:p>
+        </w:tc>
+        <w:tc>
+          <w:tcPr>
+            <w:tcW w:w="1017" w:type="dxa"/>
+            <w:hideMark/>
+          </w:tcPr>
+          <w:p>
+            <w:pPr>
+              <w:spacing w:after="0" w:line="240" w:lineRule="auto"/>
+              <w:ind w:left="0" w:firstLine="0"/>
+              <w:jc w:val="center"/>
+              <w:cnfStyle w:val="100000000000" w:firstRow="1" w:lastRow="0" w:firstColumn="0" w:lastColumn="0" w:oddVBand="0" w:evenVBand="0" w:oddHBand="0" w:evenHBand="0" w:firstRowFirstColumn="0" w:firstRowLastColumn="0" w:lastRowFirstColumn="0" w:lastRowLastColumn="0"/>
+              <w:rPr>
+                <w:rFonts w:eastAsia="Times New Roman"/>
+                <w:color w:val="auto"/>
+                <w:sz w:val="22"/>
+              </w:rPr>
+            </w:pPr>
+            <w:r>
+              <w:rPr>
+                <w:rFonts w:eastAsia="Times New Roman"/>
+                <w:color w:val="auto"/>
+                <w:sz w:val="22"/>
+              </w:rPr>
+              <w:t>Estado</w:t>
+            </w:r>
+          </w:p>
+        </w:tc>
+      </w:tr>
+      <w:tr>
+        <w:trPr>
+          <w:cnfStyle w:val="000000100000" w:firstRow="0" w:lastRow="0" w:firstColumn="0" w:lastColumn="0" w:oddVBand="0" w:evenVBand="0" w:oddHBand="1" w:evenHBand="0" w:firstRowFirstColumn="0" w:firstRowLastColumn="0" w:lastRowFirstColumn="0" w:lastRowLastColumn="0"/>
+          <w:trHeight w:val="1771"/>
+        </w:trPr>
+        <w:tc>
+          <w:tcPr>
+            <w:cnfStyle w:val="001000000000" w:firstRow="0" w:lastRow="0" w:firstColumn="1" w:lastColumn="0" w:oddVBand="0" w:evenVBand="0" w:oddHBand="0" w:evenHBand="0" w:firstRowFirstColumn="0" w:firstRowLastColumn="0" w:lastRowFirstColumn="0" w:lastRowLastColumn="0"/>
+            <w:tcW w:w="955" w:type="dxa"/>
+            <w:hideMark/>
+          </w:tcPr>
+          <w:p>
+            <w:pPr>
+              <w:spacing w:after="0" w:line="240" w:lineRule="auto"/>
+              <w:ind w:left="0" w:firstLine="0"/>
+              <w:rPr>
+                <w:rFonts w:eastAsia="Times New Roman"/>
+                <w:color w:val="auto"/>
+                <w:sz w:val="22"/>
+              </w:rPr>
+            </w:pPr>
+            <w:r>
+              <w:rPr>
+                <w:rFonts w:eastAsia="Times New Roman"/>
+                <w:color w:val="auto"/>
+                <w:sz w:val="22"/>
+              </w:rPr>
+              <w:t>CP-01</w:t>
+            </w:r>
+          </w:p>
+        </w:tc>
+        <w:tc>
+          <w:tcPr>
+            <w:tcW w:w="1172" w:type="dxa"/>
+            <w:hideMark/>
+          </w:tcPr>
+          <w:p>
+            <w:pPr>
+              <w:spacing w:after="0" w:line="240" w:lineRule="auto"/>
+              <w:ind w:left="0" w:firstLine="0"/>
+              <w:cnfStyle w:val="000000100000" w:firstRow="0" w:lastRow="0" w:firstColumn="0" w:lastColumn="0" w:oddVBand="0" w:evenVBand="0" w:oddHBand="1" w:evenHBand="0" w:firstRowFirstColumn="0" w:firstRowLastColumn="0" w:lastRowFirstColumn="0" w:lastRowLastColumn="0"/>
+              <w:rPr>
+                <w:rFonts w:eastAsia="Times New Roman"/>
+                <w:color w:val="auto"/>
+                <w:sz w:val="20"/>
+                <w:szCs w:val="20"/>
+              </w:rPr>
+            </w:pPr>
+            <w:r>
+              <w:rPr>
+                <w:rFonts w:eastAsia="Times New Roman"/>
+                <w:color w:val="auto"/>
+                <w:sz w:val="20"/>
+                <w:szCs w:val="20"/>
+              </w:rPr>
+              <w:t>Ejercicio 3</w:t>
+            </w:r>
+          </w:p>
+        </w:tc>
+        <w:tc>
+          <w:tcPr>
+            <w:tcW w:w="1816" w:type="dxa"/>
+            <w:hideMark/>
+          </w:tcPr>
+          <w:p>
+            <w:pPr>
+              <w:spacing w:after="0" w:line="240" w:lineRule="auto"/>
+              <w:ind w:left="0" w:firstLine="0"/>
+              <w:cnfStyle w:val="000000100000" w:firstRow="0" w:lastRow="0" w:firstColumn="0" w:lastColumn="0" w:oddVBand="0" w:evenVBand="0" w:oddHBand="1" w:evenHBand="0" w:firstRowFirstColumn="0" w:firstRowLastColumn="0" w:lastRowFirstColumn="0" w:lastRowLastColumn="0"/>
+              <w:rPr>
+                <w:rFonts w:eastAsia="Times New Roman"/>
+                <w:color w:val="auto"/>
+                <w:sz w:val="22"/>
+              </w:rPr>
+            </w:pPr>
+            <w:r>
+              <w:rPr>
+                <w:rFonts w:eastAsia="Times New Roman"/>
+                <w:color w:val="auto"/>
+                <w:sz w:val="22"/>
+              </w:rPr>
+              <w:t>Oxígeno y provisiones suficientes</w:t>
+            </w:r>
+          </w:p>
+        </w:tc>
+        <w:tc>
+          <w:tcPr>
+            <w:tcW w:w="3145" w:type="dxa"/>
+            <w:hideMark/>
+          </w:tcPr>
+          <w:p>
+            <w:pPr>
+              <w:spacing w:after="0" w:line="276" w:lineRule="auto"/>
+              <w:ind w:left="0" w:firstLine="0"/>
+              <w:cnfStyle w:val="000000100000" w:firstRow="0" w:lastRow="0" w:firstColumn="0" w:lastColumn="0" w:oddVBand="0" w:evenVBand="0" w:oddHBand="1" w:evenHBand="0" w:firstRowFirstColumn="0" w:firstRowLastColumn="0" w:lastRowFirstColumn="0" w:lastRowLastColumn="0"/>
+              <w:rPr>
+                <w:rFonts w:eastAsia="Times New Roman"/>
+                <w:color w:val="auto"/>
+                <w:sz w:val="22"/>
+              </w:rPr>
+            </w:pPr>
+            <w:r>
+              <w:rPr>
+                <w:rFonts w:eastAsia="Times New Roman"/>
+                <w:color w:val="auto"/>
+                <w:sz w:val="22"/>
+              </w:rPr>
+              <w:t>Oxígeno dis</w:t>
+            </w:r>
+            <w:r>
+              <w:rPr>
+                <w:rFonts w:eastAsia="Times New Roman"/>
+                <w:color w:val="auto"/>
+                <w:sz w:val="22"/>
+              </w:rPr>
+              <w:t xml:space="preserve">ponible </w:t>
+            </w:r>
+            <w:r>
+              <w:rPr>
+                <w:rFonts w:eastAsia="Times New Roman"/>
+                <w:color w:val="auto"/>
+                <w:sz w:val="22"/>
+              </w:rPr>
+              <w:t>= 100</w:t>
+            </w:r>
+          </w:p>
+          <w:p>
+            <w:pPr>
+              <w:spacing w:after="0" w:line="276" w:lineRule="auto"/>
+              <w:ind w:left="0" w:firstLine="0"/>
+              <w:cnfStyle w:val="000000100000" w:firstRow="0" w:lastRow="0" w:firstColumn="0" w:lastColumn="0" w:oddVBand="0" w:evenVBand="0" w:oddHBand="1" w:evenHBand="0" w:firstRowFirstColumn="0" w:firstRowLastColumn="0" w:lastRowFirstColumn="0" w:lastRowLastColumn="0"/>
+              <w:rPr>
+                <w:rFonts w:eastAsia="Times New Roman"/>
+                <w:color w:val="auto"/>
+                <w:sz w:val="22"/>
+              </w:rPr>
+            </w:pPr>
+            <w:r>
+              <w:rPr>
+                <w:rFonts w:eastAsia="Times New Roman"/>
+                <w:color w:val="auto"/>
+                <w:sz w:val="22"/>
+              </w:rPr>
+              <w:t>Oxígeno re</w:t>
+            </w:r>
+            <w:r>
+              <w:rPr>
+                <w:rFonts w:eastAsia="Times New Roman"/>
+                <w:color w:val="auto"/>
+                <w:sz w:val="22"/>
+              </w:rPr>
+              <w:t xml:space="preserve">querido </w:t>
+            </w:r>
+            <w:r>
+              <w:rPr>
+                <w:rFonts w:eastAsia="Times New Roman"/>
+                <w:color w:val="auto"/>
+                <w:sz w:val="22"/>
+              </w:rPr>
+              <w:t>= 65</w:t>
+            </w:r>
+          </w:p>
+          <w:p>
+            <w:pPr>
+              <w:spacing w:after="0" w:line="276" w:lineRule="auto"/>
+              <w:ind w:left="0" w:firstLine="0"/>
+              <w:cnfStyle w:val="000000100000" w:firstRow="0" w:lastRow="0" w:firstColumn="0" w:lastColumn="0" w:oddVBand="0" w:evenVBand="0" w:oddHBand="1" w:evenHBand="0" w:firstRowFirstColumn="0" w:firstRowLastColumn="0" w:lastRowFirstColumn="0" w:lastRowLastColumn="0"/>
+              <w:rPr>
+                <w:rFonts w:eastAsia="Times New Roman"/>
+                <w:color w:val="auto"/>
+                <w:sz w:val="22"/>
+              </w:rPr>
+            </w:pPr>
+            <w:r>
+              <w:rPr>
+                <w:rFonts w:eastAsia="Times New Roman"/>
+                <w:color w:val="auto"/>
+                <w:sz w:val="22"/>
+              </w:rPr>
+              <w:t>Provisiones disp</w:t>
+            </w:r>
+            <w:r>
+              <w:rPr>
+                <w:rFonts w:eastAsia="Times New Roman"/>
+                <w:color w:val="auto"/>
+                <w:sz w:val="22"/>
+              </w:rPr>
+              <w:t>onibles</w:t>
+            </w:r>
+            <w:r>
+              <w:rPr>
+                <w:rFonts w:eastAsia="Times New Roman"/>
+                <w:color w:val="auto"/>
+                <w:sz w:val="22"/>
+              </w:rPr>
+              <w:t xml:space="preserve"> = 50</w:t>
+            </w:r>
+          </w:p>
+          <w:p>
+            <w:pPr>
+              <w:spacing w:after="0" w:line="276" w:lineRule="auto"/>
+              <w:ind w:left="0" w:firstLine="0"/>
+              <w:cnfStyle w:val="000000100000" w:firstRow="0" w:lastRow="0" w:firstColumn="0" w:lastColumn="0" w:oddVBand="0" w:evenVBand="0" w:oddHBand="1" w:evenHBand="0" w:firstRowFirstColumn="0" w:firstRowLastColumn="0" w:lastRowFirstColumn="0" w:lastRowLastColumn="0"/>
+              <w:rPr>
+                <w:rFonts w:eastAsia="Times New Roman"/>
+                <w:color w:val="auto"/>
+                <w:sz w:val="22"/>
+              </w:rPr>
+            </w:pPr>
+            <w:r>
+              <w:rPr>
+                <w:rFonts w:eastAsia="Times New Roman"/>
+                <w:color w:val="auto"/>
+                <w:sz w:val="22"/>
+              </w:rPr>
+              <w:t>Provisiones req</w:t>
+            </w:r>
+            <w:r>
+              <w:rPr>
+                <w:rFonts w:eastAsia="Times New Roman"/>
+                <w:color w:val="auto"/>
+                <w:sz w:val="22"/>
+              </w:rPr>
+              <w:t>ueridas</w:t>
+            </w:r>
+            <w:r>
+              <w:rPr>
+                <w:rFonts w:eastAsia="Times New Roman"/>
+                <w:color w:val="auto"/>
+                <w:sz w:val="22"/>
+              </w:rPr>
+              <w:t xml:space="preserve"> = 33</w:t>
+            </w:r>
+          </w:p>
+        </w:tc>
+        <w:tc>
+          <w:tcPr>
+            <w:tcW w:w="1559" w:type="dxa"/>
+            <w:hideMark/>
+          </w:tcPr>
+          <w:p>
+            <w:pPr>
+              <w:spacing w:after="0" w:line="240" w:lineRule="auto"/>
+              <w:ind w:left="0" w:firstLine="0"/>
+              <w:cnfStyle w:val="000000100000" w:firstRow="0" w:lastRow="0" w:firstColumn="0" w:lastColumn="0" w:oddVBand="0" w:evenVBand="0" w:oddHBand="1" w:evenHBand="0" w:firstRowFirstColumn="0" w:firstRowLastColumn="0" w:lastRowFirstColumn="0" w:lastRowLastColumn="0"/>
+              <w:rPr>
+                <w:rFonts w:eastAsia="Times New Roman"/>
+                <w:color w:val="auto"/>
+                <w:sz w:val="22"/>
+              </w:rPr>
+            </w:pPr>
+            <w:r>
+              <w:rPr>
+                <w:rFonts w:eastAsia="Times New Roman"/>
+                <w:color w:val="auto"/>
+                <w:sz w:val="22"/>
+              </w:rPr>
+              <w:t>“La nave posee recursos suficientes para la tripulación.”</w:t>
+            </w:r>
+          </w:p>
+        </w:tc>
+        <w:tc>
+          <w:tcPr>
+            <w:tcW w:w="1393" w:type="dxa"/>
+            <w:hideMark/>
+          </w:tcPr>
+          <w:p>
+            <w:pPr>
+              <w:spacing w:after="0" w:line="240" w:lineRule="auto"/>
+              <w:ind w:left="0" w:firstLine="0"/>
+              <w:cnfStyle w:val="000000100000" w:firstRow="0" w:lastRow="0" w:firstColumn="0" w:lastColumn="0" w:oddVBand="0" w:evenVBand="0" w:oddHBand="1" w:evenHBand="0" w:firstRowFirstColumn="0" w:firstRowLastColumn="0" w:lastRowFirstColumn="0" w:lastRowLastColumn="0"/>
+              <w:rPr>
+                <w:rFonts w:eastAsia="Times New Roman"/>
+                <w:color w:val="auto"/>
+                <w:sz w:val="22"/>
+              </w:rPr>
+            </w:pPr>
+            <w:r>
+              <w:rPr>
+                <w:rFonts w:eastAsia="Times New Roman"/>
+                <w:color w:val="auto"/>
+                <w:sz w:val="22"/>
+              </w:rPr>
+              <w:t>Igual al esperado</w:t>
+            </w:r>
+          </w:p>
+        </w:tc>
+        <w:tc>
+          <w:tcPr>
+            <w:tcW w:w="1017" w:type="dxa"/>
+            <w:hideMark/>
+          </w:tcPr>
+          <w:p>
+            <w:pPr>
+              <w:spacing w:after="0" w:line="240" w:lineRule="auto"/>
+              <w:ind w:left="0" w:firstLine="0"/>
+              <w:cnfStyle w:val="000000100000" w:firstRow="0" w:lastRow="0" w:firstColumn="0" w:lastColumn="0" w:oddVBand="0" w:evenVBand="0" w:oddHBand="1" w:evenHBand="0" w:firstRowFirstColumn="0" w:firstRowLastColumn="0" w:lastRowFirstColumn="0" w:lastRowLastColumn="0"/>
+              <w:rPr>
+                <w:rFonts w:eastAsia="Times New Roman"/>
+                <w:color w:val="auto"/>
+                <w:sz w:val="22"/>
+              </w:rPr>
+            </w:pPr>
+            <w:r>
+              <w:rPr>
+                <w:rFonts w:eastAsia="Times New Roman"/>
+                <w:color w:val="auto"/>
+                <w:sz w:val="22"/>
+              </w:rPr>
+              <w:t>Exitoso</w:t>
+            </w:r>
+          </w:p>
+        </w:tc>
+      </w:tr>
+      <w:tr>
+        <w:trPr>
+          <w:trHeight w:val="1818"/>
+        </w:trPr>
+        <w:tc>
+          <w:tcPr>
+            <w:cnfStyle w:val="001000000000" w:firstRow="0" w:lastRow="0" w:firstColumn="1" w:lastColumn="0" w:oddVBand="0" w:evenVBand="0" w:oddHBand="0" w:evenHBand="0" w:firstRowFirstColumn="0" w:firstRowLastColumn="0" w:lastRowFirstColumn="0" w:lastRowLastColumn="0"/>
+            <w:tcW w:w="955" w:type="dxa"/>
+            <w:hideMark/>
+          </w:tcPr>
+          <w:p>
+            <w:pPr>
+              <w:spacing w:after="0" w:line="240" w:lineRule="auto"/>
+              <w:ind w:left="0" w:firstLine="0"/>
+              <w:rPr>
+                <w:rFonts w:eastAsia="Times New Roman"/>
+                <w:color w:val="auto"/>
+                <w:sz w:val="22"/>
+              </w:rPr>
+            </w:pPr>
+            <w:r>
+              <w:rPr>
+                <w:rFonts w:eastAsia="Times New Roman"/>
+                <w:color w:val="auto"/>
+                <w:sz w:val="22"/>
+              </w:rPr>
+              <w:t>CP-02</w:t>
+            </w:r>
+          </w:p>
+        </w:tc>
+        <w:tc>
+          <w:tcPr>
+            <w:tcW w:w="1172" w:type="dxa"/>
+            <w:hideMark/>
+          </w:tcPr>
+          <w:p>
+            <w:pPr>
+              <w:spacing w:after="0" w:line="240" w:lineRule="auto"/>
+              <w:ind w:left="0" w:firstLine="0"/>
+              <w:cnfStyle w:val="000000000000" w:firstRow="0" w:lastRow="0" w:firstColumn="0" w:lastColumn="0" w:oddVBand="0" w:evenVBand="0" w:oddHBand="0" w:evenHBand="0" w:firstRowFirstColumn="0" w:firstRowLastColumn="0" w:lastRowFirstColumn="0" w:lastRowLastColumn="0"/>
+              <w:rPr>
+                <w:rFonts w:eastAsia="Times New Roman"/>
+                <w:color w:val="auto"/>
+                <w:sz w:val="20"/>
+                <w:szCs w:val="20"/>
+              </w:rPr>
+            </w:pPr>
+            <w:r>
+              <w:rPr>
+                <w:rFonts w:eastAsia="Times New Roman"/>
+                <w:color w:val="auto"/>
+                <w:sz w:val="20"/>
+                <w:szCs w:val="20"/>
+              </w:rPr>
+              <w:t>Ejercicio 3</w:t>
+            </w:r>
+          </w:p>
+        </w:tc>
+        <w:tc>
+          <w:tcPr>
+            <w:tcW w:w="1816" w:type="dxa"/>
+            <w:hideMark/>
+          </w:tcPr>
+          <w:p>
+            <w:pPr>
+              <w:spacing w:after="0" w:line="240" w:lineRule="auto"/>
+              <w:ind w:left="0" w:firstLine="0"/>
+              <w:cnfStyle w:val="000000000000" w:firstRow="0" w:lastRow="0" w:firstColumn="0" w:lastColumn="0" w:oddVBand="0" w:evenVBand="0" w:oddHBand="0" w:evenHBand="0" w:firstRowFirstColumn="0" w:firstRowLastColumn="0" w:lastRowFirstColumn="0" w:lastRowLastColumn="0"/>
+              <w:rPr>
+                <w:rFonts w:eastAsia="Times New Roman"/>
+                <w:color w:val="auto"/>
+                <w:sz w:val="22"/>
+              </w:rPr>
+            </w:pPr>
+            <w:r>
+              <w:rPr>
+                <w:rFonts w:eastAsia="Times New Roman"/>
+                <w:color w:val="auto"/>
+                <w:sz w:val="22"/>
+              </w:rPr>
+              <w:t>Ambos recursos exactamente iguales al mínimo (límite)</w:t>
+            </w:r>
+          </w:p>
+        </w:tc>
+        <w:tc>
+          <w:tcPr>
+            <w:tcW w:w="3145" w:type="dxa"/>
+            <w:hideMark/>
+          </w:tcPr>
+          <w:p>
+            <w:pPr>
+              <w:spacing w:after="0" w:line="276" w:lineRule="auto"/>
+              <w:ind w:left="0" w:firstLine="0"/>
+              <w:cnfStyle w:val="000000000000" w:firstRow="0" w:lastRow="0" w:firstColumn="0" w:lastColumn="0" w:oddVBand="0" w:evenVBand="0" w:oddHBand="0" w:evenHBand="0" w:firstRowFirstColumn="0" w:firstRowLastColumn="0" w:lastRowFirstColumn="0" w:lastRowLastColumn="0"/>
+              <w:rPr>
+                <w:rFonts w:eastAsia="Times New Roman"/>
+                <w:color w:val="auto"/>
+                <w:sz w:val="22"/>
+              </w:rPr>
+            </w:pPr>
+            <w:r>
+              <w:rPr>
+                <w:rFonts w:eastAsia="Times New Roman"/>
+                <w:color w:val="auto"/>
+                <w:sz w:val="22"/>
+              </w:rPr>
+              <w:t>Oxígeno disp</w:t>
+            </w:r>
+            <w:r>
+              <w:rPr>
+                <w:rFonts w:eastAsia="Times New Roman"/>
+                <w:color w:val="auto"/>
+                <w:sz w:val="22"/>
+              </w:rPr>
+              <w:t>onible</w:t>
+            </w:r>
+            <w:r>
+              <w:rPr>
+                <w:rFonts w:eastAsia="Times New Roman"/>
+                <w:color w:val="auto"/>
+                <w:sz w:val="22"/>
+              </w:rPr>
+              <w:t xml:space="preserve"> = 65 Oxígeno req</w:t>
+            </w:r>
+            <w:r>
+              <w:rPr>
+                <w:rFonts w:eastAsia="Times New Roman"/>
+                <w:color w:val="auto"/>
+                <w:sz w:val="22"/>
+              </w:rPr>
+              <w:t>uerido</w:t>
+            </w:r>
+            <w:r>
+              <w:rPr>
+                <w:rFonts w:eastAsia="Times New Roman"/>
+                <w:color w:val="auto"/>
+                <w:sz w:val="22"/>
+              </w:rPr>
+              <w:t xml:space="preserve"> = 65</w:t>
+            </w:r>
+          </w:p>
+          <w:p>
+            <w:pPr>
+              <w:spacing w:after="0" w:line="276" w:lineRule="auto"/>
+              <w:ind w:left="0" w:firstLine="0"/>
+              <w:cnfStyle w:val="000000000000" w:firstRow="0" w:lastRow="0" w:firstColumn="0" w:lastColumn="0" w:oddVBand="0" w:evenVBand="0" w:oddHBand="0" w:evenHBand="0" w:firstRowFirstColumn="0" w:firstRowLastColumn="0" w:lastRowFirstColumn="0" w:lastRowLastColumn="0"/>
+              <w:rPr>
+                <w:rFonts w:eastAsia="Times New Roman"/>
+                <w:color w:val="auto"/>
+                <w:sz w:val="22"/>
+              </w:rPr>
+            </w:pPr>
+            <w:r>
+              <w:rPr>
+                <w:rFonts w:eastAsia="Times New Roman"/>
+                <w:color w:val="auto"/>
+                <w:sz w:val="22"/>
+              </w:rPr>
+              <w:t>Provisiones disp</w:t>
+            </w:r>
+            <w:r>
+              <w:rPr>
+                <w:rFonts w:eastAsia="Times New Roman"/>
+                <w:color w:val="auto"/>
+                <w:sz w:val="22"/>
+              </w:rPr>
+              <w:t>onibles</w:t>
+            </w:r>
+            <w:r>
+              <w:rPr>
+                <w:rFonts w:eastAsia="Times New Roman"/>
+                <w:color w:val="auto"/>
+                <w:sz w:val="22"/>
+              </w:rPr>
+              <w:t xml:space="preserve"> = 33</w:t>
+            </w:r>
+          </w:p>
+          <w:p>
+            <w:pPr>
+              <w:spacing w:after="0" w:line="276" w:lineRule="auto"/>
+              <w:ind w:left="0" w:firstLine="0"/>
+              <w:cnfStyle w:val="000000000000" w:firstRow="0" w:lastRow="0" w:firstColumn="0" w:lastColumn="0" w:oddVBand="0" w:evenVBand="0" w:oddHBand="0" w:evenHBand="0" w:firstRowFirstColumn="0" w:firstRowLastColumn="0" w:lastRowFirstColumn="0" w:lastRowLastColumn="0"/>
+              <w:rPr>
+                <w:rFonts w:eastAsia="Times New Roman"/>
+                <w:color w:val="auto"/>
+                <w:sz w:val="22"/>
+              </w:rPr>
+            </w:pPr>
+            <w:r>
+              <w:rPr>
+                <w:rFonts w:eastAsia="Times New Roman"/>
+                <w:color w:val="auto"/>
+                <w:sz w:val="22"/>
+              </w:rPr>
+              <w:t>Provisiones req</w:t>
+            </w:r>
+            <w:r>
+              <w:rPr>
+                <w:rFonts w:eastAsia="Times New Roman"/>
+                <w:color w:val="auto"/>
+                <w:sz w:val="22"/>
+              </w:rPr>
+              <w:t>ueridas</w:t>
+            </w:r>
+            <w:r>
+              <w:rPr>
+                <w:rFonts w:eastAsia="Times New Roman"/>
+                <w:color w:val="auto"/>
+                <w:sz w:val="22"/>
+              </w:rPr>
+              <w:t xml:space="preserve"> = 33</w:t>
+            </w:r>
+          </w:p>
+        </w:tc>
+        <w:tc>
+          <w:tcPr>
+            <w:tcW w:w="1559" w:type="dxa"/>
+            <w:hideMark/>
+          </w:tcPr>
+          <w:p>
+            <w:pPr>
+              <w:spacing w:after="0" w:line="240" w:lineRule="auto"/>
+              <w:ind w:left="0" w:firstLine="0"/>
+              <w:cnfStyle w:val="000000000000" w:firstRow="0" w:lastRow="0" w:firstColumn="0" w:lastColumn="0" w:oddVBand="0" w:evenVBand="0" w:oddHBand="0" w:evenHBand="0" w:firstRowFirstColumn="0" w:firstRowLastColumn="0" w:lastRowFirstColumn="0" w:lastRowLastColumn="0"/>
+              <w:rPr>
+                <w:rFonts w:eastAsia="Times New Roman"/>
+                <w:color w:val="auto"/>
+                <w:sz w:val="22"/>
+              </w:rPr>
+            </w:pPr>
+            <w:r>
+              <w:rPr>
+                <w:rFonts w:eastAsia="Times New Roman"/>
+                <w:color w:val="auto"/>
+                <w:sz w:val="22"/>
+              </w:rPr>
+              <w:t>“La nave posee recursos suficientes para la tripulación.”</w:t>
+            </w:r>
+          </w:p>
+        </w:tc>
+        <w:tc>
+          <w:tcPr>
+            <w:tcW w:w="1393" w:type="dxa"/>
+            <w:hideMark/>
+          </w:tcPr>
+          <w:p>
+            <w:pPr>
+              <w:spacing w:after="0" w:line="240" w:lineRule="auto"/>
+              <w:ind w:left="0" w:firstLine="0"/>
+              <w:cnfStyle w:val="000000000000" w:firstRow="0" w:lastRow="0" w:firstColumn="0" w:lastColumn="0" w:oddVBand="0" w:evenVBand="0" w:oddHBand="0" w:evenHBand="0" w:firstRowFirstColumn="0" w:firstRowLastColumn="0" w:lastRowFirstColumn="0" w:lastRowLastColumn="0"/>
+              <w:rPr>
+                <w:rFonts w:eastAsia="Times New Roman"/>
+                <w:color w:val="auto"/>
+                <w:sz w:val="22"/>
+              </w:rPr>
+            </w:pPr>
+            <w:r>
+              <w:rPr>
+                <w:rFonts w:eastAsia="Times New Roman"/>
+                <w:color w:val="auto"/>
+                <w:sz w:val="22"/>
+              </w:rPr>
+              <w:t>Igual al esperado</w:t>
+            </w:r>
+          </w:p>
+        </w:tc>
+        <w:tc>
+          <w:tcPr>
+            <w:tcW w:w="1017" w:type="dxa"/>
+            <w:hideMark/>
+          </w:tcPr>
+          <w:p>
+            <w:pPr>
+              <w:spacing w:after="0" w:line="240" w:lineRule="auto"/>
+              <w:ind w:left="0" w:firstLine="0"/>
+              <w:cnfStyle w:val="000000000000" w:firstRow="0" w:lastRow="0" w:firstColumn="0" w:lastColumn="0" w:oddVBand="0" w:evenVBand="0" w:oddHBand="0" w:evenHBand="0" w:firstRowFirstColumn="0" w:firstRowLastColumn="0" w:lastRowFirstColumn="0" w:lastRowLastColumn="0"/>
+              <w:rPr>
+                <w:rFonts w:eastAsia="Times New Roman"/>
+                <w:color w:val="auto"/>
+                <w:sz w:val="22"/>
+              </w:rPr>
+            </w:pPr>
+            <w:r>
+              <w:rPr>
+                <w:rFonts w:eastAsia="Times New Roman"/>
+                <w:color w:val="auto"/>
+                <w:sz w:val="22"/>
+              </w:rPr>
+              <w:t>Exitoso</w:t>
+            </w:r>
+          </w:p>
+        </w:tc>
+      </w:tr>
+      <w:tr>
+        <w:trPr>
+          <w:cnfStyle w:val="000000100000" w:firstRow="0" w:lastRow="0" w:firstColumn="0" w:lastColumn="0" w:oddVBand="0" w:evenVBand="0" w:oddHBand="1" w:evenHBand="0" w:firstRowFirstColumn="0" w:firstRowLastColumn="0" w:lastRowFirstColumn="0" w:lastRowLastColumn="0"/>
+          <w:trHeight w:val="1405"/>
+        </w:trPr>
+        <w:tc>
+          <w:tcPr>
+            <w:cnfStyle w:val="001000000000" w:firstRow="0" w:lastRow="0" w:firstColumn="1" w:lastColumn="0" w:oddVBand="0" w:evenVBand="0" w:oddHBand="0" w:evenHBand="0" w:firstRowFirstColumn="0" w:firstRowLastColumn="0" w:lastRowFirstColumn="0" w:lastRowLastColumn="0"/>
+            <w:tcW w:w="955" w:type="dxa"/>
+            <w:hideMark/>
+          </w:tcPr>
+          <w:p>
+            <w:pPr>
+              <w:spacing w:after="0" w:line="240" w:lineRule="auto"/>
+              <w:ind w:left="0" w:firstLine="0"/>
+              <w:rPr>
+                <w:rFonts w:eastAsia="Times New Roman"/>
+                <w:color w:val="auto"/>
+                <w:sz w:val="22"/>
+              </w:rPr>
+            </w:pPr>
+            <w:r>
+              <w:rPr>
+                <w:rFonts w:eastAsia="Times New Roman"/>
+                <w:color w:val="auto"/>
+                <w:sz w:val="22"/>
+              </w:rPr>
+              <w:t>CP-03</w:t>
+            </w:r>
+          </w:p>
+        </w:tc>
+        <w:tc>
+          <w:tcPr>
+            <w:tcW w:w="1172" w:type="dxa"/>
+            <w:hideMark/>
+          </w:tcPr>
+          <w:p>
+            <w:pPr>
+              <w:spacing w:after="0" w:line="240" w:lineRule="auto"/>
+              <w:ind w:left="0" w:firstLine="0"/>
+              <w:cnfStyle w:val="000000100000" w:firstRow="0" w:lastRow="0" w:firstColumn="0" w:lastColumn="0" w:oddVBand="0" w:evenVBand="0" w:oddHBand="1" w:evenHBand="0" w:firstRowFirstColumn="0" w:firstRowLastColumn="0" w:lastRowFirstColumn="0" w:lastRowLastColumn="0"/>
+              <w:rPr>
+                <w:rFonts w:eastAsia="Times New Roman"/>
+                <w:color w:val="auto"/>
+                <w:sz w:val="20"/>
+                <w:szCs w:val="20"/>
+              </w:rPr>
+            </w:pPr>
+            <w:r>
+              <w:rPr>
+                <w:rFonts w:eastAsia="Times New Roman"/>
+                <w:color w:val="auto"/>
+                <w:sz w:val="20"/>
+                <w:szCs w:val="20"/>
+              </w:rPr>
+              <w:t>Ejercicio 3</w:t>
+            </w:r>
+          </w:p>
+        </w:tc>
+        <w:tc>
+          <w:tcPr>
+            <w:tcW w:w="1816" w:type="dxa"/>
+            <w:hideMark/>
+          </w:tcPr>
+          <w:p>
+            <w:pPr>
+              <w:spacing w:after="0" w:line="240" w:lineRule="auto"/>
+              <w:ind w:left="0" w:firstLine="0"/>
+              <w:cnfStyle w:val="000000100000" w:firstRow="0" w:lastRow="0" w:firstColumn="0" w:lastColumn="0" w:oddVBand="0" w:evenVBand="0" w:oddHBand="1" w:evenHBand="0" w:firstRowFirstColumn="0" w:firstRowLastColumn="0" w:lastRowFirstColumn="0" w:lastRowLastColumn="0"/>
+              <w:rPr>
+                <w:rFonts w:eastAsia="Times New Roman"/>
+                <w:color w:val="auto"/>
+                <w:sz w:val="22"/>
+              </w:rPr>
+            </w:pPr>
+            <w:r>
+              <w:rPr>
+                <w:rFonts w:eastAsia="Times New Roman"/>
+                <w:color w:val="auto"/>
+                <w:sz w:val="22"/>
+              </w:rPr>
+              <w:t>Oxígeno insuficiente</w:t>
+            </w:r>
+          </w:p>
+        </w:tc>
+        <w:tc>
+          <w:tcPr>
+            <w:tcW w:w="3145" w:type="dxa"/>
+            <w:hideMark/>
+          </w:tcPr>
+          <w:p>
+            <w:pPr>
+              <w:spacing w:after="0" w:line="276" w:lineRule="auto"/>
+              <w:ind w:left="0" w:firstLine="0"/>
+              <w:cnfStyle w:val="000000100000" w:firstRow="0" w:lastRow="0" w:firstColumn="0" w:lastColumn="0" w:oddVBand="0" w:evenVBand="0" w:oddHBand="1" w:evenHBand="0" w:firstRowFirstColumn="0" w:firstRowLastColumn="0" w:lastRowFirstColumn="0" w:lastRowLastColumn="0"/>
+              <w:rPr>
+                <w:rFonts w:eastAsia="Times New Roman"/>
+                <w:color w:val="auto"/>
+                <w:sz w:val="22"/>
+              </w:rPr>
+            </w:pPr>
+            <w:r>
+              <w:rPr>
+                <w:rFonts w:eastAsia="Times New Roman"/>
+                <w:color w:val="auto"/>
+                <w:sz w:val="22"/>
+              </w:rPr>
+              <w:t>Oxígeno disp</w:t>
+            </w:r>
+            <w:r>
+              <w:rPr>
+                <w:rFonts w:eastAsia="Times New Roman"/>
+                <w:color w:val="auto"/>
+                <w:sz w:val="22"/>
+              </w:rPr>
+              <w:t>onible</w:t>
+            </w:r>
+            <w:r>
+              <w:rPr>
+                <w:rFonts w:eastAsia="Times New Roman"/>
+                <w:color w:val="auto"/>
+                <w:sz w:val="22"/>
+              </w:rPr>
+              <w:t xml:space="preserve"> = 60 Oxígeno req</w:t>
+            </w:r>
+            <w:r>
+              <w:rPr>
+                <w:rFonts w:eastAsia="Times New Roman"/>
+                <w:color w:val="auto"/>
+                <w:sz w:val="22"/>
+              </w:rPr>
+              <w:t>uerido</w:t>
+            </w:r>
+            <w:r>
+              <w:rPr>
+                <w:rFonts w:eastAsia="Times New Roman"/>
+                <w:color w:val="auto"/>
+                <w:sz w:val="22"/>
+              </w:rPr>
+              <w:t xml:space="preserve"> = 65 Provisiones disp</w:t>
+            </w:r>
+            <w:r>
+              <w:rPr>
+                <w:rFonts w:eastAsia="Times New Roman"/>
+                <w:color w:val="auto"/>
+                <w:sz w:val="22"/>
+              </w:rPr>
+              <w:t>onibles</w:t>
+            </w:r>
+            <w:r>
+              <w:rPr>
+                <w:rFonts w:eastAsia="Times New Roman"/>
+                <w:color w:val="auto"/>
+                <w:sz w:val="22"/>
+              </w:rPr>
+              <w:t xml:space="preserve"> = 50 Provisiones req</w:t>
+            </w:r>
+            <w:r>
+              <w:rPr>
+                <w:rFonts w:eastAsia="Times New Roman"/>
+                <w:color w:val="auto"/>
+                <w:sz w:val="22"/>
+              </w:rPr>
+              <w:t xml:space="preserve">ueridas </w:t>
+            </w:r>
+            <w:r>
+              <w:rPr>
+                <w:rFonts w:eastAsia="Times New Roman"/>
+                <w:color w:val="auto"/>
+                <w:sz w:val="22"/>
+              </w:rPr>
+              <w:t>= 33</w:t>
+            </w:r>
+          </w:p>
+        </w:tc>
+        <w:tc>
+          <w:tcPr>
+            <w:tcW w:w="1559" w:type="dxa"/>
+            <w:hideMark/>
+          </w:tcPr>
+          <w:p>
+            <w:pPr>
+              <w:spacing w:after="0" w:line="240" w:lineRule="auto"/>
+              <w:ind w:left="0" w:firstLine="0"/>
+              <w:cnfStyle w:val="000000100000" w:firstRow="0" w:lastRow="0" w:firstColumn="0" w:lastColumn="0" w:oddVBand="0" w:evenVBand="0" w:oddHBand="1" w:evenHBand="0" w:firstRowFirstColumn="0" w:firstRowLastColumn="0" w:lastRowFirstColumn="0" w:lastRowLastColumn="0"/>
+              <w:rPr>
+                <w:rFonts w:eastAsia="Times New Roman"/>
+                <w:color w:val="auto"/>
+                <w:sz w:val="22"/>
+              </w:rPr>
+            </w:pPr>
+            <w:r>
+              <w:rPr>
+                <w:rFonts w:eastAsia="Times New Roman"/>
+                <w:color w:val="auto"/>
+                <w:sz w:val="22"/>
+              </w:rPr>
+              <w:t>“La nave no posee recursos suficientes para la tripulación.”</w:t>
+            </w:r>
+          </w:p>
+        </w:tc>
+        <w:tc>
+          <w:tcPr>
+            <w:tcW w:w="1393" w:type="dxa"/>
+            <w:hideMark/>
+          </w:tcPr>
+          <w:p>
+            <w:pPr>
+              <w:spacing w:after="0" w:line="240" w:lineRule="auto"/>
+              <w:ind w:left="0" w:firstLine="0"/>
+              <w:cnfStyle w:val="000000100000" w:firstRow="0" w:lastRow="0" w:firstColumn="0" w:lastColumn="0" w:oddVBand="0" w:evenVBand="0" w:oddHBand="1" w:evenHBand="0" w:firstRowFirstColumn="0" w:firstRowLastColumn="0" w:lastRowFirstColumn="0" w:lastRowLastColumn="0"/>
+              <w:rPr>
+                <w:rFonts w:eastAsia="Times New Roman"/>
+                <w:color w:val="auto"/>
+                <w:sz w:val="22"/>
+              </w:rPr>
+            </w:pPr>
+            <w:r>
+              <w:rPr>
+                <w:rFonts w:eastAsia="Times New Roman"/>
+                <w:color w:val="auto"/>
+                <w:sz w:val="22"/>
+              </w:rPr>
+              <w:t xml:space="preserve">Igual al esperado </w:t>
+            </w:r>
+          </w:p>
+        </w:tc>
+        <w:tc>
+          <w:tcPr>
+            <w:tcW w:w="1017" w:type="dxa"/>
+            <w:hideMark/>
+          </w:tcPr>
+          <w:p>
+            <w:pPr>
+              <w:spacing w:after="0" w:line="240" w:lineRule="auto"/>
+              <w:ind w:left="0" w:firstLine="0"/>
+              <w:cnfStyle w:val="000000100000" w:firstRow="0" w:lastRow="0" w:firstColumn="0" w:lastColumn="0" w:oddVBand="0" w:evenVBand="0" w:oddHBand="1" w:evenHBand="0" w:firstRowFirstColumn="0" w:firstRowLastColumn="0" w:lastRowFirstColumn="0" w:lastRowLastColumn="0"/>
+              <w:rPr>
+                <w:rFonts w:eastAsia="Times New Roman"/>
+                <w:color w:val="auto"/>
+                <w:sz w:val="22"/>
+              </w:rPr>
+            </w:pPr>
+            <w:r>
+              <w:rPr>
+                <w:rFonts w:eastAsia="Times New Roman"/>
+                <w:color w:val="auto"/>
+                <w:sz w:val="22"/>
+              </w:rPr>
+              <w:t>Exitoso</w:t>
+            </w:r>
+          </w:p>
+        </w:tc>
+      </w:tr>
+      <w:tr>
+        <w:trPr>
+          <w:trHeight w:val="1682"/>
+        </w:trPr>
+        <w:tc>
+          <w:tcPr>
+            <w:cnfStyle w:val="001000000000" w:firstRow="0" w:lastRow="0" w:firstColumn="1" w:lastColumn="0" w:oddVBand="0" w:evenVBand="0" w:oddHBand="0" w:evenHBand="0" w:firstRowFirstColumn="0" w:firstRowLastColumn="0" w:lastRowFirstColumn="0" w:lastRowLastColumn="0"/>
+            <w:tcW w:w="955" w:type="dxa"/>
+            <w:hideMark/>
+          </w:tcPr>
+          <w:p>
+            <w:pPr>
+              <w:spacing w:after="0" w:line="240" w:lineRule="auto"/>
+              <w:ind w:left="0" w:firstLine="0"/>
+              <w:rPr>
+                <w:rFonts w:eastAsia="Times New Roman"/>
+                <w:color w:val="auto"/>
+                <w:sz w:val="22"/>
+              </w:rPr>
+            </w:pPr>
+            <w:r>
+              <w:rPr>
+                <w:rFonts w:eastAsia="Times New Roman"/>
+                <w:color w:val="auto"/>
+                <w:sz w:val="22"/>
+              </w:rPr>
+              <w:lastRenderedPageBreak/>
+              <w:t>CP-04</w:t>
+            </w:r>
+          </w:p>
+        </w:tc>
+        <w:tc>
+          <w:tcPr>
+            <w:tcW w:w="1172" w:type="dxa"/>
+            <w:hideMark/>
+          </w:tcPr>
+          <w:p>
+            <w:pPr>
+              <w:spacing w:after="0" w:line="240" w:lineRule="auto"/>
+              <w:ind w:left="0" w:firstLine="0"/>
+              <w:cnfStyle w:val="000000000000" w:firstRow="0" w:lastRow="0" w:firstColumn="0" w:lastColumn="0" w:oddVBand="0" w:evenVBand="0" w:oddHBand="0" w:evenHBand="0" w:firstRowFirstColumn="0" w:firstRowLastColumn="0" w:lastRowFirstColumn="0" w:lastRowLastColumn="0"/>
+              <w:rPr>
+                <w:rFonts w:eastAsia="Times New Roman"/>
+                <w:color w:val="auto"/>
+                <w:sz w:val="20"/>
+                <w:szCs w:val="20"/>
+              </w:rPr>
+            </w:pPr>
+            <w:r>
+              <w:rPr>
+                <w:rFonts w:eastAsia="Times New Roman"/>
+                <w:color w:val="auto"/>
+                <w:sz w:val="20"/>
+                <w:szCs w:val="20"/>
+              </w:rPr>
+              <w:t>Ejercicio 3</w:t>
+            </w:r>
+          </w:p>
+        </w:tc>
+        <w:tc>
+          <w:tcPr>
+            <w:tcW w:w="1816" w:type="dxa"/>
+            <w:hideMark/>
+          </w:tcPr>
+          <w:p>
+            <w:pPr>
+              <w:spacing w:after="0" w:line="240" w:lineRule="auto"/>
+              <w:ind w:left="0" w:firstLine="0"/>
+              <w:cnfStyle w:val="000000000000" w:firstRow="0" w:lastRow="0" w:firstColumn="0" w:lastColumn="0" w:oddVBand="0" w:evenVBand="0" w:oddHBand="0" w:evenHBand="0" w:firstRowFirstColumn="0" w:firstRowLastColumn="0" w:lastRowFirstColumn="0" w:lastRowLastColumn="0"/>
+              <w:rPr>
+                <w:rFonts w:eastAsia="Times New Roman"/>
+                <w:color w:val="auto"/>
+                <w:sz w:val="22"/>
+              </w:rPr>
+            </w:pPr>
+            <w:r>
+              <w:rPr>
+                <w:rFonts w:eastAsia="Times New Roman"/>
+                <w:color w:val="auto"/>
+                <w:sz w:val="22"/>
+              </w:rPr>
+              <w:t>Provisiones insuficientes</w:t>
+            </w:r>
+          </w:p>
+        </w:tc>
+        <w:tc>
+          <w:tcPr>
+            <w:tcW w:w="3145" w:type="dxa"/>
+            <w:hideMark/>
+          </w:tcPr>
+          <w:p>
+            <w:pPr>
+              <w:spacing w:after="0" w:line="276" w:lineRule="auto"/>
+              <w:ind w:left="0" w:firstLine="0"/>
+              <w:cnfStyle w:val="000000000000" w:firstRow="0" w:lastRow="0" w:firstColumn="0" w:lastColumn="0" w:oddVBand="0" w:evenVBand="0" w:oddHBand="0" w:evenHBand="0" w:firstRowFirstColumn="0" w:firstRowLastColumn="0" w:lastRowFirstColumn="0" w:lastRowLastColumn="0"/>
+              <w:rPr>
+                <w:rFonts w:eastAsia="Times New Roman"/>
+                <w:color w:val="auto"/>
+                <w:sz w:val="22"/>
+              </w:rPr>
+            </w:pPr>
+            <w:r>
+              <w:rPr>
+                <w:rFonts w:eastAsia="Times New Roman"/>
+                <w:color w:val="auto"/>
+                <w:sz w:val="22"/>
+              </w:rPr>
+              <w:t>Oxígeno disp</w:t>
+            </w:r>
+            <w:r>
+              <w:rPr>
+                <w:rFonts w:eastAsia="Times New Roman"/>
+                <w:color w:val="auto"/>
+                <w:sz w:val="22"/>
+              </w:rPr>
+              <w:t>onible</w:t>
+            </w:r>
+            <w:r>
+              <w:rPr>
+                <w:rFonts w:eastAsia="Times New Roman"/>
+                <w:color w:val="auto"/>
+                <w:sz w:val="22"/>
+              </w:rPr>
+              <w:t xml:space="preserve"> = 100 Oxígeno req</w:t>
+            </w:r>
+            <w:r>
+              <w:rPr>
+                <w:rFonts w:eastAsia="Times New Roman"/>
+                <w:color w:val="auto"/>
+                <w:sz w:val="22"/>
+              </w:rPr>
+              <w:t>uerido</w:t>
+            </w:r>
+            <w:r>
+              <w:rPr>
+                <w:rFonts w:eastAsia="Times New Roman"/>
+                <w:color w:val="auto"/>
+                <w:sz w:val="22"/>
+              </w:rPr>
+              <w:t xml:space="preserve"> = 65</w:t>
+            </w:r>
+          </w:p>
+          <w:p>
+            <w:pPr>
+              <w:spacing w:after="0" w:line="276" w:lineRule="auto"/>
+              <w:ind w:left="0" w:firstLine="0"/>
+              <w:cnfStyle w:val="000000000000" w:firstRow="0" w:lastRow="0" w:firstColumn="0" w:lastColumn="0" w:oddVBand="0" w:evenVBand="0" w:oddHBand="0" w:evenHBand="0" w:firstRowFirstColumn="0" w:firstRowLastColumn="0" w:lastRowFirstColumn="0" w:lastRowLastColumn="0"/>
+              <w:rPr>
+                <w:rFonts w:eastAsia="Times New Roman"/>
+                <w:color w:val="auto"/>
+                <w:sz w:val="22"/>
+              </w:rPr>
+            </w:pPr>
+            <w:r>
+              <w:rPr>
+                <w:rFonts w:eastAsia="Times New Roman"/>
+                <w:color w:val="auto"/>
+                <w:sz w:val="22"/>
+              </w:rPr>
+              <w:t>Provisiones disp</w:t>
+            </w:r>
+            <w:r>
+              <w:rPr>
+                <w:rFonts w:eastAsia="Times New Roman"/>
+                <w:color w:val="auto"/>
+                <w:sz w:val="22"/>
+              </w:rPr>
+              <w:t>onibles</w:t>
+            </w:r>
+            <w:r>
+              <w:rPr>
+                <w:rFonts w:eastAsia="Times New Roman"/>
+                <w:color w:val="auto"/>
+                <w:sz w:val="22"/>
+              </w:rPr>
+              <w:t xml:space="preserve"> = 30 Provisiones req</w:t>
+            </w:r>
+            <w:r>
+              <w:rPr>
+                <w:rFonts w:eastAsia="Times New Roman"/>
+                <w:color w:val="auto"/>
+                <w:sz w:val="22"/>
+              </w:rPr>
+              <w:t>ueridas</w:t>
+            </w:r>
+            <w:r>
+              <w:rPr>
+                <w:rFonts w:eastAsia="Times New Roman"/>
+                <w:color w:val="auto"/>
+                <w:sz w:val="22"/>
+              </w:rPr>
+              <w:t xml:space="preserve"> = 33</w:t>
+            </w:r>
+          </w:p>
+        </w:tc>
+        <w:tc>
+          <w:tcPr>
+            <w:tcW w:w="1559" w:type="dxa"/>
+            <w:hideMark/>
+          </w:tcPr>
+          <w:p>
+            <w:pPr>
+              <w:spacing w:after="0" w:line="240" w:lineRule="auto"/>
+              <w:ind w:left="0" w:firstLine="0"/>
+              <w:cnfStyle w:val="000000000000" w:firstRow="0" w:lastRow="0" w:firstColumn="0" w:lastColumn="0" w:oddVBand="0" w:evenVBand="0" w:oddHBand="0" w:evenHBand="0" w:firstRowFirstColumn="0" w:firstRowLastColumn="0" w:lastRowFirstColumn="0" w:lastRowLastColumn="0"/>
+              <w:rPr>
+                <w:rFonts w:eastAsia="Times New Roman"/>
+                <w:color w:val="auto"/>
+                <w:sz w:val="22"/>
+              </w:rPr>
+            </w:pPr>
+            <w:r>
+              <w:rPr>
+                <w:rFonts w:eastAsia="Times New Roman"/>
+                <w:color w:val="auto"/>
+                <w:sz w:val="22"/>
+              </w:rPr>
+              <w:t>“La nave no posee recursos suficientes para la tripulación.”</w:t>
+            </w:r>
+          </w:p>
+        </w:tc>
+        <w:tc>
+          <w:tcPr>
+            <w:tcW w:w="1393" w:type="dxa"/>
+            <w:hideMark/>
+          </w:tcPr>
+          <w:p>
+            <w:pPr>
+              <w:spacing w:after="0" w:line="240" w:lineRule="auto"/>
+              <w:ind w:left="0" w:firstLine="0"/>
+              <w:cnfStyle w:val="000000000000" w:firstRow="0" w:lastRow="0" w:firstColumn="0" w:lastColumn="0" w:oddVBand="0" w:evenVBand="0" w:oddHBand="0" w:evenHBand="0" w:firstRowFirstColumn="0" w:firstRowLastColumn="0" w:lastRowFirstColumn="0" w:lastRowLastColumn="0"/>
+              <w:rPr>
+                <w:rFonts w:eastAsia="Times New Roman"/>
+                <w:color w:val="auto"/>
+                <w:sz w:val="22"/>
+              </w:rPr>
+            </w:pPr>
+            <w:r>
+              <w:rPr>
+                <w:rFonts w:eastAsia="Times New Roman"/>
+                <w:color w:val="auto"/>
+                <w:sz w:val="22"/>
+              </w:rPr>
+              <w:t>Igual al esperado</w:t>
+            </w:r>
+          </w:p>
+        </w:tc>
+        <w:tc>
+          <w:tcPr>
+            <w:tcW w:w="1017" w:type="dxa"/>
+            <w:hideMark/>
+          </w:tcPr>
+          <w:p>
+            <w:pPr>
+              <w:spacing w:after="0" w:line="240" w:lineRule="auto"/>
+              <w:ind w:left="0" w:firstLine="0"/>
+              <w:cnfStyle w:val="000000000000" w:firstRow="0" w:lastRow="0" w:firstColumn="0" w:lastColumn="0" w:oddVBand="0" w:evenVBand="0" w:oddHBand="0" w:evenHBand="0" w:firstRowFirstColumn="0" w:firstRowLastColumn="0" w:lastRowFirstColumn="0" w:lastRowLastColumn="0"/>
+              <w:rPr>
+                <w:rFonts w:eastAsia="Times New Roman"/>
+                <w:color w:val="auto"/>
+                <w:sz w:val="22"/>
+              </w:rPr>
+            </w:pPr>
+            <w:r>
+              <w:rPr>
+                <w:rFonts w:eastAsia="Times New Roman"/>
+                <w:color w:val="auto"/>
+                <w:sz w:val="22"/>
+              </w:rPr>
+              <w:t>Exitoso</w:t>
+            </w:r>
+          </w:p>
+        </w:tc>
+      </w:tr>
+      <w:tr>
+        <w:trPr>
+          <w:cnfStyle w:val="000000100000" w:firstRow="0" w:lastRow="0" w:firstColumn="0" w:lastColumn="0" w:oddVBand="0" w:evenVBand="0" w:oddHBand="1" w:evenHBand="0" w:firstRowFirstColumn="0" w:firstRowLastColumn="0" w:lastRowFirstColumn="0" w:lastRowLastColumn="0"/>
+          <w:trHeight w:val="1575"/>
+        </w:trPr>
+        <w:tc>
+          <w:tcPr>
+            <w:cnfStyle w:val="001000000000" w:firstRow="0" w:lastRow="0" w:firstColumn="1" w:lastColumn="0" w:oddVBand="0" w:evenVBand="0" w:oddHBand="0" w:evenHBand="0" w:firstRowFirstColumn="0" w:firstRowLastColumn="0" w:lastRowFirstColumn="0" w:lastRowLastColumn="0"/>
+            <w:tcW w:w="955" w:type="dxa"/>
+            <w:hideMark/>
+          </w:tcPr>
+          <w:p>
+            <w:pPr>
+              <w:spacing w:after="0" w:line="240" w:lineRule="auto"/>
+              <w:ind w:left="0" w:firstLine="0"/>
+              <w:rPr>
+                <w:rFonts w:eastAsia="Times New Roman"/>
+                <w:color w:val="auto"/>
+                <w:sz w:val="22"/>
+              </w:rPr>
+            </w:pPr>
+            <w:r>
+              <w:rPr>
+                <w:rFonts w:eastAsia="Times New Roman"/>
+                <w:color w:val="auto"/>
+                <w:sz w:val="22"/>
+              </w:rPr>
+              <w:t>CP-05</w:t>
+            </w:r>
+          </w:p>
+        </w:tc>
+        <w:tc>
+          <w:tcPr>
+            <w:tcW w:w="1172" w:type="dxa"/>
+            <w:hideMark/>
+          </w:tcPr>
+          <w:p>
+            <w:pPr>
+              <w:spacing w:after="0" w:line="240" w:lineRule="auto"/>
+              <w:ind w:left="0" w:firstLine="0"/>
+              <w:cnfStyle w:val="000000100000" w:firstRow="0" w:lastRow="0" w:firstColumn="0" w:lastColumn="0" w:oddVBand="0" w:evenVBand="0" w:oddHBand="1" w:evenHBand="0" w:firstRowFirstColumn="0" w:firstRowLastColumn="0" w:lastRowFirstColumn="0" w:lastRowLastColumn="0"/>
+              <w:rPr>
+                <w:rFonts w:eastAsia="Times New Roman"/>
+                <w:color w:val="auto"/>
+                <w:sz w:val="20"/>
+                <w:szCs w:val="20"/>
+              </w:rPr>
+            </w:pPr>
+            <w:r>
+              <w:rPr>
+                <w:rFonts w:eastAsia="Times New Roman"/>
+                <w:color w:val="auto"/>
+                <w:sz w:val="20"/>
+                <w:szCs w:val="20"/>
+              </w:rPr>
+              <w:t>Ejercicio 3</w:t>
+            </w:r>
+          </w:p>
+        </w:tc>
+        <w:tc>
+          <w:tcPr>
+            <w:tcW w:w="1816" w:type="dxa"/>
+            <w:hideMark/>
+          </w:tcPr>
+          <w:p>
+            <w:pPr>
+              <w:spacing w:after="0" w:line="240" w:lineRule="auto"/>
+              <w:ind w:left="0" w:firstLine="0"/>
+              <w:cnfStyle w:val="000000100000" w:firstRow="0" w:lastRow="0" w:firstColumn="0" w:lastColumn="0" w:oddVBand="0" w:evenVBand="0" w:oddHBand="1" w:evenHBand="0" w:firstRowFirstColumn="0" w:firstRowLastColumn="0" w:lastRowFirstColumn="0" w:lastRowLastColumn="0"/>
+              <w:rPr>
+                <w:rFonts w:eastAsia="Times New Roman"/>
+                <w:color w:val="auto"/>
+                <w:sz w:val="22"/>
+              </w:rPr>
+            </w:pPr>
+            <w:r>
+              <w:rPr>
+                <w:rFonts w:eastAsia="Times New Roman"/>
+                <w:color w:val="auto"/>
+                <w:sz w:val="22"/>
+              </w:rPr>
+              <w:t>Ambos recursos insuficientes</w:t>
+            </w:r>
+          </w:p>
+        </w:tc>
+        <w:tc>
+          <w:tcPr>
+            <w:tcW w:w="3145" w:type="dxa"/>
+            <w:hideMark/>
+          </w:tcPr>
+          <w:p>
+            <w:pPr>
+              <w:spacing w:after="0" w:line="276" w:lineRule="auto"/>
+              <w:ind w:left="0" w:firstLine="0"/>
+              <w:cnfStyle w:val="000000100000" w:firstRow="0" w:lastRow="0" w:firstColumn="0" w:lastColumn="0" w:oddVBand="0" w:evenVBand="0" w:oddHBand="1" w:evenHBand="0" w:firstRowFirstColumn="0" w:firstRowLastColumn="0" w:lastRowFirstColumn="0" w:lastRowLastColumn="0"/>
+              <w:rPr>
+                <w:rFonts w:eastAsia="Times New Roman"/>
+                <w:color w:val="auto"/>
+                <w:sz w:val="22"/>
+              </w:rPr>
+            </w:pPr>
+            <w:r>
+              <w:rPr>
+                <w:rFonts w:eastAsia="Times New Roman"/>
+                <w:color w:val="auto"/>
+                <w:sz w:val="22"/>
+              </w:rPr>
+              <w:t>Oxígeno disp</w:t>
+            </w:r>
+            <w:r>
+              <w:rPr>
+                <w:rFonts w:eastAsia="Times New Roman"/>
+                <w:color w:val="auto"/>
+                <w:sz w:val="22"/>
+              </w:rPr>
+              <w:t>onible</w:t>
+            </w:r>
+            <w:r>
+              <w:rPr>
+                <w:rFonts w:eastAsia="Times New Roman"/>
+                <w:color w:val="auto"/>
+                <w:sz w:val="22"/>
+              </w:rPr>
+              <w:t xml:space="preserve"> = 50 Oxígeno req</w:t>
+            </w:r>
+            <w:r>
+              <w:rPr>
+                <w:rFonts w:eastAsia="Times New Roman"/>
+                <w:color w:val="auto"/>
+                <w:sz w:val="22"/>
+              </w:rPr>
+              <w:t>uerido</w:t>
+            </w:r>
+            <w:r>
+              <w:rPr>
+                <w:rFonts w:eastAsia="Times New Roman"/>
+                <w:color w:val="auto"/>
+                <w:sz w:val="22"/>
+              </w:rPr>
+              <w:t xml:space="preserve"> = 65</w:t>
+            </w:r>
+          </w:p>
+          <w:p>
+            <w:pPr>
+              <w:spacing w:after="0" w:line="276" w:lineRule="auto"/>
+              <w:ind w:left="0" w:firstLine="0"/>
+              <w:cnfStyle w:val="000000100000" w:firstRow="0" w:lastRow="0" w:firstColumn="0" w:lastColumn="0" w:oddVBand="0" w:evenVBand="0" w:oddHBand="1" w:evenHBand="0" w:firstRowFirstColumn="0" w:firstRowLastColumn="0" w:lastRowFirstColumn="0" w:lastRowLastColumn="0"/>
+              <w:rPr>
+                <w:rFonts w:eastAsia="Times New Roman"/>
+                <w:color w:val="auto"/>
+                <w:sz w:val="22"/>
+              </w:rPr>
+            </w:pPr>
+            <w:r>
+              <w:rPr>
+                <w:rFonts w:eastAsia="Times New Roman"/>
+                <w:color w:val="auto"/>
+                <w:sz w:val="22"/>
+              </w:rPr>
+              <w:t>Provisiones disp</w:t>
+            </w:r>
+            <w:r>
+              <w:rPr>
+                <w:rFonts w:eastAsia="Times New Roman"/>
+                <w:color w:val="auto"/>
+                <w:sz w:val="22"/>
+              </w:rPr>
+              <w:t>onibles</w:t>
+            </w:r>
+            <w:r>
+              <w:rPr>
+                <w:rFonts w:eastAsia="Times New Roman"/>
+                <w:color w:val="auto"/>
+                <w:sz w:val="22"/>
+              </w:rPr>
+              <w:t xml:space="preserve"> = 20</w:t>
+            </w:r>
+          </w:p>
+          <w:p>
+            <w:pPr>
+              <w:spacing w:after="0" w:line="276" w:lineRule="auto"/>
+              <w:ind w:left="0" w:firstLine="0"/>
+              <w:cnfStyle w:val="000000100000" w:firstRow="0" w:lastRow="0" w:firstColumn="0" w:lastColumn="0" w:oddVBand="0" w:evenVBand="0" w:oddHBand="1" w:evenHBand="0" w:firstRowFirstColumn="0" w:firstRowLastColumn="0" w:lastRowFirstColumn="0" w:lastRowLastColumn="0"/>
+              <w:rPr>
+                <w:rFonts w:eastAsia="Times New Roman"/>
+                <w:color w:val="auto"/>
+                <w:sz w:val="22"/>
+              </w:rPr>
+            </w:pPr>
+            <w:r>
+              <w:rPr>
+                <w:rFonts w:eastAsia="Times New Roman"/>
+                <w:color w:val="auto"/>
+                <w:sz w:val="22"/>
+              </w:rPr>
+              <w:t>Provisiones req</w:t>
+            </w:r>
+            <w:r>
+              <w:rPr>
+                <w:rFonts w:eastAsia="Times New Roman"/>
+                <w:color w:val="auto"/>
+                <w:sz w:val="22"/>
+              </w:rPr>
+              <w:t>ueridas</w:t>
+            </w:r>
+            <w:r>
+              <w:rPr>
+                <w:rFonts w:eastAsia="Times New Roman"/>
+                <w:color w:val="auto"/>
+                <w:sz w:val="22"/>
+              </w:rPr>
+              <w:t xml:space="preserve"> = 33</w:t>
+            </w:r>
+          </w:p>
+        </w:tc>
+        <w:tc>
+          <w:tcPr>
+            <w:tcW w:w="1559" w:type="dxa"/>
+            <w:hideMark/>
+          </w:tcPr>
+          <w:p>
+            <w:pPr>
+              <w:spacing w:after="0" w:line="240" w:lineRule="auto"/>
+              <w:ind w:left="0" w:firstLine="0"/>
+              <w:cnfStyle w:val="000000100000" w:firstRow="0" w:lastRow="0" w:firstColumn="0" w:lastColumn="0" w:oddVBand="0" w:evenVBand="0" w:oddHBand="1" w:evenHBand="0" w:firstRowFirstColumn="0" w:firstRowLastColumn="0" w:lastRowFirstColumn="0" w:lastRowLastColumn="0"/>
+              <w:rPr>
+                <w:rFonts w:eastAsia="Times New Roman"/>
+                <w:color w:val="auto"/>
+                <w:sz w:val="22"/>
+              </w:rPr>
+            </w:pPr>
+            <w:r>
+              <w:rPr>
+                <w:rFonts w:eastAsia="Times New Roman"/>
+                <w:color w:val="auto"/>
+                <w:sz w:val="22"/>
+              </w:rPr>
+              <w:t>“La nave no posee recursos suficientes para la tripulación.”</w:t>
+            </w:r>
+          </w:p>
+        </w:tc>
+        <w:tc>
+          <w:tcPr>
+            <w:tcW w:w="1393" w:type="dxa"/>
+            <w:hideMark/>
+          </w:tcPr>
+          <w:p>
+            <w:pPr>
+              <w:spacing w:after="0" w:line="240" w:lineRule="auto"/>
+              <w:ind w:left="0" w:firstLine="0"/>
+              <w:cnfStyle w:val="000000100000" w:firstRow="0" w:lastRow="0" w:firstColumn="0" w:lastColumn="0" w:oddVBand="0" w:evenVBand="0" w:oddHBand="1" w:evenHBand="0" w:firstRowFirstColumn="0" w:firstRowLastColumn="0" w:lastRowFirstColumn="0" w:lastRowLastColumn="0"/>
+              <w:rPr>
+                <w:rFonts w:eastAsia="Times New Roman"/>
+                <w:color w:val="auto"/>
+                <w:sz w:val="22"/>
+              </w:rPr>
+            </w:pPr>
+            <w:r>
+              <w:rPr>
+                <w:rFonts w:eastAsia="Times New Roman"/>
+                <w:color w:val="auto"/>
+                <w:sz w:val="22"/>
+              </w:rPr>
+              <w:t>Igual al esperado</w:t>
+            </w:r>
+          </w:p>
+        </w:tc>
+        <w:tc>
+          <w:tcPr>
+            <w:tcW w:w="1017" w:type="dxa"/>
+            <w:hideMark/>
+          </w:tcPr>
+          <w:p>
+            <w:pPr>
+              <w:spacing w:after="0" w:line="240" w:lineRule="auto"/>
+              <w:ind w:left="0" w:firstLine="0"/>
+              <w:cnfStyle w:val="000000100000" w:firstRow="0" w:lastRow="0" w:firstColumn="0" w:lastColumn="0" w:oddVBand="0" w:evenVBand="0" w:oddHBand="1" w:evenHBand="0" w:firstRowFirstColumn="0" w:firstRowLastColumn="0" w:lastRowFirstColumn="0" w:lastRowLastColumn="0"/>
+              <w:rPr>
+                <w:rFonts w:eastAsia="Times New Roman"/>
+                <w:color w:val="auto"/>
+                <w:sz w:val="22"/>
+              </w:rPr>
+            </w:pPr>
+            <w:r>
+              <w:rPr>
+                <w:rFonts w:eastAsia="Times New Roman"/>
+                <w:color w:val="auto"/>
+                <w:sz w:val="22"/>
+              </w:rPr>
+              <w:t>Exitoso</w:t>
+            </w:r>
+          </w:p>
+        </w:tc>
+      </w:tr>
+    </w:tbl>
+    <w:p>
+      <w:pPr>
+        <w:spacing w:after="0" w:line="240" w:lineRule="auto"/>
+        <w:ind w:left="0" w:firstLine="0"/>
+        <w:jc w:val="center"/>
+        <w:rPr>
+          <w:rFonts w:eastAsia="Times New Roman"/>
+          <w:b/>
+          <w:bCs/>
+          <w:color w:val="auto"/>
+          <w:szCs w:val="24"/>
+        </w:rPr>
+      </w:pPr>
+      <w:r>
+        <w:rPr>
+          <w:rFonts w:eastAsia="Times New Roman"/>
+          <w:b/>
+          <w:bCs/>
+          <w:color w:val="auto"/>
+          <w:szCs w:val="24"/>
+        </w:rPr>
+        <w:t>CP-0</w:t>
+      </w:r>
+      <w:r>
+        <w:rPr>
+          <w:rFonts w:eastAsia="Times New Roman"/>
+          <w:b/>
+          <w:bCs/>
+          <w:color w:val="auto"/>
+          <w:szCs w:val="24"/>
+        </w:rPr>
+        <w:t>1</w:t>
+      </w:r>
+      <w:r>
+        <w:rPr>
+          <w:rFonts w:eastAsia="Times New Roman"/>
+          <w:b/>
+          <w:bCs/>
+          <w:color w:val="auto"/>
+          <w:szCs w:val="24"/>
+        </w:rPr>
+        <w:t>: evidencia con captura de pantalla</w:t>
+      </w:r>
+    </w:p>
+    <w:p>
+      <w:pPr>
+        <w:spacing w:after="0" w:line="240" w:lineRule="auto"/>
+        <w:ind w:left="0" w:firstLine="0"/>
+        <w:rPr>
+          <w:rFonts w:eastAsia="Times New Roman"/>
+          <w:color w:val="auto"/>
+          <w:szCs w:val="24"/>
+        </w:rPr>
+      </w:pPr>
+      <w:r>
+        <w:rPr>
+          <w:rFonts w:eastAsia="Times New Roman"/>
+          <w:color w:val="auto"/>
+          <w:szCs w:val="24"/>
+        </w:rPr>
+        <w:drawing>
+          <wp:anchor distT="0" distB="0" distL="114300" distR="114300" simplePos="0" relativeHeight="251668480" behindDoc="0" locked="0" layoutInCell="1" allowOverlap="1" wp14:anchorId="4053F7FC" wp14:editId="5B17F616">
+            <wp:simplePos x="0" y="0"/>
+            <wp:positionH relativeFrom="margin">
+              <wp:align>left</wp:align>
+            </wp:positionH>
+            <wp:positionV relativeFrom="page">
+              <wp:posOffset>3314700</wp:posOffset>
+            </wp:positionV>
+            <wp:extent cx="5172710" cy="1838325"/>
+            <wp:effectExtent l="0" t="0" r="8890" b="9525"/>
+            <wp:wrapSquare wrapText="bothSides"/>
+            <wp:docPr id="17" name="Imagen 17"/>
+            <wp:cNvGraphicFramePr>
+              <a:graphicFrameLocks xmlns:a="http://schemas.openxmlformats.org/drawingml/2006/main" noChangeAspect="1"/>
+            </wp:cNvGraphicFramePr>
+            <a:graphic xmlns:a="http://schemas.openxmlformats.org/drawingml/2006/main">
+              <a:graphicData uri="http://schemas.openxmlformats.org/drawingml/2006/picture">
+                <pic:pic xmlns:pic="http://schemas.openxmlformats.org/drawingml/2006/picture">
+                  <pic:nvPicPr>
+                    <pic:cNvPr id="1" name=""/>
+                    <pic:cNvPicPr/>
+                  </pic:nvPicPr>
+                  <pic:blipFill>
+                    <a:blip r:embed="rId19">
+                      <a:extLst>
+                        <a:ext uri="{28A0092B-C50C-407E-A947-70E740481C1C}">
+                          <a14:useLocalDpi xmlns:a14="http://schemas.microsoft.com/office/drawing/2010/main" val="0"/>
+                        </a:ext>
+                      </a:extLst>
+                    </a:blip>
+                    <a:stretch>
+                      <a:fillRect/>
+                    </a:stretch>
+                  </pic:blipFill>
+                  <pic:spPr>
+                    <a:xfrm>
+                      <a:off x="0" y="0"/>
+                      <a:ext cx="5172710" cy="1838325"/>
+                    </a:xfrm>
+                    <a:prstGeom prst="rect">
+                      <a:avLst/>
+                    </a:prstGeom>
+                  </pic:spPr>
+                </pic:pic>
+              </a:graphicData>
+            </a:graphic>
+          </wp:anchor>
+        </w:drawing>
+      </w:r>
+    </w:p>
+    <w:p>
+      <w:pPr>
+        <w:ind w:left="0" w:firstLine="0"/>
+        <w:rPr>
+          <w:rFonts w:eastAsia="Times New Roman"/>
+          <w:szCs w:val="24"/>
+        </w:rPr>
+      </w:pPr>
+    </w:p>
+    <w:p>
+      <w:pPr>
+        <w:ind w:left="0" w:firstLine="0"/>
+        <w:rPr>
+          <w:rFonts w:eastAsia="Times New Roman"/>
+          <w:szCs w:val="24"/>
+        </w:rPr>
+      </w:pPr>
+    </w:p>
+    <w:p>
+      <w:pPr>
+        <w:ind w:left="0" w:firstLine="0"/>
+        <w:rPr>
+          <w:rFonts w:eastAsia="Times New Roman"/>
+          <w:szCs w:val="24"/>
+        </w:rPr>
+      </w:pPr>
+    </w:p>
+    <w:p>
+      <w:pPr>
+        <w:ind w:left="0" w:firstLine="0"/>
+        <w:rPr>
+          <w:rFonts w:eastAsia="Times New Roman"/>
+          <w:szCs w:val="24"/>
+        </w:rPr>
+      </w:pPr>
+    </w:p>
+    <w:p>
+      <w:pPr>
+        <w:ind w:left="0" w:firstLine="0"/>
+        <w:rPr>
+          <w:rFonts w:eastAsia="Times New Roman"/>
+          <w:szCs w:val="24"/>
+        </w:rPr>
+      </w:pPr>
+    </w:p>
+    <w:p>
+      <w:pPr>
+        <w:ind w:left="0" w:firstLine="0"/>
+        <w:jc w:val="center"/>
+        <w:rPr>
+          <w:rFonts w:eastAsia="Times New Roman"/>
+          <w:b/>
+          <w:bCs/>
+          <w:szCs w:val="24"/>
+        </w:rPr>
+      </w:pPr>
+      <w:bookmarkStart w:id="9" w:name="_Hlk242721793"/>
+      <w:r>
+        <w:rPr>
+          <w:rFonts w:eastAsia="Times New Roman"/>
+          <w:szCs w:val="24"/>
+        </w:rPr>
+        <w:drawing>
+          <wp:anchor distT="0" distB="0" distL="114300" distR="114300" simplePos="0" relativeHeight="251669504" behindDoc="0" locked="0" layoutInCell="1" allowOverlap="1" wp14:anchorId="1944F498" wp14:editId="32A50BE0">
+            <wp:simplePos x="0" y="0"/>
+            <wp:positionH relativeFrom="margin">
+              <wp:align>left</wp:align>
+            </wp:positionH>
+            <wp:positionV relativeFrom="paragraph">
+              <wp:posOffset>269875</wp:posOffset>
+            </wp:positionV>
+            <wp:extent cx="5134692" cy="1771897"/>
+            <wp:effectExtent l="0" t="0" r="8890" b="0"/>
+            <wp:wrapSquare wrapText="bothSides"/>
+            <wp:docPr id="18" name="Imagen 18"/>
+            <wp:cNvGraphicFramePr>
+              <a:graphicFrameLocks xmlns:a="http://schemas.openxmlformats.org/drawingml/2006/main" noChangeAspect="1"/>
+            </wp:cNvGraphicFramePr>
+            <a:graphic xmlns:a="http://schemas.openxmlformats.org/drawingml/2006/main">
+              <a:graphicData uri="http://schemas.openxmlformats.org/drawingml/2006/picture">
+                <pic:pic xmlns:pic="http://schemas.openxmlformats.org/drawingml/2006/picture">
+                  <pic:nvPicPr>
+                    <pic:cNvPr id="1" name=""/>
+                    <pic:cNvPicPr/>
+                  </pic:nvPicPr>
+                  <pic:blipFill>
+                    <a:blip r:embed="rId20">
+                      <a:extLst>
+                        <a:ext uri="{28A0092B-C50C-407E-A947-70E740481C1C}">
+                          <a14:useLocalDpi xmlns:a14="http://schemas.microsoft.com/office/drawing/2010/main" val="0"/>
+                        </a:ext>
+                      </a:extLst>
+                    </a:blip>
+                    <a:stretch>
+                      <a:fillRect/>
+                    </a:stretch>
+                  </pic:blipFill>
+                  <pic:spPr>
+                    <a:xfrm>
+                      <a:off x="0" y="0"/>
+                      <a:ext cx="5134692" cy="1771897"/>
+                    </a:xfrm>
+                    <a:prstGeom prst="rect">
+                      <a:avLst/>
+                    </a:prstGeom>
+                  </pic:spPr>
+                </pic:pic>
+              </a:graphicData>
+            </a:graphic>
+          </wp:anchor>
+        </w:drawing>
+      </w:r>
+      <w:bookmarkStart w:id="10" w:name="_Hlk242721808"/>
+      <w:r>
+        <w:rPr>
+          <w:rFonts w:eastAsia="Times New Roman"/>
+          <w:b/>
+          <w:bCs/>
+          <w:szCs w:val="24"/>
+        </w:rPr>
+        <w:t>CP-0</w:t>
+      </w:r>
+      <w:r>
+        <w:rPr>
+          <w:rFonts w:eastAsia="Times New Roman"/>
+          <w:b/>
+          <w:bCs/>
+          <w:szCs w:val="24"/>
+        </w:rPr>
+        <w:t>2</w:t>
+      </w:r>
+      <w:r>
+        <w:rPr>
+          <w:rFonts w:eastAsia="Times New Roman"/>
+          <w:b/>
+          <w:bCs/>
+          <w:szCs w:val="24"/>
+        </w:rPr>
+        <w:t>: evidencia con captura de pantalla</w:t>
+      </w:r>
+      <w:bookmarkEnd w:id="10"/>
+    </w:p>
+    <w:bookmarkEnd w:id="9"/>
+    <w:p>
+      <w:pPr>
+        <w:rPr>
+          <w:rFonts w:eastAsia="Times New Roman"/>
+          <w:szCs w:val="24"/>
+        </w:rPr>
+      </w:pPr>
+    </w:p>
+    <w:p>
+      <w:pPr>
+        <w:rPr>
+          <w:rFonts w:eastAsia="Times New Roman"/>
+          <w:szCs w:val="24"/>
+        </w:rPr>
+      </w:pPr>
+    </w:p>
+    <w:p>
+      <w:pPr>
+        <w:rPr>
+          <w:rFonts w:eastAsia="Times New Roman"/>
+          <w:szCs w:val="24"/>
+        </w:rPr>
+      </w:pPr>
+    </w:p>
+    <w:p>
+      <w:pPr>
+        <w:rPr>
+          <w:rFonts w:eastAsia="Times New Roman"/>
+          <w:szCs w:val="24"/>
+        </w:rPr>
+      </w:pPr>
+    </w:p>
+    <w:p>
+      <w:pPr>
+        <w:ind w:left="0" w:firstLine="0"/>
+        <w:jc w:val="center"/>
+        <w:rPr>
+          <w:rFonts w:eastAsia="Times New Roman"/>
+          <w:b/>
+          <w:bCs/>
+          <w:szCs w:val="24"/>
+        </w:rPr>
+      </w:pPr>
+      <w:r>
+        <w:rPr>
+          <w:rFonts w:eastAsia="Times New Roman"/>
+          <w:b/>
+          <w:bCs/>
+          <w:szCs w:val="24"/>
+        </w:rPr>
+        <w:drawing>
+          <wp:anchor distT="0" distB="0" distL="114300" distR="114300" simplePos="0" relativeHeight="251670528" behindDoc="0" locked="0" layoutInCell="1" allowOverlap="1" wp14:anchorId="770F01EF" wp14:editId="3FFF7ECA">
+            <wp:simplePos x="0" y="0"/>
+            <wp:positionH relativeFrom="column">
+              <wp:posOffset>-38100</wp:posOffset>
+            </wp:positionH>
+            <wp:positionV relativeFrom="paragraph">
+              <wp:posOffset>382905</wp:posOffset>
+            </wp:positionV>
+            <wp:extent cx="5191125" cy="1657350"/>
+            <wp:effectExtent l="0" t="0" r="9525" b="0"/>
+            <wp:wrapSquare wrapText="bothSides"/>
+            <wp:docPr id="19" name="Imagen 19"/>
+            <wp:cNvGraphicFramePr>
+              <a:graphicFrameLocks xmlns:a="http://schemas.openxmlformats.org/drawingml/2006/main" noChangeAspect="1"/>
+            </wp:cNvGraphicFramePr>
+            <a:graphic xmlns:a="http://schemas.openxmlformats.org/drawingml/2006/main">
+              <a:graphicData uri="http://schemas.openxmlformats.org/drawingml/2006/picture">
+                <pic:pic xmlns:pic="http://schemas.openxmlformats.org/drawingml/2006/picture">
+                  <pic:nvPicPr>
+                    <pic:cNvPr id="1" name=""/>
+                    <pic:cNvPicPr/>
+                  </pic:nvPicPr>
+                  <pic:blipFill>
+                    <a:blip r:embed="rId21">
+                      <a:extLst>
+                        <a:ext uri="{28A0092B-C50C-407E-A947-70E740481C1C}">
+                          <a14:useLocalDpi xmlns:a14="http://schemas.microsoft.com/office/drawing/2010/main" val="0"/>
+                        </a:ext>
+                      </a:extLst>
+                    </a:blip>
+                    <a:stretch>
+                      <a:fillRect/>
+                    </a:stretch>
+                  </pic:blipFill>
+                  <pic:spPr>
+                    <a:xfrm>
+                      <a:off x="0" y="0"/>
+                      <a:ext cx="5191125" cy="1657350"/>
+                    </a:xfrm>
+                    <a:prstGeom prst="rect">
+                      <a:avLst/>
+                    </a:prstGeom>
+                  </pic:spPr>
+                </pic:pic>
+              </a:graphicData>
+            </a:graphic>
+            <wp14:sizeRelH relativeFrom="margin">
+              <wp14:pctWidth>0</wp14:pctWidth>
+            </wp14:sizeRelH>
+          </wp:anchor>
+        </w:drawing>
+      </w:r>
+      <w:bookmarkStart w:id="11" w:name="_Hlk242721930"/>
+      <w:r>
+        <w:rPr>
+          <w:rFonts w:eastAsia="Times New Roman"/>
+          <w:b/>
+          <w:bCs/>
+          <w:szCs w:val="24"/>
+        </w:rPr>
+        <w:t>CP-0</w:t>
+      </w:r>
+      <w:r>
+        <w:rPr>
+          <w:rFonts w:eastAsia="Times New Roman"/>
+          <w:b/>
+          <w:bCs/>
+          <w:szCs w:val="24"/>
+        </w:rPr>
+        <w:t>3</w:t>
+      </w:r>
+      <w:r>
+        <w:rPr>
+          <w:rFonts w:eastAsia="Times New Roman"/>
+          <w:b/>
+          <w:bCs/>
+          <w:szCs w:val="24"/>
+        </w:rPr>
+        <w:t>: evidencia con captura de pantalla</w:t>
+      </w:r>
+      <w:bookmarkEnd w:id="11"/>
+    </w:p>
+    <w:p>
+      <w:pPr>
+        <w:ind w:left="0" w:firstLine="0"/>
+        <w:jc w:val="center"/>
+        <w:rPr>
+          <w:rFonts w:eastAsia="Times New Roman"/>
+          <w:b/>
+          <w:bCs/>
+          <w:szCs w:val="24"/>
+        </w:rPr>
+      </w:pPr>
+    </w:p>
+    <w:p>
+      <w:pPr>
+        <w:rPr>
+          <w:sz w:val="22"/>
+        </w:rPr>
+      </w:pPr>
+    </w:p>
+    <w:p>
+      <w:pPr>
+        <w:ind w:left="0" w:firstLine="0"/>
+        <w:jc w:val="center"/>
+        <w:rPr>
+          <w:b/>
+          <w:bCs/>
+          <w:sz w:val="22"/>
+        </w:rPr>
+      </w:pPr>
+      <w:r>
+        <w:rPr>
+          <w:b/>
+          <w:bCs/>
+          <w:sz w:val="22"/>
+        </w:rPr>
+        <w:lastRenderedPageBreak/>
+        <w:drawing>
+          <wp:anchor distT="0" distB="0" distL="114300" distR="114300" simplePos="0" relativeHeight="251671552" behindDoc="0" locked="0" layoutInCell="1" allowOverlap="1" wp14:anchorId="79AC4A44" wp14:editId="60673265">
+            <wp:simplePos x="0" y="0"/>
+            <wp:positionH relativeFrom="margin">
+              <wp:align>left</wp:align>
+            </wp:positionH>
+            <wp:positionV relativeFrom="paragraph">
+              <wp:posOffset>355600</wp:posOffset>
+            </wp:positionV>
+            <wp:extent cx="5087060" cy="1714739"/>
+            <wp:effectExtent l="0" t="0" r="0" b="0"/>
+            <wp:wrapSquare wrapText="bothSides"/>
+            <wp:docPr id="20" name="Imagen 20"/>
+            <wp:cNvGraphicFramePr>
+              <a:graphicFrameLocks xmlns:a="http://schemas.openxmlformats.org/drawingml/2006/main" noChangeAspect="1"/>
+            </wp:cNvGraphicFramePr>
+            <a:graphic xmlns:a="http://schemas.openxmlformats.org/drawingml/2006/main">
+              <a:graphicData uri="http://schemas.openxmlformats.org/drawingml/2006/picture">
+                <pic:pic xmlns:pic="http://schemas.openxmlformats.org/drawingml/2006/picture">
+                  <pic:nvPicPr>
+                    <pic:cNvPr id="1" name=""/>
+                    <pic:cNvPicPr/>
+                  </pic:nvPicPr>
+                  <pic:blipFill>
+                    <a:blip r:embed="rId22">
+                      <a:extLst>
+                        <a:ext uri="{28A0092B-C50C-407E-A947-70E740481C1C}">
+                          <a14:useLocalDpi xmlns:a14="http://schemas.microsoft.com/office/drawing/2010/main" val="0"/>
+                        </a:ext>
+                      </a:extLst>
+                    </a:blip>
+                    <a:stretch>
+                      <a:fillRect/>
+                    </a:stretch>
+                  </pic:blipFill>
+                  <pic:spPr>
+                    <a:xfrm>
+                      <a:off x="0" y="0"/>
+                      <a:ext cx="5087060" cy="1714739"/>
+                    </a:xfrm>
+                    <a:prstGeom prst="rect">
+                      <a:avLst/>
+                    </a:prstGeom>
+                  </pic:spPr>
+                </pic:pic>
+              </a:graphicData>
+            </a:graphic>
+          </wp:anchor>
+        </w:drawing>
+      </w:r>
+      <w:bookmarkStart w:id="12" w:name="_Hlk242722034"/>
+      <w:r>
+        <w:rPr>
+          <w:b/>
+          <w:bCs/>
+          <w:sz w:val="22"/>
+        </w:rPr>
+        <w:t>CP-0</w:t>
+      </w:r>
+      <w:r>
+        <w:rPr>
+          <w:b/>
+          <w:bCs/>
+          <w:sz w:val="22"/>
+        </w:rPr>
+        <w:t>4</w:t>
+      </w:r>
+      <w:r>
+        <w:rPr>
+          <w:b/>
+          <w:bCs/>
+          <w:sz w:val="22"/>
+        </w:rPr>
+        <w:t>: evidencia con captura de pantalla</w:t>
+      </w:r>
+      <w:bookmarkEnd w:id="12"/>
+    </w:p>
+    <w:p>
+      <w:pPr>
+        <w:ind w:left="0" w:firstLine="0"/>
+        <w:jc w:val="center"/>
+        <w:rPr>
+          <w:b/>
+          <w:bCs/>
+          <w:sz w:val="22"/>
+        </w:rPr>
+      </w:pPr>
+    </w:p>
+    <w:p>
+      <w:pPr>
+        <w:rPr>
+          <w:sz w:val="22"/>
+        </w:rPr>
+      </w:pPr>
+    </w:p>
+    <w:p>
+      <w:pPr>
+        <w:rPr>
+          <w:sz w:val="22"/>
+        </w:rPr>
+      </w:pPr>
+    </w:p>
+    <w:p>
+      <w:pPr>
+        <w:rPr>
+          <w:sz w:val="22"/>
+        </w:rPr>
+      </w:pPr>
+    </w:p>
+    <w:p>
+      <w:pPr>
+        <w:rPr>
+          <w:sz w:val="22"/>
+        </w:rPr>
+      </w:pPr>
+    </w:p>
+    <w:p>
+      <w:pPr>
+        <w:tabs>
+          <w:tab w:val="left" w:pos="5460"/>
+        </w:tabs>
+        <w:ind w:left="0" w:firstLine="0"/>
+        <w:jc w:val="center"/>
+        <w:rPr>
+          <w:b/>
+          <w:bCs/>
+          <w:sz w:val="22"/>
+        </w:rPr>
+      </w:pPr>
+      <w:r>
+        <w:rPr>
+          <w:b/>
+          <w:bCs/>
+          <w:sz w:val="22"/>
+        </w:rPr>
+        <w:drawing>
+          <wp:anchor distT="0" distB="0" distL="114300" distR="114300" simplePos="0" relativeHeight="251672576" behindDoc="0" locked="0" layoutInCell="1" allowOverlap="1" wp14:anchorId="160B4C17" wp14:editId="20C874E9">
+            <wp:simplePos x="0" y="0"/>
+            <wp:positionH relativeFrom="column">
+              <wp:posOffset>104775</wp:posOffset>
+            </wp:positionH>
+            <wp:positionV relativeFrom="paragraph">
+              <wp:posOffset>395605</wp:posOffset>
+            </wp:positionV>
+            <wp:extent cx="4982210" cy="1751965"/>
+            <wp:effectExtent l="0" t="0" r="8890" b="635"/>
+            <wp:wrapSquare wrapText="bothSides"/>
+            <wp:docPr id="21" name="Imagen 21"/>
+            <wp:cNvGraphicFramePr>
+              <a:graphicFrameLocks xmlns:a="http://schemas.openxmlformats.org/drawingml/2006/main" noChangeAspect="1"/>
+            </wp:cNvGraphicFramePr>
+            <a:graphic xmlns:a="http://schemas.openxmlformats.org/drawingml/2006/main">
+              <a:graphicData uri="http://schemas.openxmlformats.org/drawingml/2006/picture">
+                <pic:pic xmlns:pic="http://schemas.openxmlformats.org/drawingml/2006/picture">
+                  <pic:nvPicPr>
+                    <pic:cNvPr id="1" name=""/>
+                    <pic:cNvPicPr/>
+                  </pic:nvPicPr>
+                  <pic:blipFill>
+                    <a:blip r:embed="rId23">
+                      <a:extLst>
+                        <a:ext uri="{28A0092B-C50C-407E-A947-70E740481C1C}">
+                          <a14:useLocalDpi xmlns:a14="http://schemas.microsoft.com/office/drawing/2010/main" val="0"/>
+                        </a:ext>
+                      </a:extLst>
+                    </a:blip>
+                    <a:stretch>
+                      <a:fillRect/>
+                    </a:stretch>
+                  </pic:blipFill>
+                  <pic:spPr>
+                    <a:xfrm>
+                      <a:off x="0" y="0"/>
+                      <a:ext cx="4982210" cy="1751965"/>
+                    </a:xfrm>
+                    <a:prstGeom prst="rect">
+                      <a:avLst/>
+                    </a:prstGeom>
+                  </pic:spPr>
+                </pic:pic>
+              </a:graphicData>
+            </a:graphic>
+            <wp14:sizeRelH relativeFrom="margin">
+              <wp14:pctWidth>0</wp14:pctWidth>
+            </wp14:sizeRelH>
+          </wp:anchor>
+        </w:drawing>
+      </w:r>
+      <w:r>
+        <w:rPr>
+          <w:b/>
+          <w:bCs/>
+          <w:sz w:val="22"/>
+        </w:rPr>
+        <w:t>CP-0</w:t>
+      </w:r>
+      <w:r>
+        <w:rPr>
+          <w:b/>
+          <w:bCs/>
+          <w:sz w:val="22"/>
+        </w:rPr>
+        <w:t>5</w:t>
+      </w:r>
+      <w:r>
+        <w:rPr>
+          <w:b/>
+          <w:bCs/>
+          <w:sz w:val="22"/>
+        </w:rPr>
+        <w:t>: evidencia con captura de pantalla</w:t>
+      </w:r>
+    </w:p>
+    <w:p>
+      <w:pPr>
+        <w:tabs>
+          <w:tab w:val="left" w:pos="5460"/>
+        </w:tabs>
+        <w:ind w:left="0" w:firstLine="0"/>
+        <w:jc w:val="center"/>
+        <w:rPr>
+          <w:b/>
+          <w:bCs/>
+          <w:sz w:val="22"/>
+        </w:rPr>
+      </w:pPr>
     </w:p>
     <w:sectPr>
       <w:pgSz w:w="11920" w:h="16840"/>

</xml_diff>

<commit_message>
Agrega ejercicio 4: autorizacion inicial de lanzamiento
</commit_message>
<xml_diff>
--- a/documentación/Primer avance del proyecto.docx
+++ b/documentación/Primer avance del proyecto.docx
@@ -11649,15 +11649,15 @@
     <w:tbl>
       <w:tblPr>
         <w:tblStyle w:val="Tabladelista3-nfasis3"/>
-        <w:tblW w:w="10065" w:type="dxa"/>
-        <w:tblInd w:w="-572" w:type="dxa"/>
+        <w:tblW w:w="10916" w:type="dxa"/>
+        <w:tblInd w:w="-998" w:type="dxa"/>
         <w:tblLook w:val="04A0" w:firstRow="1" w:lastRow="0" w:firstColumn="1" w:lastColumn="0" w:noHBand="0" w:noVBand="1"/>
       </w:tblPr>
       <w:tblGrid>
-        <w:gridCol w:w="3216"/>
-        <w:gridCol w:w="1305"/>
-        <w:gridCol w:w="3524"/>
-        <w:gridCol w:w="2020"/>
+        <w:gridCol w:w="2836"/>
+        <w:gridCol w:w="1701"/>
+        <w:gridCol w:w="4678"/>
+        <w:gridCol w:w="1701"/>
       </w:tblGrid>
       <w:tr>
         <w:trPr>
@@ -11666,7 +11666,7 @@
         <w:tc>
           <w:tcPr>
             <w:cnfStyle w:val="001000000100" w:firstRow="0" w:lastRow="0" w:firstColumn="1" w:lastColumn="0" w:oddVBand="0" w:evenVBand="0" w:oddHBand="0" w:evenHBand="0" w:firstRowFirstColumn="1" w:firstRowLastColumn="0" w:lastRowFirstColumn="0" w:lastRowLastColumn="0"/>
-            <w:tcW w:w="3216" w:type="dxa"/>
+            <w:tcW w:w="2836" w:type="dxa"/>
             <w:hideMark/>
           </w:tcPr>
           <w:p>
@@ -11692,7 +11692,7 @@
         </w:tc>
         <w:tc>
           <w:tcPr>
-            <w:tcW w:w="0" w:type="auto"/>
+            <w:tcW w:w="1701" w:type="dxa"/>
             <w:hideMark/>
           </w:tcPr>
           <w:p>
@@ -11719,7 +11719,7 @@
         </w:tc>
         <w:tc>
           <w:tcPr>
-            <w:tcW w:w="0" w:type="auto"/>
+            <w:tcW w:w="4678" w:type="dxa"/>
             <w:hideMark/>
           </w:tcPr>
           <w:p>
@@ -11746,7 +11746,7 @@
         </w:tc>
         <w:tc>
           <w:tcPr>
-            <w:tcW w:w="2020" w:type="dxa"/>
+            <w:tcW w:w="1701" w:type="dxa"/>
             <w:hideMark/>
           </w:tcPr>
           <w:p>
@@ -11779,7 +11779,7 @@
         <w:tc>
           <w:tcPr>
             <w:cnfStyle w:val="001000000000" w:firstRow="0" w:lastRow="0" w:firstColumn="1" w:lastColumn="0" w:oddVBand="0" w:evenVBand="0" w:oddHBand="0" w:evenHBand="0" w:firstRowFirstColumn="0" w:firstRowLastColumn="0" w:lastRowFirstColumn="0" w:lastRowLastColumn="0"/>
-            <w:tcW w:w="3216" w:type="dxa"/>
+            <w:tcW w:w="2836" w:type="dxa"/>
             <w:hideMark/>
           </w:tcPr>
           <w:p>
@@ -11788,6 +11788,8 @@
               <w:ind w:left="0" w:firstLine="0"/>
               <w:rPr>
                 <w:rFonts w:eastAsia="Times New Roman"/>
+                <w:b w:val="0"/>
+                <w:bCs w:val="0"/>
                 <w:color w:val="auto"/>
                 <w:szCs w:val="24"/>
               </w:rPr>
@@ -11796,6 +11798,8 @@
             <w:r>
               <w:rPr>
                 <w:rFonts w:eastAsia="Times New Roman"/>
+                <w:b w:val="0"/>
+                <w:bCs w:val="0"/>
                 <w:color w:val="auto"/>
                 <w:szCs w:val="24"/>
               </w:rPr>
@@ -11806,13 +11810,14 @@
         </w:tc>
         <w:tc>
           <w:tcPr>
-            <w:tcW w:w="0" w:type="auto"/>
+            <w:tcW w:w="1701" w:type="dxa"/>
             <w:hideMark/>
           </w:tcPr>
           <w:p>
             <w:pPr>
               <w:spacing w:after="0" w:line="240" w:lineRule="auto"/>
               <w:ind w:left="0" w:firstLine="0"/>
+              <w:jc w:val="center"/>
               <w:cnfStyle w:val="000000100000" w:firstRow="0" w:lastRow="0" w:firstColumn="0" w:lastColumn="0" w:oddVBand="0" w:evenVBand="0" w:oddHBand="1" w:evenHBand="0" w:firstRowFirstColumn="0" w:firstRowLastColumn="0" w:lastRowFirstColumn="0" w:lastRowLastColumn="0"/>
               <w:rPr>
                 <w:rFonts w:eastAsia="Times New Roman"/>
@@ -11834,7 +11839,7 @@
         </w:tc>
         <w:tc>
           <w:tcPr>
-            <w:tcW w:w="0" w:type="auto"/>
+            <w:tcW w:w="4678" w:type="dxa"/>
             <w:hideMark/>
           </w:tcPr>
           <w:p>
@@ -11860,7 +11865,7 @@
         </w:tc>
         <w:tc>
           <w:tcPr>
-            <w:tcW w:w="2020" w:type="dxa"/>
+            <w:tcW w:w="1701" w:type="dxa"/>
             <w:hideMark/>
           </w:tcPr>
           <w:p>
@@ -11889,7 +11894,7 @@
         <w:tc>
           <w:tcPr>
             <w:cnfStyle w:val="001000000000" w:firstRow="0" w:lastRow="0" w:firstColumn="1" w:lastColumn="0" w:oddVBand="0" w:evenVBand="0" w:oddHBand="0" w:evenHBand="0" w:firstRowFirstColumn="0" w:firstRowLastColumn="0" w:lastRowFirstColumn="0" w:lastRowLastColumn="0"/>
-            <w:tcW w:w="3216" w:type="dxa"/>
+            <w:tcW w:w="2836" w:type="dxa"/>
             <w:hideMark/>
           </w:tcPr>
           <w:p>
@@ -11898,6 +11903,8 @@
               <w:ind w:left="0" w:firstLine="0"/>
               <w:rPr>
                 <w:rFonts w:eastAsia="Times New Roman"/>
+                <w:b w:val="0"/>
+                <w:bCs w:val="0"/>
                 <w:color w:val="auto"/>
                 <w:szCs w:val="24"/>
               </w:rPr>
@@ -11906,6 +11913,8 @@
             <w:r>
               <w:rPr>
                 <w:rFonts w:eastAsia="Times New Roman"/>
+                <w:b w:val="0"/>
+                <w:bCs w:val="0"/>
                 <w:color w:val="auto"/>
                 <w:szCs w:val="24"/>
               </w:rPr>
@@ -11916,13 +11925,14 @@
         </w:tc>
         <w:tc>
           <w:tcPr>
-            <w:tcW w:w="0" w:type="auto"/>
+            <w:tcW w:w="1701" w:type="dxa"/>
             <w:hideMark/>
           </w:tcPr>
           <w:p>
             <w:pPr>
               <w:spacing w:after="0" w:line="240" w:lineRule="auto"/>
               <w:ind w:left="0" w:firstLine="0"/>
+              <w:jc w:val="center"/>
               <w:cnfStyle w:val="000000000000" w:firstRow="0" w:lastRow="0" w:firstColumn="0" w:lastColumn="0" w:oddVBand="0" w:evenVBand="0" w:oddHBand="0" w:evenHBand="0" w:firstRowFirstColumn="0" w:firstRowLastColumn="0" w:lastRowFirstColumn="0" w:lastRowLastColumn="0"/>
               <w:rPr>
                 <w:rFonts w:eastAsia="Times New Roman"/>
@@ -11944,7 +11954,7 @@
         </w:tc>
         <w:tc>
           <w:tcPr>
-            <w:tcW w:w="0" w:type="auto"/>
+            <w:tcW w:w="4678" w:type="dxa"/>
             <w:hideMark/>
           </w:tcPr>
           <w:p>
@@ -11970,7 +11980,7 @@
         </w:tc>
         <w:tc>
           <w:tcPr>
-            <w:tcW w:w="2020" w:type="dxa"/>
+            <w:tcW w:w="1701" w:type="dxa"/>
             <w:hideMark/>
           </w:tcPr>
           <w:p>
@@ -12002,7 +12012,7 @@
         <w:tc>
           <w:tcPr>
             <w:cnfStyle w:val="001000000000" w:firstRow="0" w:lastRow="0" w:firstColumn="1" w:lastColumn="0" w:oddVBand="0" w:evenVBand="0" w:oddHBand="0" w:evenHBand="0" w:firstRowFirstColumn="0" w:firstRowLastColumn="0" w:lastRowFirstColumn="0" w:lastRowLastColumn="0"/>
-            <w:tcW w:w="3216" w:type="dxa"/>
+            <w:tcW w:w="2836" w:type="dxa"/>
             <w:hideMark/>
           </w:tcPr>
           <w:p>
@@ -12011,6 +12021,8 @@
               <w:ind w:left="0" w:firstLine="0"/>
               <w:rPr>
                 <w:rFonts w:eastAsia="Times New Roman"/>
+                <w:b w:val="0"/>
+                <w:bCs w:val="0"/>
                 <w:color w:val="auto"/>
                 <w:szCs w:val="24"/>
               </w:rPr>
@@ -12019,6 +12031,8 @@
             <w:r>
               <w:rPr>
                 <w:rFonts w:eastAsia="Times New Roman"/>
+                <w:b w:val="0"/>
+                <w:bCs w:val="0"/>
                 <w:color w:val="auto"/>
                 <w:szCs w:val="24"/>
               </w:rPr>
@@ -12029,13 +12043,14 @@
         </w:tc>
         <w:tc>
           <w:tcPr>
-            <w:tcW w:w="0" w:type="auto"/>
+            <w:tcW w:w="1701" w:type="dxa"/>
             <w:hideMark/>
           </w:tcPr>
           <w:p>
             <w:pPr>
               <w:spacing w:after="0" w:line="240" w:lineRule="auto"/>
               <w:ind w:left="0" w:firstLine="0"/>
+              <w:jc w:val="center"/>
               <w:cnfStyle w:val="000000100000" w:firstRow="0" w:lastRow="0" w:firstColumn="0" w:lastColumn="0" w:oddVBand="0" w:evenVBand="0" w:oddHBand="1" w:evenHBand="0" w:firstRowFirstColumn="0" w:firstRowLastColumn="0" w:lastRowFirstColumn="0" w:lastRowLastColumn="0"/>
               <w:rPr>
                 <w:rFonts w:eastAsia="Times New Roman"/>
@@ -12057,7 +12072,7 @@
         </w:tc>
         <w:tc>
           <w:tcPr>
-            <w:tcW w:w="0" w:type="auto"/>
+            <w:tcW w:w="4678" w:type="dxa"/>
             <w:hideMark/>
           </w:tcPr>
           <w:p>
@@ -12083,7 +12098,7 @@
         </w:tc>
         <w:tc>
           <w:tcPr>
-            <w:tcW w:w="2020" w:type="dxa"/>
+            <w:tcW w:w="1701" w:type="dxa"/>
             <w:hideMark/>
           </w:tcPr>
           <w:p>
@@ -12112,7 +12127,7 @@
         <w:tc>
           <w:tcPr>
             <w:cnfStyle w:val="001000000000" w:firstRow="0" w:lastRow="0" w:firstColumn="1" w:lastColumn="0" w:oddVBand="0" w:evenVBand="0" w:oddHBand="0" w:evenHBand="0" w:firstRowFirstColumn="0" w:firstRowLastColumn="0" w:lastRowFirstColumn="0" w:lastRowLastColumn="0"/>
-            <w:tcW w:w="3216" w:type="dxa"/>
+            <w:tcW w:w="2836" w:type="dxa"/>
             <w:hideMark/>
           </w:tcPr>
           <w:p>
@@ -12121,6 +12136,8 @@
               <w:ind w:left="0" w:firstLine="0"/>
               <w:rPr>
                 <w:rFonts w:eastAsia="Times New Roman"/>
+                <w:b w:val="0"/>
+                <w:bCs w:val="0"/>
                 <w:color w:val="auto"/>
                 <w:szCs w:val="24"/>
               </w:rPr>
@@ -12129,6 +12146,8 @@
             <w:r>
               <w:rPr>
                 <w:rFonts w:eastAsia="Times New Roman"/>
+                <w:b w:val="0"/>
+                <w:bCs w:val="0"/>
                 <w:color w:val="auto"/>
                 <w:szCs w:val="24"/>
               </w:rPr>
@@ -12139,13 +12158,14 @@
         </w:tc>
         <w:tc>
           <w:tcPr>
-            <w:tcW w:w="0" w:type="auto"/>
+            <w:tcW w:w="1701" w:type="dxa"/>
             <w:hideMark/>
           </w:tcPr>
           <w:p>
             <w:pPr>
               <w:spacing w:after="0" w:line="240" w:lineRule="auto"/>
               <w:ind w:left="0" w:firstLine="0"/>
+              <w:jc w:val="center"/>
               <w:cnfStyle w:val="000000000000" w:firstRow="0" w:lastRow="0" w:firstColumn="0" w:lastColumn="0" w:oddVBand="0" w:evenVBand="0" w:oddHBand="0" w:evenHBand="0" w:firstRowFirstColumn="0" w:firstRowLastColumn="0" w:lastRowFirstColumn="0" w:lastRowLastColumn="0"/>
               <w:rPr>
                 <w:rFonts w:eastAsia="Times New Roman"/>
@@ -12167,7 +12187,7 @@
         </w:tc>
         <w:tc>
           <w:tcPr>
-            <w:tcW w:w="0" w:type="auto"/>
+            <w:tcW w:w="4678" w:type="dxa"/>
             <w:hideMark/>
           </w:tcPr>
           <w:p>
@@ -12193,7 +12213,7 @@
         </w:tc>
         <w:tc>
           <w:tcPr>
-            <w:tcW w:w="2020" w:type="dxa"/>
+            <w:tcW w:w="1701" w:type="dxa"/>
             <w:hideMark/>
           </w:tcPr>
           <w:p>
@@ -12227,21 +12247,30 @@
           <w:sz w:val="22"/>
         </w:rPr>
       </w:pPr>
+    </w:p>
+    <w:p>
+      <w:pPr>
+        <w:rPr>
+          <w:b/>
+          <w:bCs/>
+          <w:sz w:val="22"/>
+        </w:rPr>
+      </w:pPr>
       <w:r>
         <w:rPr>
           <w:noProof/>
           <w:sz w:val="22"/>
         </w:rPr>
         <w:drawing>
-          <wp:anchor distT="0" distB="0" distL="114300" distR="114300" simplePos="0" relativeHeight="251667456" behindDoc="0" locked="0" layoutInCell="1" allowOverlap="1" wp14:anchorId="6799606A" wp14:editId="24A4C7E8">
+          <wp:anchor distT="0" distB="0" distL="114300" distR="114300" simplePos="0" relativeHeight="251667456" behindDoc="0" locked="0" layoutInCell="1" allowOverlap="1" wp14:anchorId="6799606A" wp14:editId="5340027D">
             <wp:simplePos x="0" y="0"/>
             <wp:positionH relativeFrom="margin">
               <wp:posOffset>-190500</wp:posOffset>
             </wp:positionH>
             <wp:positionV relativeFrom="paragraph">
-              <wp:posOffset>385445</wp:posOffset>
+              <wp:posOffset>381635</wp:posOffset>
             </wp:positionV>
-            <wp:extent cx="6105525" cy="4171950"/>
+            <wp:extent cx="6105525" cy="4657725"/>
             <wp:effectExtent l="0" t="0" r="0" b="0"/>
             <wp:wrapSquare wrapText="bothSides"/>
             <wp:docPr id="16" name="Imagen 16"/>
@@ -12273,7 +12302,7 @@
                   <pic:spPr bwMode="auto">
                     <a:xfrm>
                       <a:off x="0" y="0"/>
-                      <a:ext cx="6105525" cy="4171950"/>
+                      <a:ext cx="6105525" cy="4657725"/>
                     </a:xfrm>
                     <a:prstGeom prst="rect">
                       <a:avLst/>
@@ -12307,11 +12336,15 @@
     <w:p>
       <w:pPr>
         <w:rPr>
+          <w:b/>
+          <w:bCs/>
           <w:sz w:val="22"/>
         </w:rPr>
       </w:pPr>
       <w:r>
         <w:rPr>
+          <w:b/>
+          <w:bCs/>
           <w:sz w:val="22"/>
         </w:rPr>
         <w:lastRenderedPageBreak/>
@@ -15663,6 +15696,1347 @@
         <w:rPr>
           <w:b/>
           <w:bCs/>
+          <w:sz w:val="22"/>
+        </w:rPr>
+      </w:pPr>
+    </w:p>
+    <w:p>
+      <w:pPr>
+        <w:rPr>
+          <w:sz w:val="22"/>
+        </w:rPr>
+      </w:pPr>
+    </w:p>
+    <w:p>
+      <w:pPr>
+        <w:rPr>
+          <w:sz w:val="22"/>
+        </w:rPr>
+      </w:pPr>
+    </w:p>
+    <w:p>
+      <w:pPr>
+        <w:rPr>
+          <w:sz w:val="22"/>
+        </w:rPr>
+      </w:pPr>
+    </w:p>
+    <w:p>
+      <w:pPr>
+        <w:spacing w:after="0"/>
+        <w:rPr>
+          <w:b/>
+          <w:bCs/>
+          <w:sz w:val="22"/>
+        </w:rPr>
+      </w:pPr>
+    </w:p>
+    <w:p>
+      <w:pPr>
+        <w:spacing w:after="0"/>
+        <w:ind w:left="0" w:firstLine="0"/>
+        <w:jc w:val="center"/>
+        <w:rPr>
+          <w:b/>
+          <w:bCs/>
+          <w:sz w:val="22"/>
+        </w:rPr>
+      </w:pPr>
+      <w:r>
+        <w:rPr>
+          <w:b/>
+          <w:bCs/>
+          <w:sz w:val="22"/>
+        </w:rPr>
+        <w:t>Ejercicio 4: Autorización inicial de lanzamiento</w:t>
+      </w:r>
+    </w:p>
+    <w:p>
+      <w:pPr>
+        <w:spacing w:after="0"/>
+        <w:ind w:left="0" w:firstLine="0"/>
+        <w:jc w:val="center"/>
+        <w:rPr>
+          <w:b/>
+          <w:bCs/>
+          <w:sz w:val="22"/>
+        </w:rPr>
+      </w:pPr>
+      <w:r>
+        <w:rPr>
+          <w:b/>
+          <w:bCs/>
+          <w:sz w:val="22"/>
+        </w:rPr>
+        <w:t>Tabla de variables</w:t>
+      </w:r>
+    </w:p>
+    <w:p>
+      <w:pPr>
+        <w:spacing w:after="0"/>
+        <w:ind w:left="0" w:firstLine="0"/>
+        <w:jc w:val="center"/>
+        <w:rPr>
+          <w:b/>
+          <w:bCs/>
+          <w:sz w:val="22"/>
+        </w:rPr>
+      </w:pPr>
+    </w:p>
+    <w:tbl>
+      <w:tblPr>
+        <w:tblStyle w:val="Tabladelista3-nfasis3"/>
+        <w:tblW w:w="10774" w:type="dxa"/>
+        <w:tblInd w:w="-998" w:type="dxa"/>
+        <w:tblLook w:val="04A0" w:firstRow="1" w:lastRow="0" w:firstColumn="1" w:lastColumn="0" w:noHBand="0" w:noVBand="1"/>
+      </w:tblPr>
+      <w:tblGrid>
+        <w:gridCol w:w="2978"/>
+        <w:gridCol w:w="1701"/>
+        <w:gridCol w:w="4513"/>
+        <w:gridCol w:w="1582"/>
+      </w:tblGrid>
+      <w:tr>
+        <w:trPr>
+          <w:cnfStyle w:val="100000000000" w:firstRow="1" w:lastRow="0" w:firstColumn="0" w:lastColumn="0" w:oddVBand="0" w:evenVBand="0" w:oddHBand="0" w:evenHBand="0" w:firstRowFirstColumn="0" w:firstRowLastColumn="0" w:lastRowFirstColumn="0" w:lastRowLastColumn="0"/>
+        </w:trPr>
+        <w:tc>
+          <w:tcPr>
+            <w:cnfStyle w:val="001000000100" w:firstRow="0" w:lastRow="0" w:firstColumn="1" w:lastColumn="0" w:oddVBand="0" w:evenVBand="0" w:oddHBand="0" w:evenHBand="0" w:firstRowFirstColumn="1" w:firstRowLastColumn="0" w:lastRowFirstColumn="0" w:lastRowLastColumn="0"/>
+            <w:tcW w:w="2978" w:type="dxa"/>
+            <w:hideMark/>
+          </w:tcPr>
+          <w:p>
+            <w:pPr>
+              <w:spacing w:after="0"/>
+              <w:ind w:left="0" w:firstLine="0"/>
+              <w:jc w:val="center"/>
+              <w:rPr>
+                <w:sz w:val="22"/>
+              </w:rPr>
+            </w:pPr>
+            <w:r>
+              <w:rPr>
+                <w:sz w:val="22"/>
+              </w:rPr>
+              <w:t>Nombre</w:t>
+            </w:r>
+          </w:p>
+        </w:tc>
+        <w:tc>
+          <w:tcPr>
+            <w:tcW w:w="1701" w:type="dxa"/>
+            <w:hideMark/>
+          </w:tcPr>
+          <w:p>
+            <w:pPr>
+              <w:spacing w:after="0"/>
+              <w:ind w:left="0" w:firstLine="0"/>
+              <w:jc w:val="center"/>
+              <w:cnfStyle w:val="100000000000" w:firstRow="1" w:lastRow="0" w:firstColumn="0" w:lastColumn="0" w:oddVBand="0" w:evenVBand="0" w:oddHBand="0" w:evenHBand="0" w:firstRowFirstColumn="0" w:firstRowLastColumn="0" w:lastRowFirstColumn="0" w:lastRowLastColumn="0"/>
+              <w:rPr>
+                <w:sz w:val="22"/>
+              </w:rPr>
+            </w:pPr>
+            <w:r>
+              <w:rPr>
+                <w:sz w:val="22"/>
+              </w:rPr>
+              <w:t>Tipo de dato</w:t>
+            </w:r>
+          </w:p>
+        </w:tc>
+        <w:tc>
+          <w:tcPr>
+            <w:tcW w:w="4513" w:type="dxa"/>
+            <w:hideMark/>
+          </w:tcPr>
+          <w:p>
+            <w:pPr>
+              <w:spacing w:after="0"/>
+              <w:ind w:left="0" w:firstLine="0"/>
+              <w:jc w:val="center"/>
+              <w:cnfStyle w:val="100000000000" w:firstRow="1" w:lastRow="0" w:firstColumn="0" w:lastColumn="0" w:oddVBand="0" w:evenVBand="0" w:oddHBand="0" w:evenHBand="0" w:firstRowFirstColumn="0" w:firstRowLastColumn="0" w:lastRowFirstColumn="0" w:lastRowLastColumn="0"/>
+              <w:rPr>
+                <w:sz w:val="22"/>
+              </w:rPr>
+            </w:pPr>
+            <w:r>
+              <w:rPr>
+                <w:sz w:val="22"/>
+              </w:rPr>
+              <w:t>Descripción</w:t>
+            </w:r>
+          </w:p>
+        </w:tc>
+        <w:tc>
+          <w:tcPr>
+            <w:tcW w:w="1582" w:type="dxa"/>
+            <w:hideMark/>
+          </w:tcPr>
+          <w:p>
+            <w:pPr>
+              <w:spacing w:after="0"/>
+              <w:ind w:left="0" w:firstLine="0"/>
+              <w:jc w:val="center"/>
+              <w:cnfStyle w:val="100000000000" w:firstRow="1" w:lastRow="0" w:firstColumn="0" w:lastColumn="0" w:oddVBand="0" w:evenVBand="0" w:oddHBand="0" w:evenHBand="0" w:firstRowFirstColumn="0" w:firstRowLastColumn="0" w:lastRowFirstColumn="0" w:lastRowLastColumn="0"/>
+              <w:rPr>
+                <w:sz w:val="22"/>
+              </w:rPr>
+            </w:pPr>
+            <w:r>
+              <w:rPr>
+                <w:sz w:val="22"/>
+              </w:rPr>
+              <w:t>Clasificación</w:t>
+            </w:r>
+          </w:p>
+        </w:tc>
+      </w:tr>
+      <w:tr>
+        <w:trPr>
+          <w:cnfStyle w:val="000000100000" w:firstRow="0" w:lastRow="0" w:firstColumn="0" w:lastColumn="0" w:oddVBand="0" w:evenVBand="0" w:oddHBand="1" w:evenHBand="0" w:firstRowFirstColumn="0" w:firstRowLastColumn="0" w:lastRowFirstColumn="0" w:lastRowLastColumn="0"/>
+        </w:trPr>
+        <w:tc>
+          <w:tcPr>
+            <w:cnfStyle w:val="001000000000" w:firstRow="0" w:lastRow="0" w:firstColumn="1" w:lastColumn="0" w:oddVBand="0" w:evenVBand="0" w:oddHBand="0" w:evenHBand="0" w:firstRowFirstColumn="0" w:firstRowLastColumn="0" w:lastRowFirstColumn="0" w:lastRowLastColumn="0"/>
+            <w:tcW w:w="2978" w:type="dxa"/>
+            <w:hideMark/>
+          </w:tcPr>
+          <w:p>
+            <w:pPr>
+              <w:spacing w:after="0"/>
+              <w:ind w:left="0" w:firstLine="0"/>
+              <w:jc w:val="center"/>
+              <w:rPr>
+                <w:b w:val="0"/>
+                <w:bCs w:val="0"/>
+                <w:sz w:val="22"/>
+              </w:rPr>
+            </w:pPr>
+            <w:r>
+              <w:rPr>
+                <w:b w:val="0"/>
+                <w:bCs w:val="0"/>
+                <w:sz w:val="22"/>
+              </w:rPr>
+              <w:t>RESERVA_COMBUSTIBLE</w:t>
+            </w:r>
+          </w:p>
+        </w:tc>
+        <w:tc>
+          <w:tcPr>
+            <w:tcW w:w="1701" w:type="dxa"/>
+            <w:hideMark/>
+          </w:tcPr>
+          <w:p>
+            <w:pPr>
+              <w:spacing w:after="0"/>
+              <w:ind w:left="0" w:firstLine="0"/>
+              <w:jc w:val="center"/>
+              <w:cnfStyle w:val="000000100000" w:firstRow="0" w:lastRow="0" w:firstColumn="0" w:lastColumn="0" w:oddVBand="0" w:evenVBand="0" w:oddHBand="1" w:evenHBand="0" w:firstRowFirstColumn="0" w:firstRowLastColumn="0" w:lastRowFirstColumn="0" w:lastRowLastColumn="0"/>
+              <w:rPr>
+                <w:sz w:val="22"/>
+              </w:rPr>
+            </w:pPr>
+            <w:proofErr w:type="spellStart"/>
+            <w:r>
+              <w:rPr>
+                <w:sz w:val="22"/>
+              </w:rPr>
+              <w:t>int</w:t>
+            </w:r>
+            <w:proofErr w:type="spellEnd"/>
+          </w:p>
+        </w:tc>
+        <w:tc>
+          <w:tcPr>
+            <w:tcW w:w="4513" w:type="dxa"/>
+            <w:hideMark/>
+          </w:tcPr>
+          <w:p>
+            <w:pPr>
+              <w:spacing w:after="0"/>
+              <w:ind w:left="0" w:firstLine="0"/>
+              <w:cnfStyle w:val="000000100000" w:firstRow="0" w:lastRow="0" w:firstColumn="0" w:lastColumn="0" w:oddVBand="0" w:evenVBand="0" w:oddHBand="1" w:evenHBand="0" w:firstRowFirstColumn="0" w:firstRowLastColumn="0" w:lastRowFirstColumn="0" w:lastRowLastColumn="0"/>
+              <w:rPr>
+                <w:sz w:val="22"/>
+              </w:rPr>
+            </w:pPr>
+            <w:r>
+              <w:rPr>
+                <w:sz w:val="22"/>
+              </w:rPr>
+              <w:t>Combustible de reserva para emergencias</w:t>
+            </w:r>
+          </w:p>
+        </w:tc>
+        <w:tc>
+          <w:tcPr>
+            <w:tcW w:w="1582" w:type="dxa"/>
+            <w:hideMark/>
+          </w:tcPr>
+          <w:p>
+            <w:pPr>
+              <w:spacing w:after="0"/>
+              <w:ind w:left="0" w:firstLine="0"/>
+              <w:jc w:val="center"/>
+              <w:cnfStyle w:val="000000100000" w:firstRow="0" w:lastRow="0" w:firstColumn="0" w:lastColumn="0" w:oddVBand="0" w:evenVBand="0" w:oddHBand="1" w:evenHBand="0" w:firstRowFirstColumn="0" w:firstRowLastColumn="0" w:lastRowFirstColumn="0" w:lastRowLastColumn="0"/>
+              <w:rPr>
+                <w:sz w:val="22"/>
+              </w:rPr>
+            </w:pPr>
+            <w:r>
+              <w:rPr>
+                <w:sz w:val="22"/>
+              </w:rPr>
+              <w:t>Constante</w:t>
+            </w:r>
+          </w:p>
+        </w:tc>
+      </w:tr>
+      <w:tr>
+        <w:tc>
+          <w:tcPr>
+            <w:cnfStyle w:val="001000000000" w:firstRow="0" w:lastRow="0" w:firstColumn="1" w:lastColumn="0" w:oddVBand="0" w:evenVBand="0" w:oddHBand="0" w:evenHBand="0" w:firstRowFirstColumn="0" w:firstRowLastColumn="0" w:lastRowFirstColumn="0" w:lastRowLastColumn="0"/>
+            <w:tcW w:w="2978" w:type="dxa"/>
+            <w:hideMark/>
+          </w:tcPr>
+          <w:p>
+            <w:pPr>
+              <w:spacing w:after="0"/>
+              <w:ind w:left="0" w:firstLine="0"/>
+              <w:jc w:val="center"/>
+              <w:rPr>
+                <w:b w:val="0"/>
+                <w:bCs w:val="0"/>
+                <w:sz w:val="22"/>
+              </w:rPr>
+            </w:pPr>
+            <w:proofErr w:type="spellStart"/>
+            <w:r>
+              <w:rPr>
+                <w:b w:val="0"/>
+                <w:bCs w:val="0"/>
+                <w:sz w:val="22"/>
+              </w:rPr>
+              <w:t>combustible_disponible</w:t>
+            </w:r>
+            <w:proofErr w:type="spellEnd"/>
+          </w:p>
+        </w:tc>
+        <w:tc>
+          <w:tcPr>
+            <w:tcW w:w="1701" w:type="dxa"/>
+            <w:hideMark/>
+          </w:tcPr>
+          <w:p>
+            <w:pPr>
+              <w:spacing w:after="0"/>
+              <w:ind w:left="0" w:firstLine="0"/>
+              <w:jc w:val="center"/>
+              <w:cnfStyle w:val="000000000000" w:firstRow="0" w:lastRow="0" w:firstColumn="0" w:lastColumn="0" w:oddVBand="0" w:evenVBand="0" w:oddHBand="0" w:evenHBand="0" w:firstRowFirstColumn="0" w:firstRowLastColumn="0" w:lastRowFirstColumn="0" w:lastRowLastColumn="0"/>
+              <w:rPr>
+                <w:sz w:val="22"/>
+              </w:rPr>
+            </w:pPr>
+            <w:proofErr w:type="spellStart"/>
+            <w:r>
+              <w:rPr>
+                <w:sz w:val="22"/>
+              </w:rPr>
+              <w:t>int</w:t>
+            </w:r>
+            <w:proofErr w:type="spellEnd"/>
+          </w:p>
+        </w:tc>
+        <w:tc>
+          <w:tcPr>
+            <w:tcW w:w="4513" w:type="dxa"/>
+            <w:hideMark/>
+          </w:tcPr>
+          <w:p>
+            <w:pPr>
+              <w:spacing w:after="0"/>
+              <w:ind w:left="0" w:firstLine="0"/>
+              <w:cnfStyle w:val="000000000000" w:firstRow="0" w:lastRow="0" w:firstColumn="0" w:lastColumn="0" w:oddVBand="0" w:evenVBand="0" w:oddHBand="0" w:evenHBand="0" w:firstRowFirstColumn="0" w:firstRowLastColumn="0" w:lastRowFirstColumn="0" w:lastRowLastColumn="0"/>
+              <w:rPr>
+                <w:sz w:val="22"/>
+              </w:rPr>
+            </w:pPr>
+            <w:r>
+              <w:rPr>
+                <w:sz w:val="22"/>
+              </w:rPr>
+              <w:t>Combustible con que cuenta la nave</w:t>
+            </w:r>
+          </w:p>
+        </w:tc>
+        <w:tc>
+          <w:tcPr>
+            <w:tcW w:w="1582" w:type="dxa"/>
+            <w:hideMark/>
+          </w:tcPr>
+          <w:p>
+            <w:pPr>
+              <w:spacing w:after="0"/>
+              <w:ind w:left="0" w:firstLine="0"/>
+              <w:jc w:val="center"/>
+              <w:cnfStyle w:val="000000000000" w:firstRow="0" w:lastRow="0" w:firstColumn="0" w:lastColumn="0" w:oddVBand="0" w:evenVBand="0" w:oddHBand="0" w:evenHBand="0" w:firstRowFirstColumn="0" w:firstRowLastColumn="0" w:lastRowFirstColumn="0" w:lastRowLastColumn="0"/>
+              <w:rPr>
+                <w:sz w:val="22"/>
+              </w:rPr>
+            </w:pPr>
+            <w:r>
+              <w:rPr>
+                <w:sz w:val="22"/>
+              </w:rPr>
+              <w:t>Entrada</w:t>
+            </w:r>
+          </w:p>
+        </w:tc>
+      </w:tr>
+      <w:tr>
+        <w:trPr>
+          <w:cnfStyle w:val="000000100000" w:firstRow="0" w:lastRow="0" w:firstColumn="0" w:lastColumn="0" w:oddVBand="0" w:evenVBand="0" w:oddHBand="1" w:evenHBand="0" w:firstRowFirstColumn="0" w:firstRowLastColumn="0" w:lastRowFirstColumn="0" w:lastRowLastColumn="0"/>
+        </w:trPr>
+        <w:tc>
+          <w:tcPr>
+            <w:cnfStyle w:val="001000000000" w:firstRow="0" w:lastRow="0" w:firstColumn="1" w:lastColumn="0" w:oddVBand="0" w:evenVBand="0" w:oddHBand="0" w:evenHBand="0" w:firstRowFirstColumn="0" w:firstRowLastColumn="0" w:lastRowFirstColumn="0" w:lastRowLastColumn="0"/>
+            <w:tcW w:w="2978" w:type="dxa"/>
+            <w:hideMark/>
+          </w:tcPr>
+          <w:p>
+            <w:pPr>
+              <w:spacing w:after="0"/>
+              <w:ind w:left="0" w:firstLine="0"/>
+              <w:jc w:val="center"/>
+              <w:rPr>
+                <w:b w:val="0"/>
+                <w:bCs w:val="0"/>
+                <w:sz w:val="22"/>
+              </w:rPr>
+            </w:pPr>
+            <w:proofErr w:type="spellStart"/>
+            <w:r>
+              <w:rPr>
+                <w:b w:val="0"/>
+                <w:bCs w:val="0"/>
+                <w:sz w:val="22"/>
+              </w:rPr>
+              <w:t>combustible_ida</w:t>
+            </w:r>
+            <w:proofErr w:type="spellEnd"/>
+          </w:p>
+        </w:tc>
+        <w:tc>
+          <w:tcPr>
+            <w:tcW w:w="1701" w:type="dxa"/>
+            <w:hideMark/>
+          </w:tcPr>
+          <w:p>
+            <w:pPr>
+              <w:spacing w:after="0"/>
+              <w:ind w:left="0" w:firstLine="0"/>
+              <w:jc w:val="center"/>
+              <w:cnfStyle w:val="000000100000" w:firstRow="0" w:lastRow="0" w:firstColumn="0" w:lastColumn="0" w:oddVBand="0" w:evenVBand="0" w:oddHBand="1" w:evenHBand="0" w:firstRowFirstColumn="0" w:firstRowLastColumn="0" w:lastRowFirstColumn="0" w:lastRowLastColumn="0"/>
+              <w:rPr>
+                <w:sz w:val="22"/>
+              </w:rPr>
+            </w:pPr>
+            <w:proofErr w:type="spellStart"/>
+            <w:r>
+              <w:rPr>
+                <w:sz w:val="22"/>
+              </w:rPr>
+              <w:t>int</w:t>
+            </w:r>
+            <w:proofErr w:type="spellEnd"/>
+          </w:p>
+        </w:tc>
+        <w:tc>
+          <w:tcPr>
+            <w:tcW w:w="4513" w:type="dxa"/>
+            <w:hideMark/>
+          </w:tcPr>
+          <w:p>
+            <w:pPr>
+              <w:spacing w:after="0"/>
+              <w:ind w:left="0" w:firstLine="0"/>
+              <w:cnfStyle w:val="000000100000" w:firstRow="0" w:lastRow="0" w:firstColumn="0" w:lastColumn="0" w:oddVBand="0" w:evenVBand="0" w:oddHBand="1" w:evenHBand="0" w:firstRowFirstColumn="0" w:firstRowLastColumn="0" w:lastRowFirstColumn="0" w:lastRowLastColumn="0"/>
+              <w:rPr>
+                <w:sz w:val="22"/>
+              </w:rPr>
+            </w:pPr>
+            <w:r>
+              <w:rPr>
+                <w:sz w:val="22"/>
+              </w:rPr>
+              <w:t>Combustible requerido para llegar</w:t>
+            </w:r>
+          </w:p>
+        </w:tc>
+        <w:tc>
+          <w:tcPr>
+            <w:tcW w:w="1582" w:type="dxa"/>
+            <w:hideMark/>
+          </w:tcPr>
+          <w:p>
+            <w:pPr>
+              <w:spacing w:after="0"/>
+              <w:ind w:left="0" w:firstLine="0"/>
+              <w:jc w:val="center"/>
+              <w:cnfStyle w:val="000000100000" w:firstRow="0" w:lastRow="0" w:firstColumn="0" w:lastColumn="0" w:oddVBand="0" w:evenVBand="0" w:oddHBand="1" w:evenHBand="0" w:firstRowFirstColumn="0" w:firstRowLastColumn="0" w:lastRowFirstColumn="0" w:lastRowLastColumn="0"/>
+              <w:rPr>
+                <w:sz w:val="22"/>
+              </w:rPr>
+            </w:pPr>
+            <w:r>
+              <w:rPr>
+                <w:sz w:val="22"/>
+              </w:rPr>
+              <w:t>Entrada</w:t>
+            </w:r>
+          </w:p>
+        </w:tc>
+      </w:tr>
+      <w:tr>
+        <w:tc>
+          <w:tcPr>
+            <w:cnfStyle w:val="001000000000" w:firstRow="0" w:lastRow="0" w:firstColumn="1" w:lastColumn="0" w:oddVBand="0" w:evenVBand="0" w:oddHBand="0" w:evenHBand="0" w:firstRowFirstColumn="0" w:firstRowLastColumn="0" w:lastRowFirstColumn="0" w:lastRowLastColumn="0"/>
+            <w:tcW w:w="2978" w:type="dxa"/>
+            <w:hideMark/>
+          </w:tcPr>
+          <w:p>
+            <w:pPr>
+              <w:spacing w:after="0"/>
+              <w:ind w:left="0" w:firstLine="0"/>
+              <w:jc w:val="center"/>
+              <w:rPr>
+                <w:b w:val="0"/>
+                <w:bCs w:val="0"/>
+                <w:sz w:val="22"/>
+              </w:rPr>
+            </w:pPr>
+            <w:proofErr w:type="spellStart"/>
+            <w:r>
+              <w:rPr>
+                <w:b w:val="0"/>
+                <w:bCs w:val="0"/>
+                <w:sz w:val="22"/>
+              </w:rPr>
+              <w:t>combustible_regreso</w:t>
+            </w:r>
+            <w:proofErr w:type="spellEnd"/>
+          </w:p>
+        </w:tc>
+        <w:tc>
+          <w:tcPr>
+            <w:tcW w:w="1701" w:type="dxa"/>
+            <w:hideMark/>
+          </w:tcPr>
+          <w:p>
+            <w:pPr>
+              <w:spacing w:after="0"/>
+              <w:ind w:left="0" w:firstLine="0"/>
+              <w:jc w:val="center"/>
+              <w:cnfStyle w:val="000000000000" w:firstRow="0" w:lastRow="0" w:firstColumn="0" w:lastColumn="0" w:oddVBand="0" w:evenVBand="0" w:oddHBand="0" w:evenHBand="0" w:firstRowFirstColumn="0" w:firstRowLastColumn="0" w:lastRowFirstColumn="0" w:lastRowLastColumn="0"/>
+              <w:rPr>
+                <w:sz w:val="22"/>
+              </w:rPr>
+            </w:pPr>
+            <w:proofErr w:type="spellStart"/>
+            <w:r>
+              <w:rPr>
+                <w:sz w:val="22"/>
+              </w:rPr>
+              <w:t>int</w:t>
+            </w:r>
+            <w:proofErr w:type="spellEnd"/>
+          </w:p>
+        </w:tc>
+        <w:tc>
+          <w:tcPr>
+            <w:tcW w:w="4513" w:type="dxa"/>
+            <w:hideMark/>
+          </w:tcPr>
+          <w:p>
+            <w:pPr>
+              <w:spacing w:after="0"/>
+              <w:ind w:left="0" w:firstLine="0"/>
+              <w:cnfStyle w:val="000000000000" w:firstRow="0" w:lastRow="0" w:firstColumn="0" w:lastColumn="0" w:oddVBand="0" w:evenVBand="0" w:oddHBand="0" w:evenHBand="0" w:firstRowFirstColumn="0" w:firstRowLastColumn="0" w:lastRowFirstColumn="0" w:lastRowLastColumn="0"/>
+              <w:rPr>
+                <w:sz w:val="22"/>
+              </w:rPr>
+            </w:pPr>
+            <w:r>
+              <w:rPr>
+                <w:sz w:val="22"/>
+              </w:rPr>
+              <w:t>Combustible requerido para regresar</w:t>
+            </w:r>
+          </w:p>
+        </w:tc>
+        <w:tc>
+          <w:tcPr>
+            <w:tcW w:w="1582" w:type="dxa"/>
+            <w:hideMark/>
+          </w:tcPr>
+          <w:p>
+            <w:pPr>
+              <w:spacing w:after="0"/>
+              <w:ind w:left="0" w:firstLine="0"/>
+              <w:jc w:val="center"/>
+              <w:cnfStyle w:val="000000000000" w:firstRow="0" w:lastRow="0" w:firstColumn="0" w:lastColumn="0" w:oddVBand="0" w:evenVBand="0" w:oddHBand="0" w:evenHBand="0" w:firstRowFirstColumn="0" w:firstRowLastColumn="0" w:lastRowFirstColumn="0" w:lastRowLastColumn="0"/>
+              <w:rPr>
+                <w:sz w:val="22"/>
+              </w:rPr>
+            </w:pPr>
+            <w:r>
+              <w:rPr>
+                <w:sz w:val="22"/>
+              </w:rPr>
+              <w:t>Entrada</w:t>
+            </w:r>
+          </w:p>
+        </w:tc>
+      </w:tr>
+      <w:tr>
+        <w:trPr>
+          <w:cnfStyle w:val="000000100000" w:firstRow="0" w:lastRow="0" w:firstColumn="0" w:lastColumn="0" w:oddVBand="0" w:evenVBand="0" w:oddHBand="1" w:evenHBand="0" w:firstRowFirstColumn="0" w:firstRowLastColumn="0" w:lastRowFirstColumn="0" w:lastRowLastColumn="0"/>
+        </w:trPr>
+        <w:tc>
+          <w:tcPr>
+            <w:cnfStyle w:val="001000000000" w:firstRow="0" w:lastRow="0" w:firstColumn="1" w:lastColumn="0" w:oddVBand="0" w:evenVBand="0" w:oddHBand="0" w:evenHBand="0" w:firstRowFirstColumn="0" w:firstRowLastColumn="0" w:lastRowFirstColumn="0" w:lastRowLastColumn="0"/>
+            <w:tcW w:w="2978" w:type="dxa"/>
+            <w:hideMark/>
+          </w:tcPr>
+          <w:p>
+            <w:pPr>
+              <w:spacing w:after="0"/>
+              <w:ind w:left="0" w:firstLine="0"/>
+              <w:jc w:val="center"/>
+              <w:rPr>
+                <w:b w:val="0"/>
+                <w:bCs w:val="0"/>
+                <w:sz w:val="22"/>
+              </w:rPr>
+            </w:pPr>
+            <w:proofErr w:type="spellStart"/>
+            <w:r>
+              <w:rPr>
+                <w:b w:val="0"/>
+                <w:bCs w:val="0"/>
+                <w:sz w:val="22"/>
+              </w:rPr>
+              <w:t>oxigeno_disponible</w:t>
+            </w:r>
+            <w:proofErr w:type="spellEnd"/>
+          </w:p>
+        </w:tc>
+        <w:tc>
+          <w:tcPr>
+            <w:tcW w:w="1701" w:type="dxa"/>
+            <w:hideMark/>
+          </w:tcPr>
+          <w:p>
+            <w:pPr>
+              <w:spacing w:after="0"/>
+              <w:ind w:left="0" w:firstLine="0"/>
+              <w:jc w:val="center"/>
+              <w:cnfStyle w:val="000000100000" w:firstRow="0" w:lastRow="0" w:firstColumn="0" w:lastColumn="0" w:oddVBand="0" w:evenVBand="0" w:oddHBand="1" w:evenHBand="0" w:firstRowFirstColumn="0" w:firstRowLastColumn="0" w:lastRowFirstColumn="0" w:lastRowLastColumn="0"/>
+              <w:rPr>
+                <w:sz w:val="22"/>
+              </w:rPr>
+            </w:pPr>
+            <w:proofErr w:type="spellStart"/>
+            <w:r>
+              <w:rPr>
+                <w:sz w:val="22"/>
+              </w:rPr>
+              <w:t>int</w:t>
+            </w:r>
+            <w:proofErr w:type="spellEnd"/>
+          </w:p>
+        </w:tc>
+        <w:tc>
+          <w:tcPr>
+            <w:tcW w:w="4513" w:type="dxa"/>
+            <w:hideMark/>
+          </w:tcPr>
+          <w:p>
+            <w:pPr>
+              <w:spacing w:after="0"/>
+              <w:ind w:left="0" w:firstLine="0"/>
+              <w:cnfStyle w:val="000000100000" w:firstRow="0" w:lastRow="0" w:firstColumn="0" w:lastColumn="0" w:oddVBand="0" w:evenVBand="0" w:oddHBand="1" w:evenHBand="0" w:firstRowFirstColumn="0" w:firstRowLastColumn="0" w:lastRowFirstColumn="0" w:lastRowLastColumn="0"/>
+              <w:rPr>
+                <w:sz w:val="22"/>
+              </w:rPr>
+            </w:pPr>
+            <w:r>
+              <w:rPr>
+                <w:sz w:val="22"/>
+              </w:rPr>
+              <w:t>Oxígeno con que cuenta la nave</w:t>
+            </w:r>
+          </w:p>
+        </w:tc>
+        <w:tc>
+          <w:tcPr>
+            <w:tcW w:w="1582" w:type="dxa"/>
+            <w:hideMark/>
+          </w:tcPr>
+          <w:p>
+            <w:pPr>
+              <w:spacing w:after="0"/>
+              <w:ind w:left="0" w:firstLine="0"/>
+              <w:jc w:val="center"/>
+              <w:cnfStyle w:val="000000100000" w:firstRow="0" w:lastRow="0" w:firstColumn="0" w:lastColumn="0" w:oddVBand="0" w:evenVBand="0" w:oddHBand="1" w:evenHBand="0" w:firstRowFirstColumn="0" w:firstRowLastColumn="0" w:lastRowFirstColumn="0" w:lastRowLastColumn="0"/>
+              <w:rPr>
+                <w:sz w:val="22"/>
+              </w:rPr>
+            </w:pPr>
+            <w:r>
+              <w:rPr>
+                <w:sz w:val="22"/>
+              </w:rPr>
+              <w:t>Entrada</w:t>
+            </w:r>
+          </w:p>
+        </w:tc>
+      </w:tr>
+      <w:tr>
+        <w:tc>
+          <w:tcPr>
+            <w:cnfStyle w:val="001000000000" w:firstRow="0" w:lastRow="0" w:firstColumn="1" w:lastColumn="0" w:oddVBand="0" w:evenVBand="0" w:oddHBand="0" w:evenHBand="0" w:firstRowFirstColumn="0" w:firstRowLastColumn="0" w:lastRowFirstColumn="0" w:lastRowLastColumn="0"/>
+            <w:tcW w:w="2978" w:type="dxa"/>
+            <w:hideMark/>
+          </w:tcPr>
+          <w:p>
+            <w:pPr>
+              <w:spacing w:after="0"/>
+              <w:ind w:left="0" w:firstLine="0"/>
+              <w:jc w:val="center"/>
+              <w:rPr>
+                <w:b w:val="0"/>
+                <w:bCs w:val="0"/>
+                <w:sz w:val="22"/>
+              </w:rPr>
+            </w:pPr>
+            <w:proofErr w:type="spellStart"/>
+            <w:r>
+              <w:rPr>
+                <w:b w:val="0"/>
+                <w:bCs w:val="0"/>
+                <w:sz w:val="22"/>
+              </w:rPr>
+              <w:t>oxigeno_requerido</w:t>
+            </w:r>
+            <w:proofErr w:type="spellEnd"/>
+          </w:p>
+        </w:tc>
+        <w:tc>
+          <w:tcPr>
+            <w:tcW w:w="1701" w:type="dxa"/>
+            <w:hideMark/>
+          </w:tcPr>
+          <w:p>
+            <w:pPr>
+              <w:spacing w:after="0"/>
+              <w:ind w:left="0" w:firstLine="0"/>
+              <w:jc w:val="center"/>
+              <w:cnfStyle w:val="000000000000" w:firstRow="0" w:lastRow="0" w:firstColumn="0" w:lastColumn="0" w:oddVBand="0" w:evenVBand="0" w:oddHBand="0" w:evenHBand="0" w:firstRowFirstColumn="0" w:firstRowLastColumn="0" w:lastRowFirstColumn="0" w:lastRowLastColumn="0"/>
+              <w:rPr>
+                <w:sz w:val="22"/>
+              </w:rPr>
+            </w:pPr>
+            <w:proofErr w:type="spellStart"/>
+            <w:r>
+              <w:rPr>
+                <w:sz w:val="22"/>
+              </w:rPr>
+              <w:t>int</w:t>
+            </w:r>
+            <w:proofErr w:type="spellEnd"/>
+          </w:p>
+        </w:tc>
+        <w:tc>
+          <w:tcPr>
+            <w:tcW w:w="4513" w:type="dxa"/>
+            <w:hideMark/>
+          </w:tcPr>
+          <w:p>
+            <w:pPr>
+              <w:spacing w:after="0"/>
+              <w:ind w:left="0" w:firstLine="0"/>
+              <w:cnfStyle w:val="000000000000" w:firstRow="0" w:lastRow="0" w:firstColumn="0" w:lastColumn="0" w:oddVBand="0" w:evenVBand="0" w:oddHBand="0" w:evenHBand="0" w:firstRowFirstColumn="0" w:firstRowLastColumn="0" w:lastRowFirstColumn="0" w:lastRowLastColumn="0"/>
+              <w:rPr>
+                <w:sz w:val="22"/>
+              </w:rPr>
+            </w:pPr>
+            <w:r>
+              <w:rPr>
+                <w:sz w:val="22"/>
+              </w:rPr>
+              <w:t>Oxígeno necesario para la misión</w:t>
+            </w:r>
+          </w:p>
+        </w:tc>
+        <w:tc>
+          <w:tcPr>
+            <w:tcW w:w="1582" w:type="dxa"/>
+            <w:hideMark/>
+          </w:tcPr>
+          <w:p>
+            <w:pPr>
+              <w:spacing w:after="0"/>
+              <w:ind w:left="0" w:firstLine="0"/>
+              <w:jc w:val="center"/>
+              <w:cnfStyle w:val="000000000000" w:firstRow="0" w:lastRow="0" w:firstColumn="0" w:lastColumn="0" w:oddVBand="0" w:evenVBand="0" w:oddHBand="0" w:evenHBand="0" w:firstRowFirstColumn="0" w:firstRowLastColumn="0" w:lastRowFirstColumn="0" w:lastRowLastColumn="0"/>
+              <w:rPr>
+                <w:sz w:val="22"/>
+              </w:rPr>
+            </w:pPr>
+            <w:r>
+              <w:rPr>
+                <w:sz w:val="22"/>
+              </w:rPr>
+              <w:t>Entrada</w:t>
+            </w:r>
+          </w:p>
+        </w:tc>
+      </w:tr>
+      <w:tr>
+        <w:trPr>
+          <w:cnfStyle w:val="000000100000" w:firstRow="0" w:lastRow="0" w:firstColumn="0" w:lastColumn="0" w:oddVBand="0" w:evenVBand="0" w:oddHBand="1" w:evenHBand="0" w:firstRowFirstColumn="0" w:firstRowLastColumn="0" w:lastRowFirstColumn="0" w:lastRowLastColumn="0"/>
+        </w:trPr>
+        <w:tc>
+          <w:tcPr>
+            <w:cnfStyle w:val="001000000000" w:firstRow="0" w:lastRow="0" w:firstColumn="1" w:lastColumn="0" w:oddVBand="0" w:evenVBand="0" w:oddHBand="0" w:evenHBand="0" w:firstRowFirstColumn="0" w:firstRowLastColumn="0" w:lastRowFirstColumn="0" w:lastRowLastColumn="0"/>
+            <w:tcW w:w="2978" w:type="dxa"/>
+            <w:hideMark/>
+          </w:tcPr>
+          <w:p>
+            <w:pPr>
+              <w:spacing w:after="0"/>
+              <w:ind w:left="0" w:firstLine="0"/>
+              <w:jc w:val="center"/>
+              <w:rPr>
+                <w:b w:val="0"/>
+                <w:bCs w:val="0"/>
+                <w:sz w:val="22"/>
+              </w:rPr>
+            </w:pPr>
+            <w:proofErr w:type="spellStart"/>
+            <w:r>
+              <w:rPr>
+                <w:b w:val="0"/>
+                <w:bCs w:val="0"/>
+                <w:sz w:val="22"/>
+              </w:rPr>
+              <w:t>energia_disponible</w:t>
+            </w:r>
+            <w:proofErr w:type="spellEnd"/>
+          </w:p>
+        </w:tc>
+        <w:tc>
+          <w:tcPr>
+            <w:tcW w:w="1701" w:type="dxa"/>
+            <w:hideMark/>
+          </w:tcPr>
+          <w:p>
+            <w:pPr>
+              <w:spacing w:after="0"/>
+              <w:ind w:left="0" w:firstLine="0"/>
+              <w:jc w:val="center"/>
+              <w:cnfStyle w:val="000000100000" w:firstRow="0" w:lastRow="0" w:firstColumn="0" w:lastColumn="0" w:oddVBand="0" w:evenVBand="0" w:oddHBand="1" w:evenHBand="0" w:firstRowFirstColumn="0" w:firstRowLastColumn="0" w:lastRowFirstColumn="0" w:lastRowLastColumn="0"/>
+              <w:rPr>
+                <w:sz w:val="22"/>
+              </w:rPr>
+            </w:pPr>
+            <w:proofErr w:type="spellStart"/>
+            <w:r>
+              <w:rPr>
+                <w:sz w:val="22"/>
+              </w:rPr>
+              <w:t>int</w:t>
+            </w:r>
+            <w:proofErr w:type="spellEnd"/>
+          </w:p>
+        </w:tc>
+        <w:tc>
+          <w:tcPr>
+            <w:tcW w:w="4513" w:type="dxa"/>
+            <w:hideMark/>
+          </w:tcPr>
+          <w:p>
+            <w:pPr>
+              <w:spacing w:after="0"/>
+              <w:ind w:left="0" w:firstLine="0"/>
+              <w:cnfStyle w:val="000000100000" w:firstRow="0" w:lastRow="0" w:firstColumn="0" w:lastColumn="0" w:oddVBand="0" w:evenVBand="0" w:oddHBand="1" w:evenHBand="0" w:firstRowFirstColumn="0" w:firstRowLastColumn="0" w:lastRowFirstColumn="0" w:lastRowLastColumn="0"/>
+              <w:rPr>
+                <w:sz w:val="22"/>
+              </w:rPr>
+            </w:pPr>
+            <w:r>
+              <w:rPr>
+                <w:sz w:val="22"/>
+              </w:rPr>
+              <w:t>Energía con que cuenta la nave</w:t>
+            </w:r>
+          </w:p>
+        </w:tc>
+        <w:tc>
+          <w:tcPr>
+            <w:tcW w:w="1582" w:type="dxa"/>
+            <w:hideMark/>
+          </w:tcPr>
+          <w:p>
+            <w:pPr>
+              <w:spacing w:after="0"/>
+              <w:ind w:left="0" w:firstLine="0"/>
+              <w:jc w:val="center"/>
+              <w:cnfStyle w:val="000000100000" w:firstRow="0" w:lastRow="0" w:firstColumn="0" w:lastColumn="0" w:oddVBand="0" w:evenVBand="0" w:oddHBand="1" w:evenHBand="0" w:firstRowFirstColumn="0" w:firstRowLastColumn="0" w:lastRowFirstColumn="0" w:lastRowLastColumn="0"/>
+              <w:rPr>
+                <w:sz w:val="22"/>
+              </w:rPr>
+            </w:pPr>
+            <w:r>
+              <w:rPr>
+                <w:sz w:val="22"/>
+              </w:rPr>
+              <w:t>Entrada</w:t>
+            </w:r>
+          </w:p>
+        </w:tc>
+      </w:tr>
+      <w:tr>
+        <w:tc>
+          <w:tcPr>
+            <w:cnfStyle w:val="001000000000" w:firstRow="0" w:lastRow="0" w:firstColumn="1" w:lastColumn="0" w:oddVBand="0" w:evenVBand="0" w:oddHBand="0" w:evenHBand="0" w:firstRowFirstColumn="0" w:firstRowLastColumn="0" w:lastRowFirstColumn="0" w:lastRowLastColumn="0"/>
+            <w:tcW w:w="2978" w:type="dxa"/>
+            <w:hideMark/>
+          </w:tcPr>
+          <w:p>
+            <w:pPr>
+              <w:spacing w:after="0"/>
+              <w:ind w:left="0" w:firstLine="0"/>
+              <w:jc w:val="center"/>
+              <w:rPr>
+                <w:b w:val="0"/>
+                <w:bCs w:val="0"/>
+                <w:sz w:val="22"/>
+              </w:rPr>
+            </w:pPr>
+            <w:proofErr w:type="spellStart"/>
+            <w:r>
+              <w:rPr>
+                <w:b w:val="0"/>
+                <w:bCs w:val="0"/>
+                <w:sz w:val="22"/>
+              </w:rPr>
+              <w:t>energia_requerida</w:t>
+            </w:r>
+            <w:proofErr w:type="spellEnd"/>
+          </w:p>
+        </w:tc>
+        <w:tc>
+          <w:tcPr>
+            <w:tcW w:w="1701" w:type="dxa"/>
+            <w:hideMark/>
+          </w:tcPr>
+          <w:p>
+            <w:pPr>
+              <w:spacing w:after="0"/>
+              <w:ind w:left="0" w:firstLine="0"/>
+              <w:jc w:val="center"/>
+              <w:cnfStyle w:val="000000000000" w:firstRow="0" w:lastRow="0" w:firstColumn="0" w:lastColumn="0" w:oddVBand="0" w:evenVBand="0" w:oddHBand="0" w:evenHBand="0" w:firstRowFirstColumn="0" w:firstRowLastColumn="0" w:lastRowFirstColumn="0" w:lastRowLastColumn="0"/>
+              <w:rPr>
+                <w:sz w:val="22"/>
+              </w:rPr>
+            </w:pPr>
+            <w:proofErr w:type="spellStart"/>
+            <w:r>
+              <w:rPr>
+                <w:sz w:val="22"/>
+              </w:rPr>
+              <w:t>int</w:t>
+            </w:r>
+            <w:proofErr w:type="spellEnd"/>
+          </w:p>
+        </w:tc>
+        <w:tc>
+          <w:tcPr>
+            <w:tcW w:w="4513" w:type="dxa"/>
+            <w:hideMark/>
+          </w:tcPr>
+          <w:p>
+            <w:pPr>
+              <w:spacing w:after="0"/>
+              <w:ind w:left="0" w:firstLine="0"/>
+              <w:cnfStyle w:val="000000000000" w:firstRow="0" w:lastRow="0" w:firstColumn="0" w:lastColumn="0" w:oddVBand="0" w:evenVBand="0" w:oddHBand="0" w:evenHBand="0" w:firstRowFirstColumn="0" w:firstRowLastColumn="0" w:lastRowFirstColumn="0" w:lastRowLastColumn="0"/>
+              <w:rPr>
+                <w:sz w:val="22"/>
+              </w:rPr>
+            </w:pPr>
+            <w:r>
+              <w:rPr>
+                <w:sz w:val="22"/>
+              </w:rPr>
+              <w:t>Energía necesaria para la misión</w:t>
+            </w:r>
+          </w:p>
+        </w:tc>
+        <w:tc>
+          <w:tcPr>
+            <w:tcW w:w="1582" w:type="dxa"/>
+            <w:hideMark/>
+          </w:tcPr>
+          <w:p>
+            <w:pPr>
+              <w:spacing w:after="0"/>
+              <w:ind w:left="0" w:firstLine="0"/>
+              <w:jc w:val="center"/>
+              <w:cnfStyle w:val="000000000000" w:firstRow="0" w:lastRow="0" w:firstColumn="0" w:lastColumn="0" w:oddVBand="0" w:evenVBand="0" w:oddHBand="0" w:evenHBand="0" w:firstRowFirstColumn="0" w:firstRowLastColumn="0" w:lastRowFirstColumn="0" w:lastRowLastColumn="0"/>
+              <w:rPr>
+                <w:sz w:val="22"/>
+              </w:rPr>
+            </w:pPr>
+            <w:r>
+              <w:rPr>
+                <w:sz w:val="22"/>
+              </w:rPr>
+              <w:t>Entrada</w:t>
+            </w:r>
+          </w:p>
+        </w:tc>
+      </w:tr>
+      <w:tr>
+        <w:trPr>
+          <w:cnfStyle w:val="000000100000" w:firstRow="0" w:lastRow="0" w:firstColumn="0" w:lastColumn="0" w:oddVBand="0" w:evenVBand="0" w:oddHBand="1" w:evenHBand="0" w:firstRowFirstColumn="0" w:firstRowLastColumn="0" w:lastRowFirstColumn="0" w:lastRowLastColumn="0"/>
+        </w:trPr>
+        <w:tc>
+          <w:tcPr>
+            <w:cnfStyle w:val="001000000000" w:firstRow="0" w:lastRow="0" w:firstColumn="1" w:lastColumn="0" w:oddVBand="0" w:evenVBand="0" w:oddHBand="0" w:evenHBand="0" w:firstRowFirstColumn="0" w:firstRowLastColumn="0" w:lastRowFirstColumn="0" w:lastRowLastColumn="0"/>
+            <w:tcW w:w="2978" w:type="dxa"/>
+            <w:hideMark/>
+          </w:tcPr>
+          <w:p>
+            <w:pPr>
+              <w:spacing w:after="0"/>
+              <w:ind w:left="0" w:firstLine="0"/>
+              <w:jc w:val="center"/>
+              <w:rPr>
+                <w:b w:val="0"/>
+                <w:bCs w:val="0"/>
+                <w:sz w:val="22"/>
+              </w:rPr>
+            </w:pPr>
+            <w:proofErr w:type="spellStart"/>
+            <w:r>
+              <w:rPr>
+                <w:b w:val="0"/>
+                <w:bCs w:val="0"/>
+                <w:sz w:val="22"/>
+              </w:rPr>
+              <w:t>provisiones_disponibles</w:t>
+            </w:r>
+            <w:proofErr w:type="spellEnd"/>
+          </w:p>
+        </w:tc>
+        <w:tc>
+          <w:tcPr>
+            <w:tcW w:w="1701" w:type="dxa"/>
+            <w:hideMark/>
+          </w:tcPr>
+          <w:p>
+            <w:pPr>
+              <w:spacing w:after="0"/>
+              <w:ind w:left="0" w:firstLine="0"/>
+              <w:jc w:val="center"/>
+              <w:cnfStyle w:val="000000100000" w:firstRow="0" w:lastRow="0" w:firstColumn="0" w:lastColumn="0" w:oddVBand="0" w:evenVBand="0" w:oddHBand="1" w:evenHBand="0" w:firstRowFirstColumn="0" w:firstRowLastColumn="0" w:lastRowFirstColumn="0" w:lastRowLastColumn="0"/>
+              <w:rPr>
+                <w:sz w:val="22"/>
+              </w:rPr>
+            </w:pPr>
+            <w:proofErr w:type="spellStart"/>
+            <w:r>
+              <w:rPr>
+                <w:sz w:val="22"/>
+              </w:rPr>
+              <w:t>int</w:t>
+            </w:r>
+            <w:proofErr w:type="spellEnd"/>
+          </w:p>
+        </w:tc>
+        <w:tc>
+          <w:tcPr>
+            <w:tcW w:w="4513" w:type="dxa"/>
+            <w:hideMark/>
+          </w:tcPr>
+          <w:p>
+            <w:pPr>
+              <w:spacing w:after="0"/>
+              <w:ind w:left="0" w:firstLine="0"/>
+              <w:cnfStyle w:val="000000100000" w:firstRow="0" w:lastRow="0" w:firstColumn="0" w:lastColumn="0" w:oddVBand="0" w:evenVBand="0" w:oddHBand="1" w:evenHBand="0" w:firstRowFirstColumn="0" w:firstRowLastColumn="0" w:lastRowFirstColumn="0" w:lastRowLastColumn="0"/>
+              <w:rPr>
+                <w:sz w:val="22"/>
+              </w:rPr>
+            </w:pPr>
+            <w:r>
+              <w:rPr>
+                <w:sz w:val="22"/>
+              </w:rPr>
+              <w:t>Provisiones con que cuenta la nave</w:t>
+            </w:r>
+          </w:p>
+        </w:tc>
+        <w:tc>
+          <w:tcPr>
+            <w:tcW w:w="1582" w:type="dxa"/>
+            <w:hideMark/>
+          </w:tcPr>
+          <w:p>
+            <w:pPr>
+              <w:spacing w:after="0"/>
+              <w:ind w:left="0" w:firstLine="0"/>
+              <w:jc w:val="center"/>
+              <w:cnfStyle w:val="000000100000" w:firstRow="0" w:lastRow="0" w:firstColumn="0" w:lastColumn="0" w:oddVBand="0" w:evenVBand="0" w:oddHBand="1" w:evenHBand="0" w:firstRowFirstColumn="0" w:firstRowLastColumn="0" w:lastRowFirstColumn="0" w:lastRowLastColumn="0"/>
+              <w:rPr>
+                <w:sz w:val="22"/>
+              </w:rPr>
+            </w:pPr>
+            <w:r>
+              <w:rPr>
+                <w:sz w:val="22"/>
+              </w:rPr>
+              <w:t>Entrada</w:t>
+            </w:r>
+          </w:p>
+        </w:tc>
+      </w:tr>
+      <w:tr>
+        <w:tc>
+          <w:tcPr>
+            <w:cnfStyle w:val="001000000000" w:firstRow="0" w:lastRow="0" w:firstColumn="1" w:lastColumn="0" w:oddVBand="0" w:evenVBand="0" w:oddHBand="0" w:evenHBand="0" w:firstRowFirstColumn="0" w:firstRowLastColumn="0" w:lastRowFirstColumn="0" w:lastRowLastColumn="0"/>
+            <w:tcW w:w="2978" w:type="dxa"/>
+            <w:hideMark/>
+          </w:tcPr>
+          <w:p>
+            <w:pPr>
+              <w:spacing w:after="0"/>
+              <w:ind w:left="0" w:firstLine="0"/>
+              <w:jc w:val="center"/>
+              <w:rPr>
+                <w:b w:val="0"/>
+                <w:bCs w:val="0"/>
+                <w:sz w:val="22"/>
+              </w:rPr>
+            </w:pPr>
+            <w:proofErr w:type="spellStart"/>
+            <w:r>
+              <w:rPr>
+                <w:b w:val="0"/>
+                <w:bCs w:val="0"/>
+                <w:sz w:val="22"/>
+              </w:rPr>
+              <w:t>provisiones_requeridas</w:t>
+            </w:r>
+            <w:proofErr w:type="spellEnd"/>
+          </w:p>
+        </w:tc>
+        <w:tc>
+          <w:tcPr>
+            <w:tcW w:w="1701" w:type="dxa"/>
+            <w:hideMark/>
+          </w:tcPr>
+          <w:p>
+            <w:pPr>
+              <w:spacing w:after="0"/>
+              <w:ind w:left="0" w:firstLine="0"/>
+              <w:jc w:val="center"/>
+              <w:cnfStyle w:val="000000000000" w:firstRow="0" w:lastRow="0" w:firstColumn="0" w:lastColumn="0" w:oddVBand="0" w:evenVBand="0" w:oddHBand="0" w:evenHBand="0" w:firstRowFirstColumn="0" w:firstRowLastColumn="0" w:lastRowFirstColumn="0" w:lastRowLastColumn="0"/>
+              <w:rPr>
+                <w:sz w:val="22"/>
+              </w:rPr>
+            </w:pPr>
+            <w:proofErr w:type="spellStart"/>
+            <w:r>
+              <w:rPr>
+                <w:sz w:val="22"/>
+              </w:rPr>
+              <w:t>int</w:t>
+            </w:r>
+            <w:proofErr w:type="spellEnd"/>
+          </w:p>
+        </w:tc>
+        <w:tc>
+          <w:tcPr>
+            <w:tcW w:w="4513" w:type="dxa"/>
+            <w:hideMark/>
+          </w:tcPr>
+          <w:p>
+            <w:pPr>
+              <w:spacing w:after="0"/>
+              <w:ind w:left="0" w:firstLine="0"/>
+              <w:cnfStyle w:val="000000000000" w:firstRow="0" w:lastRow="0" w:firstColumn="0" w:lastColumn="0" w:oddVBand="0" w:evenVBand="0" w:oddHBand="0" w:evenHBand="0" w:firstRowFirstColumn="0" w:firstRowLastColumn="0" w:lastRowFirstColumn="0" w:lastRowLastColumn="0"/>
+              <w:rPr>
+                <w:sz w:val="22"/>
+              </w:rPr>
+            </w:pPr>
+            <w:r>
+              <w:rPr>
+                <w:sz w:val="22"/>
+              </w:rPr>
+              <w:t>Provisiones necesarias para la misión</w:t>
+            </w:r>
+          </w:p>
+        </w:tc>
+        <w:tc>
+          <w:tcPr>
+            <w:tcW w:w="1582" w:type="dxa"/>
+            <w:hideMark/>
+          </w:tcPr>
+          <w:p>
+            <w:pPr>
+              <w:spacing w:after="0"/>
+              <w:ind w:left="0" w:firstLine="0"/>
+              <w:jc w:val="center"/>
+              <w:cnfStyle w:val="000000000000" w:firstRow="0" w:lastRow="0" w:firstColumn="0" w:lastColumn="0" w:oddVBand="0" w:evenVBand="0" w:oddHBand="0" w:evenHBand="0" w:firstRowFirstColumn="0" w:firstRowLastColumn="0" w:lastRowFirstColumn="0" w:lastRowLastColumn="0"/>
+              <w:rPr>
+                <w:sz w:val="22"/>
+              </w:rPr>
+            </w:pPr>
+            <w:r>
+              <w:rPr>
+                <w:sz w:val="22"/>
+              </w:rPr>
+              <w:t>Entrada</w:t>
+            </w:r>
+          </w:p>
+        </w:tc>
+      </w:tr>
+      <w:tr>
+        <w:trPr>
+          <w:cnfStyle w:val="000000100000" w:firstRow="0" w:lastRow="0" w:firstColumn="0" w:lastColumn="0" w:oddVBand="0" w:evenVBand="0" w:oddHBand="1" w:evenHBand="0" w:firstRowFirstColumn="0" w:firstRowLastColumn="0" w:lastRowFirstColumn="0" w:lastRowLastColumn="0"/>
+        </w:trPr>
+        <w:tc>
+          <w:tcPr>
+            <w:cnfStyle w:val="001000000000" w:firstRow="0" w:lastRow="0" w:firstColumn="1" w:lastColumn="0" w:oddVBand="0" w:evenVBand="0" w:oddHBand="0" w:evenHBand="0" w:firstRowFirstColumn="0" w:firstRowLastColumn="0" w:lastRowFirstColumn="0" w:lastRowLastColumn="0"/>
+            <w:tcW w:w="2978" w:type="dxa"/>
+            <w:hideMark/>
+          </w:tcPr>
+          <w:p>
+            <w:pPr>
+              <w:spacing w:after="0"/>
+              <w:ind w:left="0" w:firstLine="0"/>
+              <w:jc w:val="center"/>
+              <w:rPr>
+                <w:b w:val="0"/>
+                <w:bCs w:val="0"/>
+                <w:sz w:val="22"/>
+              </w:rPr>
+            </w:pPr>
+            <w:proofErr w:type="spellStart"/>
+            <w:r>
+              <w:rPr>
+                <w:b w:val="0"/>
+                <w:bCs w:val="0"/>
+                <w:sz w:val="22"/>
+              </w:rPr>
+              <w:t>combustible_total</w:t>
+            </w:r>
+            <w:proofErr w:type="spellEnd"/>
+          </w:p>
+        </w:tc>
+        <w:tc>
+          <w:tcPr>
+            <w:tcW w:w="1701" w:type="dxa"/>
+            <w:hideMark/>
+          </w:tcPr>
+          <w:p>
+            <w:pPr>
+              <w:spacing w:after="0"/>
+              <w:ind w:left="0" w:firstLine="0"/>
+              <w:jc w:val="center"/>
+              <w:cnfStyle w:val="000000100000" w:firstRow="0" w:lastRow="0" w:firstColumn="0" w:lastColumn="0" w:oddVBand="0" w:evenVBand="0" w:oddHBand="1" w:evenHBand="0" w:firstRowFirstColumn="0" w:firstRowLastColumn="0" w:lastRowFirstColumn="0" w:lastRowLastColumn="0"/>
+              <w:rPr>
+                <w:sz w:val="22"/>
+              </w:rPr>
+            </w:pPr>
+            <w:proofErr w:type="spellStart"/>
+            <w:r>
+              <w:rPr>
+                <w:sz w:val="22"/>
+              </w:rPr>
+              <w:t>int</w:t>
+            </w:r>
+            <w:proofErr w:type="spellEnd"/>
+          </w:p>
+        </w:tc>
+        <w:tc>
+          <w:tcPr>
+            <w:tcW w:w="4513" w:type="dxa"/>
+            <w:hideMark/>
+          </w:tcPr>
+          <w:p>
+            <w:pPr>
+              <w:spacing w:after="0"/>
+              <w:ind w:left="0" w:firstLine="0"/>
+              <w:cnfStyle w:val="000000100000" w:firstRow="0" w:lastRow="0" w:firstColumn="0" w:lastColumn="0" w:oddVBand="0" w:evenVBand="0" w:oddHBand="1" w:evenHBand="0" w:firstRowFirstColumn="0" w:firstRowLastColumn="0" w:lastRowFirstColumn="0" w:lastRowLastColumn="0"/>
+              <w:rPr>
+                <w:sz w:val="22"/>
+              </w:rPr>
+            </w:pPr>
+            <w:r>
+              <w:rPr>
+                <w:sz w:val="22"/>
+              </w:rPr>
+              <w:t>Combustible total requerido (ida + regreso + reserva)</w:t>
+            </w:r>
+          </w:p>
+        </w:tc>
+        <w:tc>
+          <w:tcPr>
+            <w:tcW w:w="1582" w:type="dxa"/>
+            <w:hideMark/>
+          </w:tcPr>
+          <w:p>
+            <w:pPr>
+              <w:spacing w:after="0"/>
+              <w:ind w:left="0" w:firstLine="0"/>
+              <w:jc w:val="center"/>
+              <w:cnfStyle w:val="000000100000" w:firstRow="0" w:lastRow="0" w:firstColumn="0" w:lastColumn="0" w:oddVBand="0" w:evenVBand="0" w:oddHBand="1" w:evenHBand="0" w:firstRowFirstColumn="0" w:firstRowLastColumn="0" w:lastRowFirstColumn="0" w:lastRowLastColumn="0"/>
+              <w:rPr>
+                <w:sz w:val="22"/>
+              </w:rPr>
+            </w:pPr>
+            <w:r>
+              <w:rPr>
+                <w:sz w:val="22"/>
+              </w:rPr>
+              <w:t>Intermedia</w:t>
+            </w:r>
+          </w:p>
+        </w:tc>
+      </w:tr>
+    </w:tbl>
+    <w:p>
+      <w:pPr>
+        <w:spacing w:after="0"/>
+        <w:ind w:left="0" w:firstLine="0"/>
+        <w:jc w:val="center"/>
+        <w:rPr>
+          <w:sz w:val="22"/>
+        </w:rPr>
+      </w:pPr>
+    </w:p>
+    <w:p>
+      <w:pPr>
+        <w:spacing w:after="0"/>
+        <w:ind w:left="0" w:firstLine="0"/>
+        <w:jc w:val="center"/>
+        <w:rPr>
           <w:sz w:val="22"/>
         </w:rPr>
       </w:pPr>

</xml_diff>